<commit_message>
Functional and N-functional Requirements Added
</commit_message>
<xml_diff>
--- a/Srs Document/Home Tempature Adjustment System Srs.docx
+++ b/Srs Document/Home Tempature Adjustment System Srs.docx
@@ -738,10 +738,10 @@
         <w:tblLook w:val="04A0" w:firstRow="1" w:lastRow="0" w:firstColumn="1" w:lastColumn="0" w:noHBand="0" w:noVBand="1"/>
       </w:tblPr>
       <w:tblGrid>
-        <w:gridCol w:w="3155"/>
-        <w:gridCol w:w="1689"/>
-        <w:gridCol w:w="2715"/>
-        <w:gridCol w:w="1304"/>
+        <w:gridCol w:w="2189"/>
+        <w:gridCol w:w="1172"/>
+        <w:gridCol w:w="4597"/>
+        <w:gridCol w:w="905"/>
       </w:tblGrid>
       <w:tr>
         <w:trPr>
@@ -1171,6 +1171,191 @@
           </w:p>
         </w:tc>
       </w:tr>
+      <w:tr>
+        <w:trPr>
+          <w:trHeight w:val="836"/>
+        </w:trPr>
+        <w:tc>
+          <w:tcPr>
+            <w:tcW w:w="0" w:type="auto"/>
+            <w:tcBorders>
+              <w:top w:val="single" w:sz="6" w:space="0" w:color="000000"/>
+              <w:left w:val="single" w:sz="6" w:space="0" w:color="000000"/>
+              <w:bottom w:val="single" w:sz="6" w:space="0" w:color="000000"/>
+              <w:right w:val="single" w:sz="6" w:space="0" w:color="000000"/>
+            </w:tcBorders>
+            <w:shd w:val="clear" w:color="auto" w:fill="FFFFFF"/>
+            <w:tcMar>
+              <w:top w:w="108" w:type="dxa"/>
+              <w:left w:w="108" w:type="dxa"/>
+              <w:bottom w:w="108" w:type="dxa"/>
+              <w:right w:w="108" w:type="dxa"/>
+            </w:tcMar>
+            <w:vAlign w:val="center"/>
+          </w:tcPr>
+          <w:p>
+            <w:pPr>
+              <w:spacing w:before="360" w:after="360" w:line="264" w:lineRule="atLeast"/>
+              <w:rPr>
+                <w:rFonts w:ascii="Times New Roman" w:eastAsia="Times New Roman" w:hAnsi="Times New Roman" w:cs="Times New Roman"/>
+                <w:color w:val="000000" w:themeColor="text1"/>
+                <w:kern w:val="0"/>
+                <w:sz w:val="16"/>
+                <w:szCs w:val="16"/>
+                <w:lang w:eastAsia="en-GB"/>
+                <w14:ligatures w14:val="none"/>
+              </w:rPr>
+            </w:pPr>
+            <w:r>
+              <w:rPr>
+                <w:rFonts w:ascii="Times New Roman" w:eastAsia="Times New Roman" w:hAnsi="Times New Roman" w:cs="Times New Roman"/>
+                <w:color w:val="000000" w:themeColor="text1"/>
+                <w:kern w:val="0"/>
+                <w:sz w:val="16"/>
+                <w:szCs w:val="16"/>
+                <w:lang w:eastAsia="en-GB"/>
+                <w14:ligatures w14:val="none"/>
+              </w:rPr>
+              <w:t>Ahmet Talha Sivrikaya</w:t>
+            </w:r>
+          </w:p>
+        </w:tc>
+        <w:tc>
+          <w:tcPr>
+            <w:tcW w:w="0" w:type="auto"/>
+            <w:tcBorders>
+              <w:top w:val="single" w:sz="6" w:space="0" w:color="000000"/>
+              <w:left w:val="single" w:sz="6" w:space="0" w:color="000000"/>
+              <w:bottom w:val="single" w:sz="6" w:space="0" w:color="000000"/>
+              <w:right w:val="single" w:sz="6" w:space="0" w:color="000000"/>
+            </w:tcBorders>
+            <w:shd w:val="clear" w:color="auto" w:fill="FFFFFF"/>
+            <w:tcMar>
+              <w:top w:w="108" w:type="dxa"/>
+              <w:left w:w="108" w:type="dxa"/>
+              <w:bottom w:w="108" w:type="dxa"/>
+              <w:right w:w="108" w:type="dxa"/>
+            </w:tcMar>
+            <w:vAlign w:val="center"/>
+          </w:tcPr>
+          <w:p>
+            <w:pPr>
+              <w:spacing w:before="360" w:after="360" w:line="264" w:lineRule="atLeast"/>
+              <w:rPr>
+                <w:rFonts w:ascii="Times New Roman" w:eastAsia="Times New Roman" w:hAnsi="Times New Roman" w:cs="Times New Roman"/>
+                <w:color w:val="000000" w:themeColor="text1"/>
+                <w:kern w:val="0"/>
+                <w:sz w:val="16"/>
+                <w:szCs w:val="16"/>
+                <w:lang w:eastAsia="en-GB"/>
+                <w14:ligatures w14:val="none"/>
+              </w:rPr>
+            </w:pPr>
+            <w:r>
+              <w:rPr>
+                <w:rFonts w:ascii="Times New Roman" w:eastAsia="Times New Roman" w:hAnsi="Times New Roman" w:cs="Times New Roman"/>
+                <w:color w:val="000000" w:themeColor="text1"/>
+                <w:kern w:val="0"/>
+                <w:sz w:val="16"/>
+                <w:szCs w:val="16"/>
+                <w:lang w:eastAsia="en-GB"/>
+                <w14:ligatures w14:val="none"/>
+              </w:rPr>
+              <w:t xml:space="preserve">24.04.2026 </w:t>
+            </w:r>
+          </w:p>
+        </w:tc>
+        <w:tc>
+          <w:tcPr>
+            <w:tcW w:w="0" w:type="auto"/>
+            <w:tcBorders>
+              <w:top w:val="single" w:sz="6" w:space="0" w:color="000000"/>
+              <w:left w:val="single" w:sz="6" w:space="0" w:color="000000"/>
+              <w:bottom w:val="single" w:sz="6" w:space="0" w:color="000000"/>
+              <w:right w:val="single" w:sz="6" w:space="0" w:color="000000"/>
+            </w:tcBorders>
+            <w:shd w:val="clear" w:color="auto" w:fill="FFFFFF"/>
+            <w:tcMar>
+              <w:top w:w="108" w:type="dxa"/>
+              <w:left w:w="108" w:type="dxa"/>
+              <w:bottom w:w="108" w:type="dxa"/>
+              <w:right w:w="108" w:type="dxa"/>
+            </w:tcMar>
+            <w:vAlign w:val="center"/>
+          </w:tcPr>
+          <w:p>
+            <w:pPr>
+              <w:spacing w:before="360" w:after="360" w:line="264" w:lineRule="atLeast"/>
+              <w:rPr>
+                <w:rFonts w:ascii="Times New Roman" w:eastAsia="Times New Roman" w:hAnsi="Times New Roman" w:cs="Times New Roman"/>
+                <w:color w:val="000000" w:themeColor="text1"/>
+                <w:kern w:val="0"/>
+                <w:sz w:val="16"/>
+                <w:szCs w:val="16"/>
+                <w:lang w:eastAsia="en-GB"/>
+                <w14:ligatures w14:val="none"/>
+              </w:rPr>
+            </w:pPr>
+            <w:r>
+              <w:rPr>
+                <w:rFonts w:ascii="Times New Roman" w:eastAsia="Times New Roman" w:hAnsi="Times New Roman" w:cs="Times New Roman"/>
+                <w:color w:val="000000" w:themeColor="text1"/>
+                <w:kern w:val="0"/>
+                <w:sz w:val="16"/>
+                <w:szCs w:val="16"/>
+                <w:lang w:eastAsia="en-GB"/>
+                <w14:ligatures w14:val="none"/>
+              </w:rPr>
+              <w:t>“Functional and Nonfunctional Requirements Added”</w:t>
+            </w:r>
+          </w:p>
+        </w:tc>
+        <w:tc>
+          <w:tcPr>
+            <w:tcW w:w="0" w:type="auto"/>
+            <w:tcBorders>
+              <w:top w:val="single" w:sz="6" w:space="0" w:color="000000"/>
+              <w:left w:val="single" w:sz="6" w:space="0" w:color="000000"/>
+              <w:bottom w:val="single" w:sz="6" w:space="0" w:color="000000"/>
+              <w:right w:val="single" w:sz="6" w:space="0" w:color="000000"/>
+            </w:tcBorders>
+            <w:shd w:val="clear" w:color="auto" w:fill="FFFFFF"/>
+            <w:tcMar>
+              <w:top w:w="108" w:type="dxa"/>
+              <w:left w:w="108" w:type="dxa"/>
+              <w:bottom w:w="108" w:type="dxa"/>
+              <w:right w:w="108" w:type="dxa"/>
+            </w:tcMar>
+            <w:vAlign w:val="center"/>
+          </w:tcPr>
+          <w:p>
+            <w:pPr>
+              <w:spacing w:before="360" w:after="360" w:line="264" w:lineRule="atLeast"/>
+              <w:rPr>
+                <w:rFonts w:ascii="Times New Roman" w:eastAsia="Times New Roman" w:hAnsi="Times New Roman" w:cs="Times New Roman"/>
+                <w:color w:val="000000" w:themeColor="text1"/>
+                <w:kern w:val="0"/>
+                <w:sz w:val="16"/>
+                <w:szCs w:val="16"/>
+                <w:lang w:eastAsia="en-GB"/>
+                <w14:ligatures w14:val="none"/>
+              </w:rPr>
+            </w:pPr>
+            <w:r>
+              <w:rPr>
+                <w:rFonts w:ascii="Times New Roman" w:eastAsia="Times New Roman" w:hAnsi="Times New Roman" w:cs="Times New Roman"/>
+                <w:color w:val="000000" w:themeColor="text1"/>
+                <w:kern w:val="0"/>
+                <w:sz w:val="16"/>
+                <w:szCs w:val="16"/>
+                <w:lang w:eastAsia="en-GB"/>
+                <w14:ligatures w14:val="none"/>
+              </w:rPr>
+              <w:t>1.1</w:t>
+            </w:r>
+          </w:p>
+        </w:tc>
+      </w:tr>
     </w:tbl>
     <w:p>
       <w:pPr>
@@ -1582,37 +1767,841 @@
           <w:lang w:eastAsia="en-GB"/>
           <w14:ligatures w14:val="none"/>
         </w:rPr>
+        <w:t>1. Introduction</w:t>
+      </w:r>
+    </w:p>
+    <w:p>
+      <w:pPr>
+        <w:shd w:val="clear" w:color="auto" w:fill="FFFFFF"/>
+        <w:spacing w:before="240" w:after="0" w:line="240" w:lineRule="auto"/>
+        <w:rPr>
+          <w:rFonts w:ascii="Times New Roman" w:eastAsia="Times New Roman" w:hAnsi="Times New Roman" w:cs="Times New Roman"/>
+          <w:b/>
+          <w:bCs/>
+          <w:color w:val="000000" w:themeColor="text1"/>
+          <w:kern w:val="0"/>
+          <w:sz w:val="20"/>
+          <w:szCs w:val="20"/>
+          <w:lang w:eastAsia="en-GB"/>
+          <w14:ligatures w14:val="none"/>
+        </w:rPr>
+      </w:pPr>
+      <w:r>
+        <w:rPr>
+          <w:rFonts w:ascii="Times New Roman" w:eastAsia="Times New Roman" w:hAnsi="Times New Roman" w:cs="Times New Roman"/>
+          <w:b/>
+          <w:bCs/>
+          <w:color w:val="000000" w:themeColor="text1"/>
+          <w:kern w:val="0"/>
+          <w:sz w:val="20"/>
+          <w:szCs w:val="20"/>
+          <w:lang w:eastAsia="en-GB"/>
+          <w14:ligatures w14:val="none"/>
+        </w:rPr>
+        <w:t>1.1. Purpose  </w:t>
+      </w:r>
+    </w:p>
+    <w:p>
+      <w:pPr>
+        <w:shd w:val="clear" w:color="auto" w:fill="FFFFFF"/>
+        <w:spacing w:before="240" w:after="0" w:line="240" w:lineRule="auto"/>
+        <w:jc w:val="both"/>
+        <w:rPr>
+          <w:rFonts w:ascii="Times New Roman" w:eastAsia="Times New Roman" w:hAnsi="Times New Roman" w:cs="Times New Roman"/>
+          <w:color w:val="000000" w:themeColor="text1"/>
+          <w:kern w:val="0"/>
+          <w:sz w:val="20"/>
+          <w:szCs w:val="20"/>
+          <w:lang w:eastAsia="en-GB"/>
+          <w14:ligatures w14:val="none"/>
+        </w:rPr>
+      </w:pPr>
+      <w:r>
+        <w:rPr>
+          <w:rFonts w:ascii="Times New Roman" w:eastAsia="Times New Roman" w:hAnsi="Times New Roman" w:cs="Times New Roman"/>
+          <w:b/>
+          <w:bCs/>
+          <w:color w:val="000000" w:themeColor="text1"/>
+          <w:kern w:val="0"/>
+          <w:sz w:val="20"/>
+          <w:szCs w:val="20"/>
+          <w:lang w:eastAsia="en-GB"/>
+          <w14:ligatures w14:val="none"/>
+        </w:rPr>
+        <w:t>1.2. Document Conventions  </w:t>
+      </w:r>
+    </w:p>
+    <w:p>
+      <w:pPr>
+        <w:shd w:val="clear" w:color="auto" w:fill="FFFFFF"/>
+        <w:spacing w:before="240" w:after="0" w:line="240" w:lineRule="auto"/>
+        <w:jc w:val="both"/>
+        <w:rPr>
+          <w:rFonts w:ascii="Times New Roman" w:eastAsia="Times New Roman" w:hAnsi="Times New Roman" w:cs="Times New Roman"/>
+          <w:color w:val="000000" w:themeColor="text1"/>
+          <w:kern w:val="0"/>
+          <w:sz w:val="20"/>
+          <w:szCs w:val="20"/>
+          <w:lang w:eastAsia="en-GB"/>
+          <w14:ligatures w14:val="none"/>
+        </w:rPr>
+      </w:pPr>
+      <w:r>
+        <w:rPr>
+          <w:rFonts w:ascii="Times New Roman" w:eastAsia="Times New Roman" w:hAnsi="Times New Roman" w:cs="Times New Roman"/>
+          <w:b/>
+          <w:bCs/>
+          <w:color w:val="000000" w:themeColor="text1"/>
+          <w:kern w:val="0"/>
+          <w:sz w:val="20"/>
+          <w:szCs w:val="20"/>
+          <w:lang w:eastAsia="en-GB"/>
+          <w14:ligatures w14:val="none"/>
+        </w:rPr>
+        <w:t>1.3. Intended Audience and Reading Suggestions  </w:t>
+      </w:r>
+    </w:p>
+    <w:p>
+      <w:pPr>
+        <w:shd w:val="clear" w:color="auto" w:fill="FFFFFF"/>
+        <w:spacing w:before="240" w:after="0" w:line="240" w:lineRule="auto"/>
+        <w:jc w:val="both"/>
+        <w:rPr>
+          <w:rFonts w:ascii="Times New Roman" w:eastAsia="Times New Roman" w:hAnsi="Times New Roman" w:cs="Times New Roman"/>
+          <w:color w:val="000000" w:themeColor="text1"/>
+          <w:kern w:val="0"/>
+          <w:sz w:val="20"/>
+          <w:szCs w:val="20"/>
+          <w:lang w:eastAsia="en-GB"/>
+          <w14:ligatures w14:val="none"/>
+        </w:rPr>
+      </w:pPr>
+      <w:r>
+        <w:rPr>
+          <w:rFonts w:ascii="Times New Roman" w:eastAsia="Times New Roman" w:hAnsi="Times New Roman" w:cs="Times New Roman"/>
+          <w:b/>
+          <w:bCs/>
+          <w:color w:val="000000" w:themeColor="text1"/>
+          <w:kern w:val="0"/>
+          <w:sz w:val="20"/>
+          <w:szCs w:val="20"/>
+          <w:lang w:eastAsia="en-GB"/>
+          <w14:ligatures w14:val="none"/>
+        </w:rPr>
+        <w:t>1.4. Product Scope  </w:t>
+      </w:r>
+    </w:p>
+    <w:p>
+      <w:pPr>
+        <w:shd w:val="clear" w:color="auto" w:fill="FFFFFF"/>
+        <w:spacing w:before="240" w:after="0" w:line="240" w:lineRule="auto"/>
+        <w:jc w:val="both"/>
+        <w:rPr>
+          <w:rFonts w:ascii="Times New Roman" w:eastAsia="Times New Roman" w:hAnsi="Times New Roman" w:cs="Times New Roman"/>
+          <w:color w:val="000000" w:themeColor="text1"/>
+          <w:kern w:val="0"/>
+          <w:sz w:val="20"/>
+          <w:szCs w:val="20"/>
+          <w:lang w:eastAsia="en-GB"/>
+          <w14:ligatures w14:val="none"/>
+        </w:rPr>
+      </w:pPr>
+      <w:r>
+        <w:rPr>
+          <w:rFonts w:ascii="Times New Roman" w:eastAsia="Times New Roman" w:hAnsi="Times New Roman" w:cs="Times New Roman"/>
+          <w:b/>
+          <w:bCs/>
+          <w:color w:val="000000" w:themeColor="text1"/>
+          <w:kern w:val="0"/>
+          <w:sz w:val="20"/>
+          <w:szCs w:val="20"/>
+          <w:lang w:eastAsia="en-GB"/>
+          <w14:ligatures w14:val="none"/>
+        </w:rPr>
+        <w:t>1.5. References  </w:t>
+      </w:r>
+    </w:p>
+    <w:p>
+      <w:pPr>
+        <w:shd w:val="clear" w:color="auto" w:fill="FFFFFF"/>
+        <w:spacing w:before="240" w:after="0" w:line="240" w:lineRule="auto"/>
+        <w:jc w:val="both"/>
+        <w:rPr>
+          <w:rFonts w:ascii="Times New Roman" w:eastAsia="Times New Roman" w:hAnsi="Times New Roman" w:cs="Times New Roman"/>
+          <w:color w:val="000000" w:themeColor="text1"/>
+          <w:kern w:val="0"/>
+          <w:sz w:val="20"/>
+          <w:szCs w:val="20"/>
+          <w:lang w:eastAsia="en-GB"/>
+          <w14:ligatures w14:val="none"/>
+        </w:rPr>
+      </w:pPr>
+      <w:r>
+        <w:rPr>
+          <w:rFonts w:ascii="Times New Roman" w:eastAsia="Times New Roman" w:hAnsi="Times New Roman" w:cs="Times New Roman"/>
+          <w:b/>
+          <w:bCs/>
+          <w:color w:val="000000" w:themeColor="text1"/>
+          <w:kern w:val="0"/>
+          <w:sz w:val="20"/>
+          <w:szCs w:val="20"/>
+          <w:lang w:eastAsia="en-GB"/>
+          <w14:ligatures w14:val="none"/>
+        </w:rPr>
+        <w:t>2. Overall Description</w:t>
+      </w:r>
+    </w:p>
+    <w:p>
+      <w:pPr>
+        <w:shd w:val="clear" w:color="auto" w:fill="FFFFFF"/>
+        <w:spacing w:before="240" w:after="0" w:line="240" w:lineRule="auto"/>
+        <w:jc w:val="both"/>
+        <w:rPr>
+          <w:rFonts w:ascii="Times New Roman" w:eastAsia="Times New Roman" w:hAnsi="Times New Roman" w:cs="Times New Roman"/>
+          <w:b/>
+          <w:bCs/>
+          <w:color w:val="000000" w:themeColor="text1"/>
+          <w:kern w:val="0"/>
+          <w:sz w:val="20"/>
+          <w:szCs w:val="20"/>
+          <w:lang w:eastAsia="en-GB"/>
+          <w14:ligatures w14:val="none"/>
+        </w:rPr>
+      </w:pPr>
+      <w:r>
+        <w:rPr>
+          <w:rFonts w:ascii="Times New Roman" w:eastAsia="Times New Roman" w:hAnsi="Times New Roman" w:cs="Times New Roman"/>
+          <w:b/>
+          <w:bCs/>
+          <w:color w:val="000000" w:themeColor="text1"/>
+          <w:kern w:val="0"/>
+          <w:sz w:val="20"/>
+          <w:szCs w:val="20"/>
+          <w:lang w:eastAsia="en-GB"/>
+          <w14:ligatures w14:val="none"/>
+        </w:rPr>
+        <w:t>2.1. Product Perspective  </w:t>
+      </w:r>
+    </w:p>
+    <w:p>
+      <w:pPr>
+        <w:shd w:val="clear" w:color="auto" w:fill="FFFFFF"/>
+        <w:spacing w:before="240" w:after="0" w:line="240" w:lineRule="auto"/>
+        <w:rPr>
+          <w:rFonts w:ascii="Times New Roman" w:eastAsia="Times New Roman" w:hAnsi="Times New Roman" w:cs="Times New Roman"/>
+          <w:b/>
+          <w:bCs/>
+          <w:color w:val="000000" w:themeColor="text1"/>
+          <w:kern w:val="0"/>
+          <w:sz w:val="20"/>
+          <w:szCs w:val="20"/>
+          <w:lang w:eastAsia="en-GB"/>
+          <w14:ligatures w14:val="none"/>
+        </w:rPr>
+      </w:pPr>
+      <w:r>
+        <w:rPr>
+          <w:rFonts w:ascii="Times New Roman" w:eastAsia="Times New Roman" w:hAnsi="Times New Roman" w:cs="Times New Roman"/>
+          <w:b/>
+          <w:bCs/>
+          <w:color w:val="000000" w:themeColor="text1"/>
+          <w:kern w:val="0"/>
+          <w:sz w:val="20"/>
+          <w:szCs w:val="20"/>
+          <w:lang w:eastAsia="en-GB"/>
+          <w14:ligatures w14:val="none"/>
+        </w:rPr>
+        <w:t>2.2. Product Features  </w:t>
+      </w:r>
+    </w:p>
+    <w:p>
+      <w:pPr>
+        <w:shd w:val="clear" w:color="auto" w:fill="FFFFFF"/>
+        <w:spacing w:before="240" w:after="0" w:line="240" w:lineRule="auto"/>
+        <w:rPr>
+          <w:rFonts w:ascii="Times New Roman" w:eastAsia="Times New Roman" w:hAnsi="Times New Roman" w:cs="Times New Roman"/>
+          <w:b/>
+          <w:bCs/>
+          <w:color w:val="000000" w:themeColor="text1"/>
+          <w:kern w:val="0"/>
+          <w:sz w:val="20"/>
+          <w:szCs w:val="20"/>
+          <w:lang w:eastAsia="en-GB"/>
+          <w14:ligatures w14:val="none"/>
+        </w:rPr>
+      </w:pPr>
+      <w:r>
+        <w:rPr>
+          <w:rFonts w:ascii="Times New Roman" w:eastAsia="Times New Roman" w:hAnsi="Times New Roman" w:cs="Times New Roman"/>
+          <w:b/>
+          <w:bCs/>
+          <w:color w:val="000000" w:themeColor="text1"/>
+          <w:kern w:val="0"/>
+          <w:sz w:val="20"/>
+          <w:szCs w:val="20"/>
+          <w:lang w:eastAsia="en-GB"/>
+          <w14:ligatures w14:val="none"/>
+        </w:rPr>
+        <w:t>2.3. User Classes and Characteris</w:t>
+      </w:r>
+      <w:r>
+        <w:rPr>
+          <w:rFonts w:ascii="Times New Roman" w:eastAsia="Times New Roman" w:hAnsi="Times New Roman" w:cs="Times New Roman"/>
+          <w:b/>
+          <w:bCs/>
+          <w:color w:val="000000" w:themeColor="text1"/>
+          <w:kern w:val="0"/>
+          <w:sz w:val="20"/>
+          <w:szCs w:val="20"/>
+          <w:lang w:eastAsia="en-GB"/>
+          <w14:ligatures w14:val="none"/>
+        </w:rPr>
+        <w:t>tics</w:t>
+      </w:r>
+    </w:p>
+    <w:p>
+      <w:pPr>
+        <w:shd w:val="clear" w:color="auto" w:fill="FFFFFF"/>
+        <w:spacing w:before="240" w:after="0" w:line="240" w:lineRule="auto"/>
+        <w:jc w:val="both"/>
+        <w:rPr>
+          <w:rFonts w:ascii="Times New Roman" w:eastAsia="Times New Roman" w:hAnsi="Times New Roman" w:cs="Times New Roman"/>
+          <w:color w:val="000000" w:themeColor="text1"/>
+          <w:kern w:val="0"/>
+          <w:sz w:val="20"/>
+          <w:szCs w:val="20"/>
+          <w:lang w:eastAsia="en-GB"/>
+          <w14:ligatures w14:val="none"/>
+        </w:rPr>
+      </w:pPr>
+      <w:r>
+        <w:rPr>
+          <w:rFonts w:ascii="Times New Roman" w:eastAsia="Times New Roman" w:hAnsi="Times New Roman" w:cs="Times New Roman"/>
+          <w:b/>
+          <w:bCs/>
+          <w:color w:val="000000" w:themeColor="text1"/>
+          <w:kern w:val="0"/>
+          <w:sz w:val="20"/>
+          <w:szCs w:val="20"/>
+          <w:lang w:eastAsia="en-GB"/>
+          <w14:ligatures w14:val="none"/>
+        </w:rPr>
+        <w:t>2.4. Operating Environment</w:t>
+      </w:r>
+    </w:p>
+    <w:p>
+      <w:pPr>
+        <w:shd w:val="clear" w:color="auto" w:fill="FFFFFF"/>
+        <w:spacing w:before="240" w:after="0" w:line="240" w:lineRule="auto"/>
+        <w:jc w:val="both"/>
+        <w:rPr>
+          <w:rFonts w:ascii="Times New Roman" w:eastAsia="Times New Roman" w:hAnsi="Times New Roman" w:cs="Times New Roman"/>
+          <w:color w:val="000000" w:themeColor="text1"/>
+          <w:kern w:val="0"/>
+          <w:sz w:val="20"/>
+          <w:szCs w:val="20"/>
+          <w:lang w:eastAsia="en-GB"/>
+          <w14:ligatures w14:val="none"/>
+        </w:rPr>
+      </w:pPr>
+      <w:r>
+        <w:rPr>
+          <w:rFonts w:ascii="Times New Roman" w:eastAsia="Times New Roman" w:hAnsi="Times New Roman" w:cs="Times New Roman"/>
+          <w:b/>
+          <w:bCs/>
+          <w:color w:val="000000" w:themeColor="text1"/>
+          <w:kern w:val="0"/>
+          <w:sz w:val="20"/>
+          <w:szCs w:val="20"/>
+          <w:lang w:eastAsia="en-GB"/>
+          <w14:ligatures w14:val="none"/>
+        </w:rPr>
+        <w:t>2.5. Design and Implementation Constraints</w:t>
+      </w:r>
+    </w:p>
+    <w:p>
+      <w:pPr>
+        <w:shd w:val="clear" w:color="auto" w:fill="FFFFFF"/>
+        <w:spacing w:before="240" w:after="0" w:line="240" w:lineRule="auto"/>
+        <w:jc w:val="both"/>
+        <w:rPr>
+          <w:rFonts w:ascii="Times New Roman" w:eastAsia="Times New Roman" w:hAnsi="Times New Roman" w:cs="Times New Roman"/>
+          <w:color w:val="000000" w:themeColor="text1"/>
+          <w:kern w:val="0"/>
+          <w:sz w:val="20"/>
+          <w:szCs w:val="20"/>
+          <w:lang w:eastAsia="en-GB"/>
+          <w14:ligatures w14:val="none"/>
+        </w:rPr>
+      </w:pPr>
+      <w:r>
+        <w:rPr>
+          <w:rFonts w:ascii="Times New Roman" w:eastAsia="Times New Roman" w:hAnsi="Times New Roman" w:cs="Times New Roman"/>
+          <w:b/>
+          <w:bCs/>
+          <w:color w:val="000000" w:themeColor="text1"/>
+          <w:kern w:val="0"/>
+          <w:sz w:val="20"/>
+          <w:szCs w:val="20"/>
+          <w:lang w:eastAsia="en-GB"/>
+          <w14:ligatures w14:val="none"/>
+        </w:rPr>
+        <w:t>2.6. User Documentation</w:t>
+      </w:r>
+    </w:p>
+    <w:p>
+      <w:pPr>
+        <w:shd w:val="clear" w:color="auto" w:fill="FFFFFF"/>
+        <w:spacing w:before="240" w:after="0" w:line="240" w:lineRule="auto"/>
+        <w:jc w:val="both"/>
+        <w:rPr>
+          <w:rFonts w:ascii="Times New Roman" w:eastAsia="Times New Roman" w:hAnsi="Times New Roman" w:cs="Times New Roman"/>
+          <w:color w:val="000000" w:themeColor="text1"/>
+          <w:kern w:val="0"/>
+          <w:sz w:val="20"/>
+          <w:szCs w:val="20"/>
+          <w:lang w:eastAsia="en-GB"/>
+          <w14:ligatures w14:val="none"/>
+        </w:rPr>
+      </w:pPr>
+      <w:r>
+        <w:rPr>
+          <w:rFonts w:ascii="Times New Roman" w:eastAsia="Times New Roman" w:hAnsi="Times New Roman" w:cs="Times New Roman"/>
+          <w:b/>
+          <w:bCs/>
+          <w:color w:val="000000" w:themeColor="text1"/>
+          <w:kern w:val="0"/>
+          <w:sz w:val="20"/>
+          <w:szCs w:val="20"/>
+          <w:lang w:eastAsia="en-GB"/>
+          <w14:ligatures w14:val="none"/>
+        </w:rPr>
+        <w:t>2.7. Assumptions and Dependencies</w:t>
+      </w:r>
+    </w:p>
+    <w:p>
+      <w:pPr>
+        <w:shd w:val="clear" w:color="auto" w:fill="FFFFFF"/>
+        <w:spacing w:before="240" w:after="0" w:line="240" w:lineRule="auto"/>
+        <w:jc w:val="both"/>
+        <w:rPr>
+          <w:rFonts w:ascii="Times New Roman" w:eastAsia="Times New Roman" w:hAnsi="Times New Roman" w:cs="Times New Roman"/>
+          <w:b/>
+          <w:bCs/>
+          <w:color w:val="000000" w:themeColor="text1"/>
+          <w:kern w:val="0"/>
+          <w:sz w:val="20"/>
+          <w:szCs w:val="20"/>
+          <w:lang w:eastAsia="en-GB"/>
+          <w14:ligatures w14:val="none"/>
+        </w:rPr>
+      </w:pPr>
+      <w:r>
+        <w:rPr>
+          <w:rFonts w:ascii="Times New Roman" w:eastAsia="Times New Roman" w:hAnsi="Times New Roman" w:cs="Times New Roman"/>
+          <w:b/>
+          <w:bCs/>
+          <w:color w:val="000000" w:themeColor="text1"/>
+          <w:kern w:val="0"/>
+          <w:sz w:val="20"/>
+          <w:szCs w:val="20"/>
+          <w:lang w:eastAsia="en-GB"/>
+          <w14:ligatures w14:val="none"/>
+        </w:rPr>
+        <w:t>3. System Features</w:t>
+      </w:r>
+    </w:p>
+    <w:p>
+      <w:pPr>
+        <w:shd w:val="clear" w:color="auto" w:fill="FFFFFF"/>
+        <w:spacing w:before="240" w:after="0" w:line="240" w:lineRule="auto"/>
+        <w:jc w:val="both"/>
+        <w:rPr>
+          <w:rFonts w:ascii="Times New Roman" w:eastAsia="Times New Roman" w:hAnsi="Times New Roman" w:cs="Times New Roman"/>
+          <w:color w:val="000000" w:themeColor="text1"/>
+          <w:kern w:val="0"/>
+          <w:sz w:val="20"/>
+          <w:szCs w:val="20"/>
+          <w:lang w:eastAsia="en-GB"/>
+          <w14:ligatures w14:val="none"/>
+        </w:rPr>
+      </w:pPr>
+      <w:r>
+        <w:rPr>
+          <w:rFonts w:ascii="Times New Roman" w:eastAsia="Times New Roman" w:hAnsi="Times New Roman" w:cs="Times New Roman"/>
+          <w:b/>
+          <w:bCs/>
+          <w:color w:val="000000" w:themeColor="text1"/>
+          <w:kern w:val="0"/>
+          <w:sz w:val="20"/>
+          <w:szCs w:val="20"/>
+          <w:lang w:eastAsia="en-GB"/>
+          <w14:ligatures w14:val="none"/>
+        </w:rPr>
+        <w:t>4. External Interface Requirements</w:t>
+      </w:r>
+    </w:p>
+    <w:p>
+      <w:pPr>
+        <w:shd w:val="clear" w:color="auto" w:fill="FFFFFF"/>
+        <w:spacing w:before="240" w:after="0" w:line="240" w:lineRule="auto"/>
+        <w:jc w:val="both"/>
+        <w:rPr>
+          <w:rFonts w:ascii="Times New Roman" w:eastAsia="Times New Roman" w:hAnsi="Times New Roman" w:cs="Times New Roman"/>
+          <w:color w:val="000000" w:themeColor="text1"/>
+          <w:kern w:val="0"/>
+          <w:sz w:val="20"/>
+          <w:szCs w:val="20"/>
+          <w:lang w:eastAsia="en-GB"/>
+          <w14:ligatures w14:val="none"/>
+        </w:rPr>
+      </w:pPr>
+      <w:r>
+        <w:rPr>
+          <w:rFonts w:ascii="Times New Roman" w:eastAsia="Times New Roman" w:hAnsi="Times New Roman" w:cs="Times New Roman"/>
+          <w:b/>
+          <w:bCs/>
+          <w:color w:val="000000" w:themeColor="text1"/>
+          <w:kern w:val="0"/>
+          <w:sz w:val="20"/>
+          <w:szCs w:val="20"/>
+          <w:lang w:eastAsia="en-GB"/>
+          <w14:ligatures w14:val="none"/>
+        </w:rPr>
+        <w:t>4.1. User Interfaces Overview</w:t>
+      </w:r>
+    </w:p>
+    <w:p>
+      <w:pPr>
+        <w:shd w:val="clear" w:color="auto" w:fill="FFFFFF"/>
+        <w:spacing w:before="240" w:after="0" w:line="240" w:lineRule="auto"/>
+        <w:jc w:val="both"/>
+        <w:rPr>
+          <w:rFonts w:ascii="Times New Roman" w:eastAsia="Times New Roman" w:hAnsi="Times New Roman" w:cs="Times New Roman"/>
+          <w:color w:val="000000" w:themeColor="text1"/>
+          <w:kern w:val="0"/>
+          <w:sz w:val="20"/>
+          <w:szCs w:val="20"/>
+          <w:lang w:eastAsia="en-GB"/>
+          <w14:ligatures w14:val="none"/>
+        </w:rPr>
+      </w:pPr>
+      <w:r>
+        <w:rPr>
+          <w:rFonts w:ascii="Times New Roman" w:eastAsia="Times New Roman" w:hAnsi="Times New Roman" w:cs="Times New Roman"/>
+          <w:b/>
+          <w:bCs/>
+          <w:color w:val="000000" w:themeColor="text1"/>
+          <w:kern w:val="0"/>
+          <w:sz w:val="20"/>
+          <w:szCs w:val="20"/>
+          <w:lang w:eastAsia="en-GB"/>
+          <w14:ligatures w14:val="none"/>
+        </w:rPr>
+        <w:t>4.2. Hardware Interfaces</w:t>
+      </w:r>
+    </w:p>
+    <w:p>
+      <w:pPr>
+        <w:shd w:val="clear" w:color="auto" w:fill="FFFFFF"/>
+        <w:spacing w:before="240" w:after="0" w:line="240" w:lineRule="auto"/>
+        <w:jc w:val="both"/>
+        <w:rPr>
+          <w:rFonts w:ascii="Times New Roman" w:eastAsia="Times New Roman" w:hAnsi="Times New Roman" w:cs="Times New Roman"/>
+          <w:color w:val="000000" w:themeColor="text1"/>
+          <w:kern w:val="0"/>
+          <w:sz w:val="20"/>
+          <w:szCs w:val="20"/>
+          <w:lang w:eastAsia="en-GB"/>
+          <w14:ligatures w14:val="none"/>
+        </w:rPr>
+      </w:pPr>
+      <w:r>
+        <w:rPr>
+          <w:rFonts w:ascii="Times New Roman" w:eastAsia="Times New Roman" w:hAnsi="Times New Roman" w:cs="Times New Roman"/>
+          <w:b/>
+          <w:bCs/>
+          <w:color w:val="000000" w:themeColor="text1"/>
+          <w:kern w:val="0"/>
+          <w:sz w:val="20"/>
+          <w:szCs w:val="20"/>
+          <w:lang w:eastAsia="en-GB"/>
+          <w14:ligatures w14:val="none"/>
+        </w:rPr>
+        <w:t>4.3. Software Interfaces</w:t>
+      </w:r>
+    </w:p>
+    <w:p>
+      <w:pPr>
+        <w:shd w:val="clear" w:color="auto" w:fill="FFFFFF"/>
+        <w:spacing w:before="240" w:after="0" w:line="240" w:lineRule="auto"/>
+        <w:jc w:val="both"/>
+        <w:rPr>
+          <w:rFonts w:ascii="Times New Roman" w:eastAsia="Times New Roman" w:hAnsi="Times New Roman" w:cs="Times New Roman"/>
+          <w:color w:val="000000" w:themeColor="text1"/>
+          <w:kern w:val="0"/>
+          <w:sz w:val="20"/>
+          <w:szCs w:val="20"/>
+          <w:lang w:eastAsia="en-GB"/>
+          <w14:ligatures w14:val="none"/>
+        </w:rPr>
+      </w:pPr>
+      <w:r>
+        <w:rPr>
+          <w:rFonts w:ascii="Times New Roman" w:eastAsia="Times New Roman" w:hAnsi="Times New Roman" w:cs="Times New Roman"/>
+          <w:b/>
+          <w:bCs/>
+          <w:color w:val="000000" w:themeColor="text1"/>
+          <w:kern w:val="0"/>
+          <w:sz w:val="20"/>
+          <w:szCs w:val="20"/>
+          <w:lang w:eastAsia="en-GB"/>
+          <w14:ligatures w14:val="none"/>
+        </w:rPr>
+        <w:t>5. System Features/Modules</w:t>
+      </w:r>
+    </w:p>
+    <w:p>
+      <w:pPr>
+        <w:shd w:val="clear" w:color="auto" w:fill="FFFFFF"/>
+        <w:spacing w:before="240" w:after="0" w:line="240" w:lineRule="auto"/>
+        <w:jc w:val="both"/>
+        <w:rPr>
+          <w:rFonts w:ascii="Times New Roman" w:eastAsia="Times New Roman" w:hAnsi="Times New Roman" w:cs="Times New Roman"/>
+          <w:b/>
+          <w:bCs/>
+          <w:color w:val="000000" w:themeColor="text1"/>
+          <w:kern w:val="0"/>
+          <w:sz w:val="20"/>
+          <w:szCs w:val="20"/>
+          <w:lang w:eastAsia="en-GB"/>
+          <w14:ligatures w14:val="none"/>
+        </w:rPr>
+      </w:pPr>
+      <w:r>
+        <w:rPr>
+          <w:rFonts w:ascii="Times New Roman" w:eastAsia="Times New Roman" w:hAnsi="Times New Roman" w:cs="Times New Roman"/>
+          <w:b/>
+          <w:bCs/>
+          <w:color w:val="000000" w:themeColor="text1"/>
+          <w:kern w:val="0"/>
+          <w:sz w:val="20"/>
+          <w:szCs w:val="20"/>
+          <w:lang w:eastAsia="en-GB"/>
+          <w14:ligatures w14:val="none"/>
+        </w:rPr>
+        <w:t>5.1 System Feature Name</w:t>
+      </w:r>
+    </w:p>
+    <w:p>
+      <w:pPr>
+        <w:shd w:val="clear" w:color="auto" w:fill="FFFFFF"/>
+        <w:spacing w:before="240" w:after="0" w:line="240" w:lineRule="auto"/>
+        <w:jc w:val="both"/>
+        <w:rPr>
+          <w:rFonts w:ascii="Times New Roman" w:eastAsia="Times New Roman" w:hAnsi="Times New Roman" w:cs="Times New Roman"/>
+          <w:color w:val="000000" w:themeColor="text1"/>
+          <w:kern w:val="0"/>
+          <w:sz w:val="20"/>
+          <w:szCs w:val="20"/>
+          <w:lang w:eastAsia="en-GB"/>
+          <w14:ligatures w14:val="none"/>
+        </w:rPr>
+      </w:pPr>
+      <w:r>
+        <w:rPr>
+          <w:rFonts w:ascii="Times New Roman" w:eastAsia="Times New Roman" w:hAnsi="Times New Roman" w:cs="Times New Roman"/>
+          <w:b/>
+          <w:bCs/>
+          <w:color w:val="000000" w:themeColor="text1"/>
+          <w:kern w:val="0"/>
+          <w:sz w:val="20"/>
+          <w:szCs w:val="20"/>
+          <w:lang w:eastAsia="en-GB"/>
+          <w14:ligatures w14:val="none"/>
+        </w:rPr>
+        <w:t>5.1.</w:t>
+      </w:r>
+      <w:r>
+        <w:rPr>
+          <w:rFonts w:ascii="Times New Roman" w:eastAsia="Times New Roman" w:hAnsi="Times New Roman" w:cs="Times New Roman"/>
+          <w:b/>
+          <w:bCs/>
+          <w:color w:val="000000" w:themeColor="text1"/>
+          <w:kern w:val="0"/>
+          <w:sz w:val="20"/>
+          <w:szCs w:val="20"/>
+          <w:lang w:eastAsia="en-GB"/>
+          <w14:ligatures w14:val="none"/>
+        </w:rPr>
+        <w:t>1.</w:t>
+      </w:r>
+      <w:r>
+        <w:rPr>
+          <w:rFonts w:ascii="Times New Roman" w:eastAsia="Times New Roman" w:hAnsi="Times New Roman" w:cs="Times New Roman"/>
+          <w:b/>
+          <w:bCs/>
+          <w:color w:val="000000" w:themeColor="text1"/>
+          <w:kern w:val="0"/>
+          <w:sz w:val="20"/>
+          <w:szCs w:val="20"/>
+          <w:lang w:eastAsia="en-GB"/>
+          <w14:ligatures w14:val="none"/>
+        </w:rPr>
+        <w:t xml:space="preserve"> Description and Priority</w:t>
+      </w:r>
+    </w:p>
+    <w:p>
+      <w:pPr>
+        <w:shd w:val="clear" w:color="auto" w:fill="FFFFFF"/>
+        <w:spacing w:before="240" w:after="0" w:line="240" w:lineRule="auto"/>
+        <w:jc w:val="both"/>
+        <w:rPr>
+          <w:rFonts w:ascii="Times New Roman" w:eastAsia="Times New Roman" w:hAnsi="Times New Roman" w:cs="Times New Roman"/>
+          <w:color w:val="000000" w:themeColor="text1"/>
+          <w:kern w:val="0"/>
+          <w:sz w:val="20"/>
+          <w:szCs w:val="20"/>
+          <w:lang w:eastAsia="en-GB"/>
+          <w14:ligatures w14:val="none"/>
+        </w:rPr>
+      </w:pPr>
+      <w:r>
+        <w:rPr>
+          <w:rFonts w:ascii="Times New Roman" w:eastAsia="Times New Roman" w:hAnsi="Times New Roman" w:cs="Times New Roman"/>
+          <w:b/>
+          <w:bCs/>
+          <w:color w:val="000000" w:themeColor="text1"/>
+          <w:kern w:val="0"/>
+          <w:sz w:val="20"/>
+          <w:szCs w:val="20"/>
+          <w:lang w:eastAsia="en-GB"/>
+          <w14:ligatures w14:val="none"/>
+        </w:rPr>
+        <w:t>5.1.2 Stimulus/Response Sequences</w:t>
+      </w:r>
+    </w:p>
+    <w:p>
+      <w:pPr>
+        <w:shd w:val="clear" w:color="auto" w:fill="FFFFFF"/>
+        <w:spacing w:before="240" w:after="0" w:line="240" w:lineRule="auto"/>
+        <w:jc w:val="both"/>
+        <w:rPr>
+          <w:rFonts w:ascii="Times New Roman" w:eastAsia="Times New Roman" w:hAnsi="Times New Roman" w:cs="Times New Roman"/>
+          <w:b/>
+          <w:bCs/>
+          <w:color w:val="000000" w:themeColor="text1"/>
+          <w:kern w:val="0"/>
+          <w:sz w:val="20"/>
+          <w:szCs w:val="20"/>
+          <w:lang w:eastAsia="en-GB"/>
+          <w14:ligatures w14:val="none"/>
+        </w:rPr>
+      </w:pPr>
+    </w:p>
+    <w:p>
+      <w:pPr>
+        <w:shd w:val="clear" w:color="auto" w:fill="FFFFFF"/>
+        <w:spacing w:before="240" w:after="0" w:line="240" w:lineRule="auto"/>
+        <w:jc w:val="both"/>
+        <w:rPr>
+          <w:rFonts w:ascii="Times New Roman" w:eastAsia="Times New Roman" w:hAnsi="Times New Roman" w:cs="Times New Roman"/>
+          <w:b/>
+          <w:bCs/>
+          <w:color w:val="000000" w:themeColor="text1"/>
+          <w:kern w:val="0"/>
+          <w:sz w:val="20"/>
+          <w:szCs w:val="20"/>
+          <w:lang w:eastAsia="en-GB"/>
+          <w14:ligatures w14:val="none"/>
+        </w:rPr>
+      </w:pPr>
+    </w:p>
+    <w:p>
+      <w:pPr>
+        <w:shd w:val="clear" w:color="auto" w:fill="FFFFFF"/>
+        <w:spacing w:before="240" w:after="0" w:line="240" w:lineRule="auto"/>
+        <w:jc w:val="both"/>
+        <w:rPr>
+          <w:rFonts w:ascii="Times New Roman" w:eastAsia="Times New Roman" w:hAnsi="Times New Roman" w:cs="Times New Roman"/>
+          <w:b/>
+          <w:bCs/>
+          <w:color w:val="000000" w:themeColor="text1"/>
+          <w:kern w:val="0"/>
+          <w:sz w:val="20"/>
+          <w:szCs w:val="20"/>
+          <w:lang w:eastAsia="en-GB"/>
+          <w14:ligatures w14:val="none"/>
+        </w:rPr>
+      </w:pPr>
+    </w:p>
+    <w:p>
+      <w:pPr>
+        <w:shd w:val="clear" w:color="auto" w:fill="FFFFFF"/>
+        <w:spacing w:before="240" w:after="0" w:line="240" w:lineRule="auto"/>
+        <w:jc w:val="both"/>
+        <w:rPr>
+          <w:rFonts w:ascii="Times New Roman" w:eastAsia="Times New Roman" w:hAnsi="Times New Roman" w:cs="Times New Roman"/>
+          <w:b/>
+          <w:bCs/>
+          <w:color w:val="000000" w:themeColor="text1"/>
+          <w:kern w:val="0"/>
+          <w:sz w:val="20"/>
+          <w:szCs w:val="20"/>
+          <w:lang w:eastAsia="en-GB"/>
+          <w14:ligatures w14:val="none"/>
+        </w:rPr>
+      </w:pPr>
+    </w:p>
+    <w:p>
+      <w:pPr>
+        <w:shd w:val="clear" w:color="auto" w:fill="FFFFFF"/>
+        <w:spacing w:before="240" w:after="0" w:line="240" w:lineRule="auto"/>
+        <w:jc w:val="both"/>
+        <w:rPr>
+          <w:rFonts w:ascii="Times New Roman" w:eastAsia="Times New Roman" w:hAnsi="Times New Roman" w:cs="Times New Roman"/>
+          <w:b/>
+          <w:bCs/>
+          <w:color w:val="000000" w:themeColor="text1"/>
+          <w:kern w:val="0"/>
+          <w:sz w:val="20"/>
+          <w:szCs w:val="20"/>
+          <w:lang w:eastAsia="en-GB"/>
+          <w14:ligatures w14:val="none"/>
+        </w:rPr>
+      </w:pPr>
+    </w:p>
+    <w:p>
+      <w:pPr>
+        <w:shd w:val="clear" w:color="auto" w:fill="FFFFFF"/>
+        <w:spacing w:before="240" w:after="0" w:line="240" w:lineRule="auto"/>
+        <w:jc w:val="both"/>
+        <w:rPr>
+          <w:rFonts w:ascii="Times New Roman" w:eastAsia="Times New Roman" w:hAnsi="Times New Roman" w:cs="Times New Roman"/>
+          <w:b/>
+          <w:bCs/>
+          <w:color w:val="000000" w:themeColor="text1"/>
+          <w:kern w:val="0"/>
+          <w:sz w:val="20"/>
+          <w:szCs w:val="20"/>
+          <w:lang w:eastAsia="en-GB"/>
+          <w14:ligatures w14:val="none"/>
+        </w:rPr>
+      </w:pPr>
+      <w:r>
+        <w:rPr>
+          <w:rFonts w:ascii="Times New Roman" w:eastAsia="Times New Roman" w:hAnsi="Times New Roman" w:cs="Times New Roman"/>
+          <w:b/>
+          <w:bCs/>
+          <w:color w:val="000000" w:themeColor="text1"/>
+          <w:kern w:val="0"/>
+          <w:sz w:val="20"/>
+          <w:szCs w:val="20"/>
+          <w:lang w:eastAsia="en-GB"/>
+          <w14:ligatures w14:val="none"/>
+        </w:rPr>
         <w:lastRenderedPageBreak/>
-        <w:t>1. Introduction</w:t>
-      </w:r>
-    </w:p>
-    <w:p>
-      <w:pPr>
-        <w:shd w:val="clear" w:color="auto" w:fill="FFFFFF"/>
-        <w:spacing w:before="240" w:after="0" w:line="240" w:lineRule="auto"/>
-        <w:rPr>
-          <w:rFonts w:ascii="Times New Roman" w:eastAsia="Times New Roman" w:hAnsi="Times New Roman" w:cs="Times New Roman"/>
-          <w:color w:val="000000" w:themeColor="text1"/>
-          <w:kern w:val="0"/>
-          <w:sz w:val="20"/>
-          <w:szCs w:val="20"/>
-          <w:lang w:eastAsia="en-GB"/>
-          <w14:ligatures w14:val="none"/>
-        </w:rPr>
-      </w:pPr>
-      <w:r>
-        <w:rPr>
-          <w:rFonts w:ascii="Times New Roman" w:eastAsia="Times New Roman" w:hAnsi="Times New Roman" w:cs="Times New Roman"/>
-          <w:b/>
-          <w:bCs/>
-          <w:color w:val="000000" w:themeColor="text1"/>
-          <w:kern w:val="0"/>
-          <w:sz w:val="20"/>
-          <w:szCs w:val="20"/>
-          <w:lang w:eastAsia="en-GB"/>
-          <w14:ligatures w14:val="none"/>
-        </w:rPr>
-        <w:t>1.1. Purpose  </w:t>
+        <w:t>5.1.3 Functional Requirements</w:t>
       </w:r>
     </w:p>
     <w:p>
@@ -1633,16 +2622,14 @@
       <w:r>
         <w:rPr>
           <w:rFonts w:ascii="Times New Roman" w:eastAsia="Times New Roman" w:hAnsi="Times New Roman" w:cs="Times New Roman"/>
-          <w:b/>
-          <w:bCs/>
-          <w:color w:val="000000" w:themeColor="text1"/>
-          <w:kern w:val="0"/>
-          <w:sz w:val="20"/>
-          <w:szCs w:val="20"/>
-          <w:lang w:eastAsia="en-GB"/>
-          <w14:ligatures w14:val="none"/>
-        </w:rPr>
-        <w:t>1.2. Document Conventions  </w:t>
+          <w:color w:val="000000" w:themeColor="text1"/>
+          <w:kern w:val="0"/>
+          <w:sz w:val="20"/>
+          <w:szCs w:val="20"/>
+          <w:lang w:eastAsia="en-GB"/>
+          <w14:ligatures w14:val="none"/>
+        </w:rPr>
+        <w:t>REQ-1.1: System shall detect human count in the house using sensors.</w:t>
       </w:r>
     </w:p>
     <w:p>
@@ -1663,16 +2650,40 @@
       <w:r>
         <w:rPr>
           <w:rFonts w:ascii="Times New Roman" w:eastAsia="Times New Roman" w:hAnsi="Times New Roman" w:cs="Times New Roman"/>
-          <w:b/>
-          <w:bCs/>
-          <w:color w:val="000000" w:themeColor="text1"/>
-          <w:kern w:val="0"/>
-          <w:sz w:val="20"/>
-          <w:szCs w:val="20"/>
-          <w:lang w:eastAsia="en-GB"/>
-          <w14:ligatures w14:val="none"/>
-        </w:rPr>
-        <w:t>1.3. Intended Audience and Reading Suggestions  </w:t>
+          <w:color w:val="000000" w:themeColor="text1"/>
+          <w:kern w:val="0"/>
+          <w:sz w:val="20"/>
+          <w:szCs w:val="20"/>
+          <w:lang w:eastAsia="en-GB"/>
+          <w14:ligatures w14:val="none"/>
+        </w:rPr>
+        <w:t xml:space="preserve">REQ-1.2: When human count in house is zero system, shall turn of the </w:t>
+      </w:r>
+      <w:proofErr w:type="gramStart"/>
+      <w:r>
+        <w:rPr>
+          <w:rFonts w:ascii="Times New Roman" w:eastAsia="Times New Roman" w:hAnsi="Times New Roman" w:cs="Times New Roman"/>
+          <w:color w:val="000000" w:themeColor="text1"/>
+          <w:kern w:val="0"/>
+          <w:sz w:val="20"/>
+          <w:szCs w:val="20"/>
+          <w:lang w:eastAsia="en-GB"/>
+          <w14:ligatures w14:val="none"/>
+        </w:rPr>
+        <w:t>all climate</w:t>
+      </w:r>
+      <w:proofErr w:type="gramEnd"/>
+      <w:r>
+        <w:rPr>
+          <w:rFonts w:ascii="Times New Roman" w:eastAsia="Times New Roman" w:hAnsi="Times New Roman" w:cs="Times New Roman"/>
+          <w:color w:val="000000" w:themeColor="text1"/>
+          <w:kern w:val="0"/>
+          <w:sz w:val="20"/>
+          <w:szCs w:val="20"/>
+          <w:lang w:eastAsia="en-GB"/>
+          <w14:ligatures w14:val="none"/>
+        </w:rPr>
+        <w:t xml:space="preserve"> units </w:t>
       </w:r>
     </w:p>
     <w:p>
@@ -1693,16 +2704,14 @@
       <w:r>
         <w:rPr>
           <w:rFonts w:ascii="Times New Roman" w:eastAsia="Times New Roman" w:hAnsi="Times New Roman" w:cs="Times New Roman"/>
-          <w:b/>
-          <w:bCs/>
-          <w:color w:val="000000" w:themeColor="text1"/>
-          <w:kern w:val="0"/>
-          <w:sz w:val="20"/>
-          <w:szCs w:val="20"/>
-          <w:lang w:eastAsia="en-GB"/>
-          <w14:ligatures w14:val="none"/>
-        </w:rPr>
-        <w:t>1.4. Product Scope  </w:t>
+          <w:color w:val="000000" w:themeColor="text1"/>
+          <w:kern w:val="0"/>
+          <w:sz w:val="20"/>
+          <w:szCs w:val="20"/>
+          <w:lang w:eastAsia="en-GB"/>
+          <w14:ligatures w14:val="none"/>
+        </w:rPr>
+        <w:t>REQ-1.3: When the number of people in the house increases or decreases, the system shall dynamically adjust the temperature.</w:t>
       </w:r>
     </w:p>
     <w:p>
@@ -1723,16 +2732,14 @@
       <w:r>
         <w:rPr>
           <w:rFonts w:ascii="Times New Roman" w:eastAsia="Times New Roman" w:hAnsi="Times New Roman" w:cs="Times New Roman"/>
-          <w:b/>
-          <w:bCs/>
-          <w:color w:val="000000" w:themeColor="text1"/>
-          <w:kern w:val="0"/>
-          <w:sz w:val="20"/>
-          <w:szCs w:val="20"/>
-          <w:lang w:eastAsia="en-GB"/>
-          <w14:ligatures w14:val="none"/>
-        </w:rPr>
-        <w:t>1.5. References  </w:t>
+          <w:color w:val="000000" w:themeColor="text1"/>
+          <w:kern w:val="0"/>
+          <w:sz w:val="20"/>
+          <w:szCs w:val="20"/>
+          <w:lang w:eastAsia="en-GB"/>
+          <w14:ligatures w14:val="none"/>
+        </w:rPr>
+        <w:t>REQ-1.4: The system shall allow the user to disable autonomous mode and enter manual temperature via the interface</w:t>
       </w:r>
     </w:p>
     <w:p>
@@ -1753,16 +2760,14 @@
       <w:r>
         <w:rPr>
           <w:rFonts w:ascii="Times New Roman" w:eastAsia="Times New Roman" w:hAnsi="Times New Roman" w:cs="Times New Roman"/>
-          <w:b/>
-          <w:bCs/>
-          <w:color w:val="000000" w:themeColor="text1"/>
-          <w:kern w:val="0"/>
-          <w:sz w:val="20"/>
-          <w:szCs w:val="20"/>
-          <w:lang w:eastAsia="en-GB"/>
-          <w14:ligatures w14:val="none"/>
-        </w:rPr>
-        <w:t>2. Overall Description</w:t>
+          <w:color w:val="000000" w:themeColor="text1"/>
+          <w:kern w:val="0"/>
+          <w:sz w:val="20"/>
+          <w:szCs w:val="20"/>
+          <w:lang w:eastAsia="en-GB"/>
+          <w14:ligatures w14:val="none"/>
+        </w:rPr>
+        <w:t>REQ-1.5: If the sensor is disconnected, the system shall enter safe mode and operate at a standard temperature (e.g. 21°C).</w:t>
       </w:r>
     </w:p>
     <w:p>
@@ -1772,106 +2777,14 @@
         <w:jc w:val="both"/>
         <w:rPr>
           <w:rFonts w:ascii="Times New Roman" w:eastAsia="Times New Roman" w:hAnsi="Times New Roman" w:cs="Times New Roman"/>
-          <w:b/>
-          <w:bCs/>
-          <w:color w:val="000000" w:themeColor="text1"/>
-          <w:kern w:val="0"/>
-          <w:sz w:val="20"/>
-          <w:szCs w:val="20"/>
-          <w:lang w:eastAsia="en-GB"/>
-          <w14:ligatures w14:val="none"/>
-        </w:rPr>
-      </w:pPr>
-      <w:r>
-        <w:rPr>
-          <w:rFonts w:ascii="Times New Roman" w:eastAsia="Times New Roman" w:hAnsi="Times New Roman" w:cs="Times New Roman"/>
-          <w:b/>
-          <w:bCs/>
-          <w:color w:val="000000" w:themeColor="text1"/>
-          <w:kern w:val="0"/>
-          <w:sz w:val="20"/>
-          <w:szCs w:val="20"/>
-          <w:lang w:eastAsia="en-GB"/>
-          <w14:ligatures w14:val="none"/>
-        </w:rPr>
-        <w:t>2.1. Product Perspective  </w:t>
-      </w:r>
-    </w:p>
-    <w:p>
-      <w:pPr>
-        <w:shd w:val="clear" w:color="auto" w:fill="FFFFFF"/>
-        <w:spacing w:before="240" w:after="0" w:line="240" w:lineRule="auto"/>
-        <w:rPr>
-          <w:rFonts w:ascii="Times New Roman" w:eastAsia="Times New Roman" w:hAnsi="Times New Roman" w:cs="Times New Roman"/>
-          <w:b/>
-          <w:bCs/>
-          <w:color w:val="000000" w:themeColor="text1"/>
-          <w:kern w:val="0"/>
-          <w:sz w:val="20"/>
-          <w:szCs w:val="20"/>
-          <w:lang w:eastAsia="en-GB"/>
-          <w14:ligatures w14:val="none"/>
-        </w:rPr>
-      </w:pPr>
-      <w:r>
-        <w:rPr>
-          <w:rFonts w:ascii="Times New Roman" w:eastAsia="Times New Roman" w:hAnsi="Times New Roman" w:cs="Times New Roman"/>
-          <w:b/>
-          <w:bCs/>
-          <w:color w:val="000000" w:themeColor="text1"/>
-          <w:kern w:val="0"/>
-          <w:sz w:val="20"/>
-          <w:szCs w:val="20"/>
-          <w:lang w:eastAsia="en-GB"/>
-          <w14:ligatures w14:val="none"/>
-        </w:rPr>
-        <w:t>2.2. Product Features  </w:t>
-      </w:r>
-    </w:p>
-    <w:p>
-      <w:pPr>
-        <w:shd w:val="clear" w:color="auto" w:fill="FFFFFF"/>
-        <w:spacing w:before="240" w:after="0" w:line="240" w:lineRule="auto"/>
-        <w:rPr>
-          <w:rFonts w:ascii="Times New Roman" w:eastAsia="Times New Roman" w:hAnsi="Times New Roman" w:cs="Times New Roman"/>
-          <w:b/>
-          <w:bCs/>
-          <w:color w:val="000000" w:themeColor="text1"/>
-          <w:kern w:val="0"/>
-          <w:sz w:val="20"/>
-          <w:szCs w:val="20"/>
-          <w:lang w:eastAsia="en-GB"/>
-          <w14:ligatures w14:val="none"/>
-        </w:rPr>
-      </w:pPr>
-      <w:r>
-        <w:rPr>
-          <w:rFonts w:ascii="Times New Roman" w:eastAsia="Times New Roman" w:hAnsi="Times New Roman" w:cs="Times New Roman"/>
-          <w:b/>
-          <w:bCs/>
-          <w:color w:val="000000" w:themeColor="text1"/>
-          <w:kern w:val="0"/>
-          <w:sz w:val="20"/>
-          <w:szCs w:val="20"/>
-          <w:lang w:eastAsia="en-GB"/>
-          <w14:ligatures w14:val="none"/>
-        </w:rPr>
-        <w:t>2.3. User Classes and Characteris</w:t>
-      </w:r>
-      <w:r>
-        <w:rPr>
-          <w:rFonts w:ascii="Times New Roman" w:eastAsia="Times New Roman" w:hAnsi="Times New Roman" w:cs="Times New Roman"/>
-          <w:b/>
-          <w:bCs/>
-          <w:color w:val="000000" w:themeColor="text1"/>
-          <w:kern w:val="0"/>
-          <w:sz w:val="20"/>
-          <w:szCs w:val="20"/>
-          <w:lang w:eastAsia="en-GB"/>
-          <w14:ligatures w14:val="none"/>
-        </w:rPr>
-        <w:t>tics</w:t>
-      </w:r>
+          <w:color w:val="000000" w:themeColor="text1"/>
+          <w:kern w:val="0"/>
+          <w:sz w:val="20"/>
+          <w:szCs w:val="20"/>
+          <w:lang w:eastAsia="en-GB"/>
+          <w14:ligatures w14:val="none"/>
+        </w:rPr>
+      </w:pPr>
     </w:p>
     <w:p>
       <w:pPr>
@@ -1900,7 +2813,7 @@
           <w:lang w:eastAsia="en-GB"/>
           <w14:ligatures w14:val="none"/>
         </w:rPr>
-        <w:t>2.4. Operating Environment</w:t>
+        <w:t>6. Nonfunctional Requirements</w:t>
       </w:r>
     </w:p>
     <w:p>
@@ -1930,7 +2843,7 @@
           <w:lang w:eastAsia="en-GB"/>
           <w14:ligatures w14:val="none"/>
         </w:rPr>
-        <w:t>2.5. Design and Implementation Constraints</w:t>
+        <w:t>6.1. Performance  </w:t>
       </w:r>
     </w:p>
     <w:p>
@@ -1951,16 +2864,14 @@
       <w:r>
         <w:rPr>
           <w:rFonts w:ascii="Times New Roman" w:eastAsia="Times New Roman" w:hAnsi="Times New Roman" w:cs="Times New Roman"/>
-          <w:b/>
-          <w:bCs/>
-          <w:color w:val="000000" w:themeColor="text1"/>
-          <w:kern w:val="0"/>
-          <w:sz w:val="20"/>
-          <w:szCs w:val="20"/>
-          <w:lang w:eastAsia="en-GB"/>
-          <w14:ligatures w14:val="none"/>
-        </w:rPr>
-        <w:t>2.6. User Documentation</w:t>
+          <w:color w:val="000000" w:themeColor="text1"/>
+          <w:kern w:val="0"/>
+          <w:sz w:val="20"/>
+          <w:szCs w:val="20"/>
+          <w:lang w:eastAsia="en-GB"/>
+          <w14:ligatures w14:val="none"/>
+        </w:rPr>
+        <w:t>NF-1.1: The system shall process the data from sensors &lt; 3 seconds and send commands to the climate units.</w:t>
       </w:r>
     </w:p>
     <w:p>
@@ -1981,16 +2892,40 @@
       <w:r>
         <w:rPr>
           <w:rFonts w:ascii="Times New Roman" w:eastAsia="Times New Roman" w:hAnsi="Times New Roman" w:cs="Times New Roman"/>
-          <w:b/>
-          <w:bCs/>
-          <w:color w:val="000000" w:themeColor="text1"/>
-          <w:kern w:val="0"/>
-          <w:sz w:val="20"/>
-          <w:szCs w:val="20"/>
-          <w:lang w:eastAsia="en-GB"/>
-          <w14:ligatures w14:val="none"/>
-        </w:rPr>
-        <w:t>2.7. Assumptions and Dependencies</w:t>
+          <w:color w:val="000000" w:themeColor="text1"/>
+          <w:kern w:val="0"/>
+          <w:sz w:val="20"/>
+          <w:szCs w:val="20"/>
+          <w:lang w:eastAsia="en-GB"/>
+          <w14:ligatures w14:val="none"/>
+        </w:rPr>
+        <w:t xml:space="preserve">NF-1.2: The situation of house shall </w:t>
+      </w:r>
+      <w:proofErr w:type="gramStart"/>
+      <w:r>
+        <w:rPr>
+          <w:rFonts w:ascii="Times New Roman" w:eastAsia="Times New Roman" w:hAnsi="Times New Roman" w:cs="Times New Roman"/>
+          <w:color w:val="000000" w:themeColor="text1"/>
+          <w:kern w:val="0"/>
+          <w:sz w:val="20"/>
+          <w:szCs w:val="20"/>
+          <w:lang w:eastAsia="en-GB"/>
+          <w14:ligatures w14:val="none"/>
+        </w:rPr>
+        <w:t>recorded</w:t>
+      </w:r>
+      <w:proofErr w:type="gramEnd"/>
+      <w:r>
+        <w:rPr>
+          <w:rFonts w:ascii="Times New Roman" w:eastAsia="Times New Roman" w:hAnsi="Times New Roman" w:cs="Times New Roman"/>
+          <w:color w:val="000000" w:themeColor="text1"/>
+          <w:kern w:val="0"/>
+          <w:sz w:val="20"/>
+          <w:szCs w:val="20"/>
+          <w:lang w:eastAsia="en-GB"/>
+          <w14:ligatures w14:val="none"/>
+        </w:rPr>
+        <w:t xml:space="preserve"> securely using encryption.</w:t>
       </w:r>
     </w:p>
     <w:p>
@@ -2000,29 +2935,27 @@
         <w:jc w:val="both"/>
         <w:rPr>
           <w:rFonts w:ascii="Times New Roman" w:eastAsia="Times New Roman" w:hAnsi="Times New Roman" w:cs="Times New Roman"/>
-          <w:b/>
-          <w:bCs/>
-          <w:color w:val="000000" w:themeColor="text1"/>
-          <w:kern w:val="0"/>
-          <w:sz w:val="20"/>
-          <w:szCs w:val="20"/>
-          <w:lang w:eastAsia="en-GB"/>
-          <w14:ligatures w14:val="none"/>
-        </w:rPr>
-      </w:pPr>
-      <w:r>
-        <w:rPr>
-          <w:rFonts w:ascii="Times New Roman" w:eastAsia="Times New Roman" w:hAnsi="Times New Roman" w:cs="Times New Roman"/>
-          <w:b/>
-          <w:bCs/>
-          <w:color w:val="000000" w:themeColor="text1"/>
-          <w:kern w:val="0"/>
-          <w:sz w:val="20"/>
-          <w:szCs w:val="20"/>
-          <w:lang w:eastAsia="en-GB"/>
-          <w14:ligatures w14:val="none"/>
-        </w:rPr>
-        <w:t>3. System Features</w:t>
+          <w:color w:val="000000" w:themeColor="text1"/>
+          <w:kern w:val="0"/>
+          <w:sz w:val="20"/>
+          <w:szCs w:val="20"/>
+          <w:lang w:eastAsia="en-GB"/>
+          <w14:ligatures w14:val="none"/>
+        </w:rPr>
+      </w:pPr>
+      <w:r>
+        <w:rPr>
+          <w:rFonts w:ascii="Times New Roman" w:eastAsia="Times New Roman" w:hAnsi="Times New Roman" w:cs="Times New Roman"/>
+          <w:b/>
+          <w:bCs/>
+          <w:color w:val="000000" w:themeColor="text1"/>
+          <w:kern w:val="0"/>
+          <w:sz w:val="20"/>
+          <w:szCs w:val="20"/>
+          <w:lang w:eastAsia="en-GB"/>
+          <w14:ligatures w14:val="none"/>
+        </w:rPr>
+        <w:t>6.2. Security  </w:t>
       </w:r>
     </w:p>
     <w:p>
@@ -2043,376 +2976,40 @@
       <w:r>
         <w:rPr>
           <w:rFonts w:ascii="Times New Roman" w:eastAsia="Times New Roman" w:hAnsi="Times New Roman" w:cs="Times New Roman"/>
-          <w:b/>
-          <w:bCs/>
-          <w:color w:val="000000" w:themeColor="text1"/>
-          <w:kern w:val="0"/>
-          <w:sz w:val="20"/>
-          <w:szCs w:val="20"/>
-          <w:lang w:eastAsia="en-GB"/>
-          <w14:ligatures w14:val="none"/>
-        </w:rPr>
-        <w:t>4. External Interface Requirements</w:t>
-      </w:r>
-    </w:p>
-    <w:p>
-      <w:pPr>
-        <w:shd w:val="clear" w:color="auto" w:fill="FFFFFF"/>
-        <w:spacing w:before="240" w:after="0" w:line="240" w:lineRule="auto"/>
-        <w:jc w:val="both"/>
-        <w:rPr>
-          <w:rFonts w:ascii="Times New Roman" w:eastAsia="Times New Roman" w:hAnsi="Times New Roman" w:cs="Times New Roman"/>
-          <w:color w:val="000000" w:themeColor="text1"/>
-          <w:kern w:val="0"/>
-          <w:sz w:val="20"/>
-          <w:szCs w:val="20"/>
-          <w:lang w:eastAsia="en-GB"/>
-          <w14:ligatures w14:val="none"/>
-        </w:rPr>
-      </w:pPr>
-      <w:r>
-        <w:rPr>
-          <w:rFonts w:ascii="Times New Roman" w:eastAsia="Times New Roman" w:hAnsi="Times New Roman" w:cs="Times New Roman"/>
-          <w:b/>
-          <w:bCs/>
-          <w:color w:val="000000" w:themeColor="text1"/>
-          <w:kern w:val="0"/>
-          <w:sz w:val="20"/>
-          <w:szCs w:val="20"/>
-          <w:lang w:eastAsia="en-GB"/>
-          <w14:ligatures w14:val="none"/>
-        </w:rPr>
-        <w:t>4.1. User Interfaces Overview</w:t>
-      </w:r>
-    </w:p>
-    <w:p>
-      <w:pPr>
-        <w:shd w:val="clear" w:color="auto" w:fill="FFFFFF"/>
-        <w:spacing w:before="240" w:after="0" w:line="240" w:lineRule="auto"/>
-        <w:jc w:val="both"/>
-        <w:rPr>
-          <w:rFonts w:ascii="Times New Roman" w:eastAsia="Times New Roman" w:hAnsi="Times New Roman" w:cs="Times New Roman"/>
-          <w:color w:val="000000" w:themeColor="text1"/>
-          <w:kern w:val="0"/>
-          <w:sz w:val="20"/>
-          <w:szCs w:val="20"/>
-          <w:lang w:eastAsia="en-GB"/>
-          <w14:ligatures w14:val="none"/>
-        </w:rPr>
-      </w:pPr>
-      <w:r>
-        <w:rPr>
-          <w:rFonts w:ascii="Times New Roman" w:eastAsia="Times New Roman" w:hAnsi="Times New Roman" w:cs="Times New Roman"/>
-          <w:b/>
-          <w:bCs/>
-          <w:color w:val="000000" w:themeColor="text1"/>
-          <w:kern w:val="0"/>
-          <w:sz w:val="20"/>
-          <w:szCs w:val="20"/>
-          <w:lang w:eastAsia="en-GB"/>
-          <w14:ligatures w14:val="none"/>
-        </w:rPr>
-        <w:t>4.2. Hardware Interfaces</w:t>
-      </w:r>
-    </w:p>
-    <w:p>
-      <w:pPr>
-        <w:shd w:val="clear" w:color="auto" w:fill="FFFFFF"/>
-        <w:spacing w:before="240" w:after="0" w:line="240" w:lineRule="auto"/>
-        <w:jc w:val="both"/>
-        <w:rPr>
-          <w:rFonts w:ascii="Times New Roman" w:eastAsia="Times New Roman" w:hAnsi="Times New Roman" w:cs="Times New Roman"/>
-          <w:color w:val="000000" w:themeColor="text1"/>
-          <w:kern w:val="0"/>
-          <w:sz w:val="20"/>
-          <w:szCs w:val="20"/>
-          <w:lang w:eastAsia="en-GB"/>
-          <w14:ligatures w14:val="none"/>
-        </w:rPr>
-      </w:pPr>
-      <w:r>
-        <w:rPr>
-          <w:rFonts w:ascii="Times New Roman" w:eastAsia="Times New Roman" w:hAnsi="Times New Roman" w:cs="Times New Roman"/>
-          <w:b/>
-          <w:bCs/>
-          <w:color w:val="000000" w:themeColor="text1"/>
-          <w:kern w:val="0"/>
-          <w:sz w:val="20"/>
-          <w:szCs w:val="20"/>
-          <w:lang w:eastAsia="en-GB"/>
-          <w14:ligatures w14:val="none"/>
-        </w:rPr>
-        <w:t>4.3. Software Interfaces</w:t>
-      </w:r>
-    </w:p>
-    <w:p>
-      <w:pPr>
-        <w:shd w:val="clear" w:color="auto" w:fill="FFFFFF"/>
-        <w:spacing w:before="240" w:after="0" w:line="240" w:lineRule="auto"/>
-        <w:jc w:val="both"/>
-        <w:rPr>
-          <w:rFonts w:ascii="Times New Roman" w:eastAsia="Times New Roman" w:hAnsi="Times New Roman" w:cs="Times New Roman"/>
-          <w:color w:val="000000" w:themeColor="text1"/>
-          <w:kern w:val="0"/>
-          <w:sz w:val="20"/>
-          <w:szCs w:val="20"/>
-          <w:lang w:eastAsia="en-GB"/>
-          <w14:ligatures w14:val="none"/>
-        </w:rPr>
-      </w:pPr>
-      <w:r>
-        <w:rPr>
-          <w:rFonts w:ascii="Times New Roman" w:eastAsia="Times New Roman" w:hAnsi="Times New Roman" w:cs="Times New Roman"/>
-          <w:b/>
-          <w:bCs/>
-          <w:color w:val="000000" w:themeColor="text1"/>
-          <w:kern w:val="0"/>
-          <w:sz w:val="20"/>
-          <w:szCs w:val="20"/>
-          <w:lang w:eastAsia="en-GB"/>
-          <w14:ligatures w14:val="none"/>
-        </w:rPr>
-        <w:t>5. System Features/Modules</w:t>
-      </w:r>
-    </w:p>
-    <w:p>
-      <w:pPr>
-        <w:shd w:val="clear" w:color="auto" w:fill="FFFFFF"/>
-        <w:spacing w:before="240" w:after="0" w:line="240" w:lineRule="auto"/>
-        <w:jc w:val="both"/>
-        <w:rPr>
-          <w:rFonts w:ascii="Times New Roman" w:eastAsia="Times New Roman" w:hAnsi="Times New Roman" w:cs="Times New Roman"/>
-          <w:b/>
-          <w:bCs/>
-          <w:color w:val="000000" w:themeColor="text1"/>
-          <w:kern w:val="0"/>
-          <w:sz w:val="20"/>
-          <w:szCs w:val="20"/>
-          <w:lang w:eastAsia="en-GB"/>
-          <w14:ligatures w14:val="none"/>
-        </w:rPr>
-      </w:pPr>
-      <w:r>
-        <w:rPr>
-          <w:rFonts w:ascii="Times New Roman" w:eastAsia="Times New Roman" w:hAnsi="Times New Roman" w:cs="Times New Roman"/>
-          <w:b/>
-          <w:bCs/>
-          <w:color w:val="000000" w:themeColor="text1"/>
-          <w:kern w:val="0"/>
-          <w:sz w:val="20"/>
-          <w:szCs w:val="20"/>
-          <w:lang w:eastAsia="en-GB"/>
-          <w14:ligatures w14:val="none"/>
-        </w:rPr>
-        <w:t>5.1 System Feature Name</w:t>
-      </w:r>
-    </w:p>
-    <w:p>
-      <w:pPr>
-        <w:shd w:val="clear" w:color="auto" w:fill="FFFFFF"/>
-        <w:spacing w:before="240" w:after="0" w:line="240" w:lineRule="auto"/>
-        <w:jc w:val="both"/>
-        <w:rPr>
-          <w:rFonts w:ascii="Times New Roman" w:eastAsia="Times New Roman" w:hAnsi="Times New Roman" w:cs="Times New Roman"/>
-          <w:color w:val="000000" w:themeColor="text1"/>
-          <w:kern w:val="0"/>
-          <w:sz w:val="20"/>
-          <w:szCs w:val="20"/>
-          <w:lang w:eastAsia="en-GB"/>
-          <w14:ligatures w14:val="none"/>
-        </w:rPr>
-      </w:pPr>
-      <w:r>
-        <w:rPr>
-          <w:rFonts w:ascii="Times New Roman" w:eastAsia="Times New Roman" w:hAnsi="Times New Roman" w:cs="Times New Roman"/>
-          <w:b/>
-          <w:bCs/>
-          <w:color w:val="000000" w:themeColor="text1"/>
-          <w:kern w:val="0"/>
-          <w:sz w:val="20"/>
-          <w:szCs w:val="20"/>
-          <w:lang w:eastAsia="en-GB"/>
-          <w14:ligatures w14:val="none"/>
-        </w:rPr>
-        <w:t>5.1.</w:t>
-      </w:r>
-      <w:r>
-        <w:rPr>
-          <w:rFonts w:ascii="Times New Roman" w:eastAsia="Times New Roman" w:hAnsi="Times New Roman" w:cs="Times New Roman"/>
-          <w:b/>
-          <w:bCs/>
-          <w:color w:val="000000" w:themeColor="text1"/>
-          <w:kern w:val="0"/>
-          <w:sz w:val="20"/>
-          <w:szCs w:val="20"/>
-          <w:lang w:eastAsia="en-GB"/>
-          <w14:ligatures w14:val="none"/>
-        </w:rPr>
-        <w:t>1.</w:t>
-      </w:r>
-      <w:r>
-        <w:rPr>
-          <w:rFonts w:ascii="Times New Roman" w:eastAsia="Times New Roman" w:hAnsi="Times New Roman" w:cs="Times New Roman"/>
-          <w:b/>
-          <w:bCs/>
-          <w:color w:val="000000" w:themeColor="text1"/>
-          <w:kern w:val="0"/>
-          <w:sz w:val="20"/>
-          <w:szCs w:val="20"/>
-          <w:lang w:eastAsia="en-GB"/>
-          <w14:ligatures w14:val="none"/>
-        </w:rPr>
-        <w:t xml:space="preserve"> Description and Priority</w:t>
-      </w:r>
-    </w:p>
-    <w:p>
-      <w:pPr>
-        <w:shd w:val="clear" w:color="auto" w:fill="FFFFFF"/>
-        <w:spacing w:before="240" w:after="0" w:line="240" w:lineRule="auto"/>
-        <w:jc w:val="both"/>
-        <w:rPr>
-          <w:rFonts w:ascii="Times New Roman" w:eastAsia="Times New Roman" w:hAnsi="Times New Roman" w:cs="Times New Roman"/>
-          <w:color w:val="000000" w:themeColor="text1"/>
-          <w:kern w:val="0"/>
-          <w:sz w:val="20"/>
-          <w:szCs w:val="20"/>
-          <w:lang w:eastAsia="en-GB"/>
-          <w14:ligatures w14:val="none"/>
-        </w:rPr>
-      </w:pPr>
-      <w:r>
-        <w:rPr>
-          <w:rFonts w:ascii="Times New Roman" w:eastAsia="Times New Roman" w:hAnsi="Times New Roman" w:cs="Times New Roman"/>
-          <w:b/>
-          <w:bCs/>
-          <w:color w:val="000000" w:themeColor="text1"/>
-          <w:kern w:val="0"/>
-          <w:sz w:val="20"/>
-          <w:szCs w:val="20"/>
-          <w:lang w:eastAsia="en-GB"/>
-          <w14:ligatures w14:val="none"/>
-        </w:rPr>
-        <w:t>5.1.2 Stimulus/Response Sequences</w:t>
-      </w:r>
-    </w:p>
-    <w:p>
-      <w:pPr>
-        <w:shd w:val="clear" w:color="auto" w:fill="FFFFFF"/>
-        <w:spacing w:before="240" w:after="0" w:line="240" w:lineRule="auto"/>
-        <w:jc w:val="both"/>
-        <w:rPr>
-          <w:rFonts w:ascii="Times New Roman" w:eastAsia="Times New Roman" w:hAnsi="Times New Roman" w:cs="Times New Roman"/>
-          <w:color w:val="000000" w:themeColor="text1"/>
-          <w:kern w:val="0"/>
-          <w:sz w:val="20"/>
-          <w:szCs w:val="20"/>
-          <w:lang w:eastAsia="en-GB"/>
-          <w14:ligatures w14:val="none"/>
-        </w:rPr>
-      </w:pPr>
-      <w:r>
-        <w:rPr>
-          <w:rFonts w:ascii="Times New Roman" w:eastAsia="Times New Roman" w:hAnsi="Times New Roman" w:cs="Times New Roman"/>
-          <w:b/>
-          <w:bCs/>
-          <w:color w:val="000000" w:themeColor="text1"/>
-          <w:kern w:val="0"/>
-          <w:sz w:val="20"/>
-          <w:szCs w:val="20"/>
-          <w:lang w:eastAsia="en-GB"/>
-          <w14:ligatures w14:val="none"/>
-        </w:rPr>
-        <w:t>5.1.3 Functional Requirements</w:t>
-      </w:r>
-    </w:p>
-    <w:p>
-      <w:pPr>
-        <w:shd w:val="clear" w:color="auto" w:fill="FFFFFF"/>
-        <w:spacing w:before="240" w:after="0" w:line="240" w:lineRule="auto"/>
-        <w:jc w:val="both"/>
-        <w:rPr>
-          <w:rFonts w:ascii="Times New Roman" w:eastAsia="Times New Roman" w:hAnsi="Times New Roman" w:cs="Times New Roman"/>
-          <w:color w:val="000000" w:themeColor="text1"/>
-          <w:kern w:val="0"/>
-          <w:sz w:val="20"/>
-          <w:szCs w:val="20"/>
-          <w:lang w:eastAsia="en-GB"/>
-          <w14:ligatures w14:val="none"/>
-        </w:rPr>
-      </w:pPr>
-      <w:r>
-        <w:rPr>
-          <w:rFonts w:ascii="Times New Roman" w:eastAsia="Times New Roman" w:hAnsi="Times New Roman" w:cs="Times New Roman"/>
-          <w:b/>
-          <w:bCs/>
-          <w:color w:val="000000" w:themeColor="text1"/>
-          <w:kern w:val="0"/>
-          <w:sz w:val="20"/>
-          <w:szCs w:val="20"/>
-          <w:lang w:eastAsia="en-GB"/>
-          <w14:ligatures w14:val="none"/>
-        </w:rPr>
-        <w:t>6. Nonfunctional Requirements</w:t>
-      </w:r>
-    </w:p>
-    <w:p>
-      <w:pPr>
-        <w:shd w:val="clear" w:color="auto" w:fill="FFFFFF"/>
-        <w:spacing w:before="240" w:after="0" w:line="240" w:lineRule="auto"/>
-        <w:jc w:val="both"/>
-        <w:rPr>
-          <w:rFonts w:ascii="Times New Roman" w:eastAsia="Times New Roman" w:hAnsi="Times New Roman" w:cs="Times New Roman"/>
-          <w:color w:val="000000" w:themeColor="text1"/>
-          <w:kern w:val="0"/>
-          <w:sz w:val="20"/>
-          <w:szCs w:val="20"/>
-          <w:lang w:eastAsia="en-GB"/>
-          <w14:ligatures w14:val="none"/>
-        </w:rPr>
-      </w:pPr>
-      <w:r>
-        <w:rPr>
-          <w:rFonts w:ascii="Times New Roman" w:eastAsia="Times New Roman" w:hAnsi="Times New Roman" w:cs="Times New Roman"/>
-          <w:b/>
-          <w:bCs/>
-          <w:color w:val="000000" w:themeColor="text1"/>
-          <w:kern w:val="0"/>
-          <w:sz w:val="20"/>
-          <w:szCs w:val="20"/>
-          <w:lang w:eastAsia="en-GB"/>
-          <w14:ligatures w14:val="none"/>
-        </w:rPr>
-        <w:t>6.1. Performance  </w:t>
-      </w:r>
-    </w:p>
-    <w:p>
-      <w:pPr>
-        <w:shd w:val="clear" w:color="auto" w:fill="FFFFFF"/>
-        <w:spacing w:before="240" w:after="0" w:line="240" w:lineRule="auto"/>
-        <w:jc w:val="both"/>
-        <w:rPr>
-          <w:rFonts w:ascii="Times New Roman" w:eastAsia="Times New Roman" w:hAnsi="Times New Roman" w:cs="Times New Roman"/>
-          <w:color w:val="000000" w:themeColor="text1"/>
-          <w:kern w:val="0"/>
-          <w:sz w:val="20"/>
-          <w:szCs w:val="20"/>
-          <w:lang w:eastAsia="en-GB"/>
-          <w14:ligatures w14:val="none"/>
-        </w:rPr>
-      </w:pPr>
-      <w:r>
-        <w:rPr>
-          <w:rFonts w:ascii="Times New Roman" w:eastAsia="Times New Roman" w:hAnsi="Times New Roman" w:cs="Times New Roman"/>
-          <w:b/>
-          <w:bCs/>
-          <w:color w:val="000000" w:themeColor="text1"/>
-          <w:kern w:val="0"/>
-          <w:sz w:val="20"/>
-          <w:szCs w:val="20"/>
-          <w:lang w:eastAsia="en-GB"/>
-          <w14:ligatures w14:val="none"/>
-        </w:rPr>
-        <w:t>6.2. Security  </w:t>
+          <w:color w:val="000000" w:themeColor="text1"/>
+          <w:kern w:val="0"/>
+          <w:sz w:val="20"/>
+          <w:szCs w:val="20"/>
+          <w:lang w:eastAsia="en-GB"/>
+          <w14:ligatures w14:val="none"/>
+        </w:rPr>
+        <w:t xml:space="preserve">NF-2.1: The system shall start automatically after the </w:t>
+      </w:r>
+      <w:proofErr w:type="spellStart"/>
+      <w:r>
+        <w:rPr>
+          <w:rFonts w:ascii="Times New Roman" w:eastAsia="Times New Roman" w:hAnsi="Times New Roman" w:cs="Times New Roman"/>
+          <w:color w:val="000000" w:themeColor="text1"/>
+          <w:kern w:val="0"/>
+          <w:sz w:val="20"/>
+          <w:szCs w:val="20"/>
+          <w:lang w:eastAsia="en-GB"/>
+          <w14:ligatures w14:val="none"/>
+        </w:rPr>
+        <w:t>blacouts</w:t>
+      </w:r>
+      <w:proofErr w:type="spellEnd"/>
+      <w:r>
+        <w:rPr>
+          <w:rFonts w:ascii="Times New Roman" w:eastAsia="Times New Roman" w:hAnsi="Times New Roman" w:cs="Times New Roman"/>
+          <w:color w:val="000000" w:themeColor="text1"/>
+          <w:kern w:val="0"/>
+          <w:sz w:val="20"/>
+          <w:szCs w:val="20"/>
+          <w:lang w:eastAsia="en-GB"/>
+          <w14:ligatures w14:val="none"/>
+        </w:rPr>
+        <w:t>.</w:t>
       </w:r>
     </w:p>
     <w:p>

</xml_diff>

<commit_message>
User Class UML Added
</commit_message>
<xml_diff>
--- a/Srs Document/Home Tempature Adjustment System Srs.docx
+++ b/Srs Document/Home Tempature Adjustment System Srs.docx
@@ -1072,7 +1072,6 @@
                 <w14:ligatures w14:val="none"/>
               </w:rPr>
             </w:pPr>
-            <w:proofErr w:type="gramStart"/>
             <w:r>
               <w:rPr>
                 <w:rFonts w:ascii="Times New Roman" w:eastAsia="Times New Roman" w:hAnsi="Times New Roman" w:cs="Times New Roman"/>
@@ -1083,20 +1082,7 @@
                 <w:lang w:eastAsia="en-GB"/>
                 <w14:ligatures w14:val="none"/>
               </w:rPr>
-              <w:t>”Initial</w:t>
-            </w:r>
-            <w:proofErr w:type="gramEnd"/>
-            <w:r>
-              <w:rPr>
-                <w:rFonts w:ascii="Times New Roman" w:eastAsia="Times New Roman" w:hAnsi="Times New Roman" w:cs="Times New Roman"/>
-                <w:color w:val="000000" w:themeColor="text1"/>
-                <w:kern w:val="0"/>
-                <w:sz w:val="16"/>
-                <w:szCs w:val="16"/>
-                <w:lang w:eastAsia="en-GB"/>
-                <w14:ligatures w14:val="none"/>
-              </w:rPr>
-              <w:t xml:space="preserve"> version”</w:t>
+              <w:t>”Initial version”</w:t>
             </w:r>
           </w:p>
         </w:tc>
@@ -1356,6 +1342,191 @@
           </w:p>
         </w:tc>
       </w:tr>
+      <w:tr>
+        <w:trPr>
+          <w:trHeight w:val="836"/>
+        </w:trPr>
+        <w:tc>
+          <w:tcPr>
+            <w:tcW w:w="0" w:type="auto"/>
+            <w:tcBorders>
+              <w:top w:val="single" w:sz="6" w:space="0" w:color="000000"/>
+              <w:left w:val="single" w:sz="6" w:space="0" w:color="000000"/>
+              <w:bottom w:val="single" w:sz="6" w:space="0" w:color="000000"/>
+              <w:right w:val="single" w:sz="6" w:space="0" w:color="000000"/>
+            </w:tcBorders>
+            <w:shd w:val="clear" w:color="auto" w:fill="FFFFFF"/>
+            <w:tcMar>
+              <w:top w:w="108" w:type="dxa"/>
+              <w:left w:w="108" w:type="dxa"/>
+              <w:bottom w:w="108" w:type="dxa"/>
+              <w:right w:w="108" w:type="dxa"/>
+            </w:tcMar>
+            <w:vAlign w:val="center"/>
+          </w:tcPr>
+          <w:p>
+            <w:pPr>
+              <w:spacing w:before="360" w:after="360" w:line="264" w:lineRule="atLeast"/>
+              <w:rPr>
+                <w:rFonts w:ascii="Times New Roman" w:eastAsia="Times New Roman" w:hAnsi="Times New Roman" w:cs="Times New Roman"/>
+                <w:color w:val="000000" w:themeColor="text1"/>
+                <w:kern w:val="0"/>
+                <w:sz w:val="16"/>
+                <w:szCs w:val="16"/>
+                <w:lang w:eastAsia="en-GB"/>
+                <w14:ligatures w14:val="none"/>
+              </w:rPr>
+            </w:pPr>
+            <w:r>
+              <w:rPr>
+                <w:rFonts w:ascii="Times New Roman" w:eastAsia="Times New Roman" w:hAnsi="Times New Roman" w:cs="Times New Roman"/>
+                <w:color w:val="000000" w:themeColor="text1"/>
+                <w:kern w:val="0"/>
+                <w:sz w:val="16"/>
+                <w:szCs w:val="16"/>
+                <w:lang w:eastAsia="en-GB"/>
+                <w14:ligatures w14:val="none"/>
+              </w:rPr>
+              <w:t>Ahmet Talha Sivrikaya</w:t>
+            </w:r>
+          </w:p>
+        </w:tc>
+        <w:tc>
+          <w:tcPr>
+            <w:tcW w:w="0" w:type="auto"/>
+            <w:tcBorders>
+              <w:top w:val="single" w:sz="6" w:space="0" w:color="000000"/>
+              <w:left w:val="single" w:sz="6" w:space="0" w:color="000000"/>
+              <w:bottom w:val="single" w:sz="6" w:space="0" w:color="000000"/>
+              <w:right w:val="single" w:sz="6" w:space="0" w:color="000000"/>
+            </w:tcBorders>
+            <w:shd w:val="clear" w:color="auto" w:fill="FFFFFF"/>
+            <w:tcMar>
+              <w:top w:w="108" w:type="dxa"/>
+              <w:left w:w="108" w:type="dxa"/>
+              <w:bottom w:w="108" w:type="dxa"/>
+              <w:right w:w="108" w:type="dxa"/>
+            </w:tcMar>
+            <w:vAlign w:val="center"/>
+          </w:tcPr>
+          <w:p>
+            <w:pPr>
+              <w:spacing w:before="360" w:after="360" w:line="264" w:lineRule="atLeast"/>
+              <w:rPr>
+                <w:rFonts w:ascii="Times New Roman" w:eastAsia="Times New Roman" w:hAnsi="Times New Roman" w:cs="Times New Roman"/>
+                <w:color w:val="000000" w:themeColor="text1"/>
+                <w:kern w:val="0"/>
+                <w:sz w:val="16"/>
+                <w:szCs w:val="16"/>
+                <w:lang w:eastAsia="en-GB"/>
+                <w14:ligatures w14:val="none"/>
+              </w:rPr>
+            </w:pPr>
+            <w:r>
+              <w:rPr>
+                <w:rFonts w:ascii="Times New Roman" w:eastAsia="Times New Roman" w:hAnsi="Times New Roman" w:cs="Times New Roman"/>
+                <w:color w:val="000000" w:themeColor="text1"/>
+                <w:kern w:val="0"/>
+                <w:sz w:val="16"/>
+                <w:szCs w:val="16"/>
+                <w:lang w:eastAsia="en-GB"/>
+                <w14:ligatures w14:val="none"/>
+              </w:rPr>
+              <w:t>24.04.2026</w:t>
+            </w:r>
+          </w:p>
+        </w:tc>
+        <w:tc>
+          <w:tcPr>
+            <w:tcW w:w="0" w:type="auto"/>
+            <w:tcBorders>
+              <w:top w:val="single" w:sz="6" w:space="0" w:color="000000"/>
+              <w:left w:val="single" w:sz="6" w:space="0" w:color="000000"/>
+              <w:bottom w:val="single" w:sz="6" w:space="0" w:color="000000"/>
+              <w:right w:val="single" w:sz="6" w:space="0" w:color="000000"/>
+            </w:tcBorders>
+            <w:shd w:val="clear" w:color="auto" w:fill="FFFFFF"/>
+            <w:tcMar>
+              <w:top w:w="108" w:type="dxa"/>
+              <w:left w:w="108" w:type="dxa"/>
+              <w:bottom w:w="108" w:type="dxa"/>
+              <w:right w:w="108" w:type="dxa"/>
+            </w:tcMar>
+            <w:vAlign w:val="center"/>
+          </w:tcPr>
+          <w:p>
+            <w:pPr>
+              <w:spacing w:before="360" w:after="360" w:line="264" w:lineRule="atLeast"/>
+              <w:rPr>
+                <w:rFonts w:ascii="Times New Roman" w:eastAsia="Times New Roman" w:hAnsi="Times New Roman" w:cs="Times New Roman"/>
+                <w:color w:val="000000" w:themeColor="text1"/>
+                <w:kern w:val="0"/>
+                <w:sz w:val="16"/>
+                <w:szCs w:val="16"/>
+                <w:lang w:eastAsia="en-GB"/>
+                <w14:ligatures w14:val="none"/>
+              </w:rPr>
+            </w:pPr>
+            <w:r>
+              <w:rPr>
+                <w:rFonts w:ascii="Times New Roman" w:eastAsia="Times New Roman" w:hAnsi="Times New Roman" w:cs="Times New Roman"/>
+                <w:color w:val="000000" w:themeColor="text1"/>
+                <w:kern w:val="0"/>
+                <w:sz w:val="16"/>
+                <w:szCs w:val="16"/>
+                <w:lang w:eastAsia="en-GB"/>
+                <w14:ligatures w14:val="none"/>
+              </w:rPr>
+              <w:t>“User Class UML Diagram Added”</w:t>
+            </w:r>
+          </w:p>
+        </w:tc>
+        <w:tc>
+          <w:tcPr>
+            <w:tcW w:w="0" w:type="auto"/>
+            <w:tcBorders>
+              <w:top w:val="single" w:sz="6" w:space="0" w:color="000000"/>
+              <w:left w:val="single" w:sz="6" w:space="0" w:color="000000"/>
+              <w:bottom w:val="single" w:sz="6" w:space="0" w:color="000000"/>
+              <w:right w:val="single" w:sz="6" w:space="0" w:color="000000"/>
+            </w:tcBorders>
+            <w:shd w:val="clear" w:color="auto" w:fill="FFFFFF"/>
+            <w:tcMar>
+              <w:top w:w="108" w:type="dxa"/>
+              <w:left w:w="108" w:type="dxa"/>
+              <w:bottom w:w="108" w:type="dxa"/>
+              <w:right w:w="108" w:type="dxa"/>
+            </w:tcMar>
+            <w:vAlign w:val="center"/>
+          </w:tcPr>
+          <w:p>
+            <w:pPr>
+              <w:spacing w:before="360" w:after="360" w:line="264" w:lineRule="atLeast"/>
+              <w:rPr>
+                <w:rFonts w:ascii="Times New Roman" w:eastAsia="Times New Roman" w:hAnsi="Times New Roman" w:cs="Times New Roman"/>
+                <w:color w:val="000000" w:themeColor="text1"/>
+                <w:kern w:val="0"/>
+                <w:sz w:val="16"/>
+                <w:szCs w:val="16"/>
+                <w:lang w:eastAsia="en-GB"/>
+                <w14:ligatures w14:val="none"/>
+              </w:rPr>
+            </w:pPr>
+            <w:r>
+              <w:rPr>
+                <w:rFonts w:ascii="Times New Roman" w:eastAsia="Times New Roman" w:hAnsi="Times New Roman" w:cs="Times New Roman"/>
+                <w:color w:val="000000" w:themeColor="text1"/>
+                <w:kern w:val="0"/>
+                <w:sz w:val="16"/>
+                <w:szCs w:val="16"/>
+                <w:lang w:eastAsia="en-GB"/>
+                <w14:ligatures w14:val="none"/>
+              </w:rPr>
+              <w:t>1.2</w:t>
+            </w:r>
+          </w:p>
+        </w:tc>
+      </w:tr>
     </w:tbl>
     <w:p>
       <w:pPr>
@@ -2063,6 +2234,85 @@
       <w:pPr>
         <w:shd w:val="clear" w:color="auto" w:fill="FFFFFF"/>
         <w:spacing w:before="240" w:after="0" w:line="240" w:lineRule="auto"/>
+        <w:rPr>
+          <w:rFonts w:ascii="Times New Roman" w:eastAsia="Times New Roman" w:hAnsi="Times New Roman" w:cs="Times New Roman"/>
+          <w:b/>
+          <w:bCs/>
+          <w:color w:val="000000" w:themeColor="text1"/>
+          <w:kern w:val="0"/>
+          <w:sz w:val="20"/>
+          <w:szCs w:val="20"/>
+          <w:lang w:eastAsia="en-GB"/>
+          <w14:ligatures w14:val="none"/>
+        </w:rPr>
+      </w:pPr>
+      <w:r>
+        <w:rPr>
+          <w:rFonts w:ascii="Times New Roman" w:eastAsia="Times New Roman" w:hAnsi="Times New Roman" w:cs="Times New Roman"/>
+          <w:b/>
+          <w:bCs/>
+          <w:noProof/>
+          <w:color w:val="000000" w:themeColor="text1"/>
+          <w:kern w:val="0"/>
+          <w:sz w:val="20"/>
+          <w:szCs w:val="20"/>
+          <w:lang w:val="tr-TR" w:eastAsia="en-GB"/>
+          <w14:ligatures w14:val="none"/>
+        </w:rPr>
+        <w:drawing>
+          <wp:inline distT="0" distB="0" distL="0" distR="0" wp14:anchorId="637BE7FA" wp14:editId="4254FB94">
+            <wp:extent cx="3970020" cy="2977735"/>
+            <wp:effectExtent l="0" t="0" r="0" b="0"/>
+            <wp:docPr id="925319986" name="Resim 4"/>
+            <wp:cNvGraphicFramePr>
+              <a:graphicFrameLocks xmlns:a="http://schemas.openxmlformats.org/drawingml/2006/main" noChangeAspect="1"/>
+            </wp:cNvGraphicFramePr>
+            <a:graphic xmlns:a="http://schemas.openxmlformats.org/drawingml/2006/main">
+              <a:graphicData uri="http://schemas.openxmlformats.org/drawingml/2006/picture">
+                <pic:pic xmlns:pic="http://schemas.openxmlformats.org/drawingml/2006/picture">
+                  <pic:nvPicPr>
+                    <pic:cNvPr id="0" name="Picture 16"/>
+                    <pic:cNvPicPr>
+                      <a:picLocks noChangeAspect="1" noChangeArrowheads="1"/>
+                    </pic:cNvPicPr>
+                  </pic:nvPicPr>
+                  <pic:blipFill>
+                    <a:blip r:embed="rId5" cstate="print">
+                      <a:extLst>
+                        <a:ext uri="{28A0092B-C50C-407E-A947-70E740481C1C}">
+                          <a14:useLocalDpi xmlns:a14="http://schemas.microsoft.com/office/drawing/2010/main" val="0"/>
+                        </a:ext>
+                      </a:extLst>
+                    </a:blip>
+                    <a:srcRect/>
+                    <a:stretch>
+                      <a:fillRect/>
+                    </a:stretch>
+                  </pic:blipFill>
+                  <pic:spPr bwMode="auto">
+                    <a:xfrm>
+                      <a:off x="0" y="0"/>
+                      <a:ext cx="3973683" cy="2980482"/>
+                    </a:xfrm>
+                    <a:prstGeom prst="rect">
+                      <a:avLst/>
+                    </a:prstGeom>
+                    <a:noFill/>
+                    <a:ln>
+                      <a:noFill/>
+                    </a:ln>
+                  </pic:spPr>
+                </pic:pic>
+              </a:graphicData>
+            </a:graphic>
+          </wp:inline>
+        </w:drawing>
+      </w:r>
+    </w:p>
+    <w:p>
+      <w:pPr>
+        <w:shd w:val="clear" w:color="auto" w:fill="FFFFFF"/>
+        <w:spacing w:before="240" w:after="0" w:line="240" w:lineRule="auto"/>
         <w:jc w:val="both"/>
         <w:rPr>
           <w:rFonts w:ascii="Times New Roman" w:eastAsia="Times New Roman" w:hAnsi="Times New Roman" w:cs="Times New Roman"/>
@@ -2208,6 +2458,7 @@
           <w:lang w:eastAsia="en-GB"/>
           <w14:ligatures w14:val="none"/>
         </w:rPr>
+        <w:lastRenderedPageBreak/>
         <w:t>3. System Features</w:t>
       </w:r>
     </w:p>
@@ -2600,7 +2851,6 @@
           <w:lang w:eastAsia="en-GB"/>
           <w14:ligatures w14:val="none"/>
         </w:rPr>
-        <w:lastRenderedPageBreak/>
         <w:t>5.1.3 Functional Requirements</w:t>
       </w:r>
     </w:p>
@@ -2657,33 +2907,7 @@
           <w:lang w:eastAsia="en-GB"/>
           <w14:ligatures w14:val="none"/>
         </w:rPr>
-        <w:t xml:space="preserve">REQ-1.2: When human count in house is zero system, shall turn of the </w:t>
-      </w:r>
-      <w:proofErr w:type="gramStart"/>
-      <w:r>
-        <w:rPr>
-          <w:rFonts w:ascii="Times New Roman" w:eastAsia="Times New Roman" w:hAnsi="Times New Roman" w:cs="Times New Roman"/>
-          <w:color w:val="000000" w:themeColor="text1"/>
-          <w:kern w:val="0"/>
-          <w:sz w:val="20"/>
-          <w:szCs w:val="20"/>
-          <w:lang w:eastAsia="en-GB"/>
-          <w14:ligatures w14:val="none"/>
-        </w:rPr>
-        <w:t>all climate</w:t>
-      </w:r>
-      <w:proofErr w:type="gramEnd"/>
-      <w:r>
-        <w:rPr>
-          <w:rFonts w:ascii="Times New Roman" w:eastAsia="Times New Roman" w:hAnsi="Times New Roman" w:cs="Times New Roman"/>
-          <w:color w:val="000000" w:themeColor="text1"/>
-          <w:kern w:val="0"/>
-          <w:sz w:val="20"/>
-          <w:szCs w:val="20"/>
-          <w:lang w:eastAsia="en-GB"/>
-          <w14:ligatures w14:val="none"/>
-        </w:rPr>
-        <w:t xml:space="preserve"> units </w:t>
+        <w:t xml:space="preserve">REQ-1.2: When human count in house is zero system, shall turn of the all climate units </w:t>
       </w:r>
     </w:p>
     <w:p>
@@ -2899,33 +3123,7 @@
           <w:lang w:eastAsia="en-GB"/>
           <w14:ligatures w14:val="none"/>
         </w:rPr>
-        <w:t xml:space="preserve">NF-1.2: The situation of house shall </w:t>
-      </w:r>
-      <w:proofErr w:type="gramStart"/>
-      <w:r>
-        <w:rPr>
-          <w:rFonts w:ascii="Times New Roman" w:eastAsia="Times New Roman" w:hAnsi="Times New Roman" w:cs="Times New Roman"/>
-          <w:color w:val="000000" w:themeColor="text1"/>
-          <w:kern w:val="0"/>
-          <w:sz w:val="20"/>
-          <w:szCs w:val="20"/>
-          <w:lang w:eastAsia="en-GB"/>
-          <w14:ligatures w14:val="none"/>
-        </w:rPr>
-        <w:t>recorded</w:t>
-      </w:r>
-      <w:proofErr w:type="gramEnd"/>
-      <w:r>
-        <w:rPr>
-          <w:rFonts w:ascii="Times New Roman" w:eastAsia="Times New Roman" w:hAnsi="Times New Roman" w:cs="Times New Roman"/>
-          <w:color w:val="000000" w:themeColor="text1"/>
-          <w:kern w:val="0"/>
-          <w:sz w:val="20"/>
-          <w:szCs w:val="20"/>
-          <w:lang w:eastAsia="en-GB"/>
-          <w14:ligatures w14:val="none"/>
-        </w:rPr>
-        <w:t xml:space="preserve"> securely using encryption.</w:t>
+        <w:t>NF-1.2: The situation of house shall recorded securely using encryption.</w:t>
       </w:r>
     </w:p>
     <w:p>
@@ -2983,33 +3181,7 @@
           <w:lang w:eastAsia="en-GB"/>
           <w14:ligatures w14:val="none"/>
         </w:rPr>
-        <w:t xml:space="preserve">NF-2.1: The system shall start automatically after the </w:t>
-      </w:r>
-      <w:proofErr w:type="spellStart"/>
-      <w:r>
-        <w:rPr>
-          <w:rFonts w:ascii="Times New Roman" w:eastAsia="Times New Roman" w:hAnsi="Times New Roman" w:cs="Times New Roman"/>
-          <w:color w:val="000000" w:themeColor="text1"/>
-          <w:kern w:val="0"/>
-          <w:sz w:val="20"/>
-          <w:szCs w:val="20"/>
-          <w:lang w:eastAsia="en-GB"/>
-          <w14:ligatures w14:val="none"/>
-        </w:rPr>
-        <w:t>blacouts</w:t>
-      </w:r>
-      <w:proofErr w:type="spellEnd"/>
-      <w:r>
-        <w:rPr>
-          <w:rFonts w:ascii="Times New Roman" w:eastAsia="Times New Roman" w:hAnsi="Times New Roman" w:cs="Times New Roman"/>
-          <w:color w:val="000000" w:themeColor="text1"/>
-          <w:kern w:val="0"/>
-          <w:sz w:val="20"/>
-          <w:szCs w:val="20"/>
-          <w:lang w:eastAsia="en-GB"/>
-          <w14:ligatures w14:val="none"/>
-        </w:rPr>
-        <w:t>.</w:t>
+        <w:t>NF-2.1: The system shall start automatically after the blacouts.</w:t>
       </w:r>
     </w:p>
     <w:p>

</xml_diff>

<commit_message>
UML Class Diagram Added
</commit_message>
<xml_diff>
--- a/Srs Document/Home Tempature Adjustment System Srs.docx
+++ b/Srs Document/Home Tempature Adjustment System Srs.docx
@@ -1527,6 +1527,191 @@
           </w:p>
         </w:tc>
       </w:tr>
+      <w:tr>
+        <w:trPr>
+          <w:trHeight w:val="836"/>
+        </w:trPr>
+        <w:tc>
+          <w:tcPr>
+            <w:tcW w:w="0" w:type="auto"/>
+            <w:tcBorders>
+              <w:top w:val="single" w:sz="6" w:space="0" w:color="000000"/>
+              <w:left w:val="single" w:sz="6" w:space="0" w:color="000000"/>
+              <w:bottom w:val="single" w:sz="6" w:space="0" w:color="000000"/>
+              <w:right w:val="single" w:sz="6" w:space="0" w:color="000000"/>
+            </w:tcBorders>
+            <w:shd w:val="clear" w:color="auto" w:fill="FFFFFF"/>
+            <w:tcMar>
+              <w:top w:w="108" w:type="dxa"/>
+              <w:left w:w="108" w:type="dxa"/>
+              <w:bottom w:w="108" w:type="dxa"/>
+              <w:right w:w="108" w:type="dxa"/>
+            </w:tcMar>
+            <w:vAlign w:val="center"/>
+          </w:tcPr>
+          <w:p>
+            <w:pPr>
+              <w:spacing w:before="360" w:after="360" w:line="264" w:lineRule="atLeast"/>
+              <w:rPr>
+                <w:rFonts w:ascii="Times New Roman" w:eastAsia="Times New Roman" w:hAnsi="Times New Roman" w:cs="Times New Roman"/>
+                <w:color w:val="000000" w:themeColor="text1"/>
+                <w:kern w:val="0"/>
+                <w:sz w:val="16"/>
+                <w:szCs w:val="16"/>
+                <w:lang w:eastAsia="en-GB"/>
+                <w14:ligatures w14:val="none"/>
+              </w:rPr>
+            </w:pPr>
+            <w:r>
+              <w:rPr>
+                <w:rFonts w:ascii="Times New Roman" w:eastAsia="Times New Roman" w:hAnsi="Times New Roman" w:cs="Times New Roman"/>
+                <w:color w:val="000000" w:themeColor="text1"/>
+                <w:kern w:val="0"/>
+                <w:sz w:val="16"/>
+                <w:szCs w:val="16"/>
+                <w:lang w:eastAsia="en-GB"/>
+                <w14:ligatures w14:val="none"/>
+              </w:rPr>
+              <w:t>Ahmet Talha Sivrikaya</w:t>
+            </w:r>
+          </w:p>
+        </w:tc>
+        <w:tc>
+          <w:tcPr>
+            <w:tcW w:w="0" w:type="auto"/>
+            <w:tcBorders>
+              <w:top w:val="single" w:sz="6" w:space="0" w:color="000000"/>
+              <w:left w:val="single" w:sz="6" w:space="0" w:color="000000"/>
+              <w:bottom w:val="single" w:sz="6" w:space="0" w:color="000000"/>
+              <w:right w:val="single" w:sz="6" w:space="0" w:color="000000"/>
+            </w:tcBorders>
+            <w:shd w:val="clear" w:color="auto" w:fill="FFFFFF"/>
+            <w:tcMar>
+              <w:top w:w="108" w:type="dxa"/>
+              <w:left w:w="108" w:type="dxa"/>
+              <w:bottom w:w="108" w:type="dxa"/>
+              <w:right w:w="108" w:type="dxa"/>
+            </w:tcMar>
+            <w:vAlign w:val="center"/>
+          </w:tcPr>
+          <w:p>
+            <w:pPr>
+              <w:spacing w:before="360" w:after="360" w:line="264" w:lineRule="atLeast"/>
+              <w:rPr>
+                <w:rFonts w:ascii="Times New Roman" w:eastAsia="Times New Roman" w:hAnsi="Times New Roman" w:cs="Times New Roman"/>
+                <w:color w:val="000000" w:themeColor="text1"/>
+                <w:kern w:val="0"/>
+                <w:sz w:val="16"/>
+                <w:szCs w:val="16"/>
+                <w:lang w:eastAsia="en-GB"/>
+                <w14:ligatures w14:val="none"/>
+              </w:rPr>
+            </w:pPr>
+            <w:r>
+              <w:rPr>
+                <w:rFonts w:ascii="Times New Roman" w:eastAsia="Times New Roman" w:hAnsi="Times New Roman" w:cs="Times New Roman"/>
+                <w:color w:val="000000" w:themeColor="text1"/>
+                <w:kern w:val="0"/>
+                <w:sz w:val="16"/>
+                <w:szCs w:val="16"/>
+                <w:lang w:eastAsia="en-GB"/>
+                <w14:ligatures w14:val="none"/>
+              </w:rPr>
+              <w:t>24.04.2026</w:t>
+            </w:r>
+          </w:p>
+        </w:tc>
+        <w:tc>
+          <w:tcPr>
+            <w:tcW w:w="0" w:type="auto"/>
+            <w:tcBorders>
+              <w:top w:val="single" w:sz="6" w:space="0" w:color="000000"/>
+              <w:left w:val="single" w:sz="6" w:space="0" w:color="000000"/>
+              <w:bottom w:val="single" w:sz="6" w:space="0" w:color="000000"/>
+              <w:right w:val="single" w:sz="6" w:space="0" w:color="000000"/>
+            </w:tcBorders>
+            <w:shd w:val="clear" w:color="auto" w:fill="FFFFFF"/>
+            <w:tcMar>
+              <w:top w:w="108" w:type="dxa"/>
+              <w:left w:w="108" w:type="dxa"/>
+              <w:bottom w:w="108" w:type="dxa"/>
+              <w:right w:w="108" w:type="dxa"/>
+            </w:tcMar>
+            <w:vAlign w:val="center"/>
+          </w:tcPr>
+          <w:p>
+            <w:pPr>
+              <w:spacing w:before="360" w:after="360" w:line="264" w:lineRule="atLeast"/>
+              <w:rPr>
+                <w:rFonts w:ascii="Times New Roman" w:eastAsia="Times New Roman" w:hAnsi="Times New Roman" w:cs="Times New Roman"/>
+                <w:color w:val="000000" w:themeColor="text1"/>
+                <w:kern w:val="0"/>
+                <w:sz w:val="16"/>
+                <w:szCs w:val="16"/>
+                <w:lang w:eastAsia="en-GB"/>
+                <w14:ligatures w14:val="none"/>
+              </w:rPr>
+            </w:pPr>
+            <w:r>
+              <w:rPr>
+                <w:rFonts w:ascii="Times New Roman" w:eastAsia="Times New Roman" w:hAnsi="Times New Roman" w:cs="Times New Roman"/>
+                <w:color w:val="000000" w:themeColor="text1"/>
+                <w:kern w:val="0"/>
+                <w:sz w:val="16"/>
+                <w:szCs w:val="16"/>
+                <w:lang w:eastAsia="en-GB"/>
+                <w14:ligatures w14:val="none"/>
+              </w:rPr>
+              <w:t>“UML Class Diagram Added”</w:t>
+            </w:r>
+          </w:p>
+        </w:tc>
+        <w:tc>
+          <w:tcPr>
+            <w:tcW w:w="0" w:type="auto"/>
+            <w:tcBorders>
+              <w:top w:val="single" w:sz="6" w:space="0" w:color="000000"/>
+              <w:left w:val="single" w:sz="6" w:space="0" w:color="000000"/>
+              <w:bottom w:val="single" w:sz="6" w:space="0" w:color="000000"/>
+              <w:right w:val="single" w:sz="6" w:space="0" w:color="000000"/>
+            </w:tcBorders>
+            <w:shd w:val="clear" w:color="auto" w:fill="FFFFFF"/>
+            <w:tcMar>
+              <w:top w:w="108" w:type="dxa"/>
+              <w:left w:w="108" w:type="dxa"/>
+              <w:bottom w:w="108" w:type="dxa"/>
+              <w:right w:w="108" w:type="dxa"/>
+            </w:tcMar>
+            <w:vAlign w:val="center"/>
+          </w:tcPr>
+          <w:p>
+            <w:pPr>
+              <w:spacing w:before="360" w:after="360" w:line="264" w:lineRule="atLeast"/>
+              <w:rPr>
+                <w:rFonts w:ascii="Times New Roman" w:eastAsia="Times New Roman" w:hAnsi="Times New Roman" w:cs="Times New Roman"/>
+                <w:color w:val="000000" w:themeColor="text1"/>
+                <w:kern w:val="0"/>
+                <w:sz w:val="16"/>
+                <w:szCs w:val="16"/>
+                <w:lang w:eastAsia="en-GB"/>
+                <w14:ligatures w14:val="none"/>
+              </w:rPr>
+            </w:pPr>
+            <w:r>
+              <w:rPr>
+                <w:rFonts w:ascii="Times New Roman" w:eastAsia="Times New Roman" w:hAnsi="Times New Roman" w:cs="Times New Roman"/>
+                <w:color w:val="000000" w:themeColor="text1"/>
+                <w:kern w:val="0"/>
+                <w:sz w:val="16"/>
+                <w:szCs w:val="16"/>
+                <w:lang w:eastAsia="en-GB"/>
+                <w14:ligatures w14:val="none"/>
+              </w:rPr>
+              <w:t>1.3</w:t>
+            </w:r>
+          </w:p>
+        </w:tc>
+      </w:tr>
     </w:tbl>
     <w:p>
       <w:pPr>
@@ -2158,6 +2343,78 @@
       <w:pPr>
         <w:shd w:val="clear" w:color="auto" w:fill="FFFFFF"/>
         <w:spacing w:before="240" w:after="0" w:line="240" w:lineRule="auto"/>
+        <w:jc w:val="both"/>
+        <w:rPr>
+          <w:rFonts w:ascii="Times New Roman" w:eastAsia="Times New Roman" w:hAnsi="Times New Roman" w:cs="Times New Roman"/>
+          <w:b/>
+          <w:bCs/>
+          <w:color w:val="000000" w:themeColor="text1"/>
+          <w:kern w:val="0"/>
+          <w:sz w:val="20"/>
+          <w:szCs w:val="20"/>
+          <w:lang w:eastAsia="en-GB"/>
+          <w14:ligatures w14:val="none"/>
+        </w:rPr>
+      </w:pPr>
+      <w:r>
+        <w:rPr>
+          <w:rFonts w:ascii="Times New Roman" w:hAnsi="Times New Roman" w:cs="Times New Roman"/>
+          <w:noProof/>
+        </w:rPr>
+        <w:drawing>
+          <wp:inline distT="0" distB="0" distL="0" distR="0" wp14:anchorId="06EBEC48" wp14:editId="279FAD77">
+            <wp:extent cx="5731510" cy="2962275"/>
+            <wp:effectExtent l="0" t="0" r="0" b="0"/>
+            <wp:docPr id="1021091481" name="Resim 1"/>
+            <wp:cNvGraphicFramePr>
+              <a:graphicFrameLocks xmlns:a="http://schemas.openxmlformats.org/drawingml/2006/main" noChangeAspect="1"/>
+            </wp:cNvGraphicFramePr>
+            <a:graphic xmlns:a="http://schemas.openxmlformats.org/drawingml/2006/main">
+              <a:graphicData uri="http://schemas.openxmlformats.org/drawingml/2006/picture">
+                <pic:pic xmlns:pic="http://schemas.openxmlformats.org/drawingml/2006/picture">
+                  <pic:nvPicPr>
+                    <pic:cNvPr id="0" name="Picture 1"/>
+                    <pic:cNvPicPr>
+                      <a:picLocks noChangeAspect="1" noChangeArrowheads="1"/>
+                    </pic:cNvPicPr>
+                  </pic:nvPicPr>
+                  <pic:blipFill>
+                    <a:blip r:embed="rId5" cstate="print">
+                      <a:extLst>
+                        <a:ext uri="{28A0092B-C50C-407E-A947-70E740481C1C}">
+                          <a14:useLocalDpi xmlns:a14="http://schemas.microsoft.com/office/drawing/2010/main" val="0"/>
+                        </a:ext>
+                      </a:extLst>
+                    </a:blip>
+                    <a:srcRect/>
+                    <a:stretch>
+                      <a:fillRect/>
+                    </a:stretch>
+                  </pic:blipFill>
+                  <pic:spPr bwMode="auto">
+                    <a:xfrm>
+                      <a:off x="0" y="0"/>
+                      <a:ext cx="5731510" cy="2962275"/>
+                    </a:xfrm>
+                    <a:prstGeom prst="rect">
+                      <a:avLst/>
+                    </a:prstGeom>
+                    <a:noFill/>
+                    <a:ln>
+                      <a:noFill/>
+                    </a:ln>
+                  </pic:spPr>
+                </pic:pic>
+              </a:graphicData>
+            </a:graphic>
+          </wp:inline>
+        </w:drawing>
+      </w:r>
+    </w:p>
+    <w:p>
+      <w:pPr>
+        <w:shd w:val="clear" w:color="auto" w:fill="FFFFFF"/>
+        <w:spacing w:before="240" w:after="0" w:line="240" w:lineRule="auto"/>
         <w:rPr>
           <w:rFonts w:ascii="Times New Roman" w:eastAsia="Times New Roman" w:hAnsi="Times New Roman" w:cs="Times New Roman"/>
           <w:b/>
@@ -2259,6 +2516,7 @@
           <w:lang w:val="tr-TR" w:eastAsia="en-GB"/>
           <w14:ligatures w14:val="none"/>
         </w:rPr>
+        <w:lastRenderedPageBreak/>
         <w:drawing>
           <wp:inline distT="0" distB="0" distL="0" distR="0" wp14:anchorId="637BE7FA" wp14:editId="4254FB94">
             <wp:extent cx="3970020" cy="2977735"/>
@@ -2277,7 +2535,7 @@
                     </pic:cNvPicPr>
                   </pic:nvPicPr>
                   <pic:blipFill>
-                    <a:blip r:embed="rId5" cstate="print">
+                    <a:blip r:embed="rId6" cstate="print">
                       <a:extLst>
                         <a:ext uri="{28A0092B-C50C-407E-A947-70E740481C1C}">
                           <a14:useLocalDpi xmlns:a14="http://schemas.microsoft.com/office/drawing/2010/main" val="0"/>
@@ -2458,8 +2716,428 @@
           <w:lang w:eastAsia="en-GB"/>
           <w14:ligatures w14:val="none"/>
         </w:rPr>
+        <w:t>3. System Features</w:t>
+      </w:r>
+    </w:p>
+    <w:p>
+      <w:pPr>
+        <w:shd w:val="clear" w:color="auto" w:fill="FFFFFF"/>
+        <w:spacing w:before="240" w:after="0" w:line="240" w:lineRule="auto"/>
+        <w:jc w:val="both"/>
+        <w:rPr>
+          <w:rFonts w:ascii="Times New Roman" w:eastAsia="Times New Roman" w:hAnsi="Times New Roman" w:cs="Times New Roman"/>
+          <w:color w:val="000000" w:themeColor="text1"/>
+          <w:kern w:val="0"/>
+          <w:sz w:val="20"/>
+          <w:szCs w:val="20"/>
+          <w:lang w:eastAsia="en-GB"/>
+          <w14:ligatures w14:val="none"/>
+        </w:rPr>
+      </w:pPr>
+      <w:r>
+        <w:rPr>
+          <w:rFonts w:ascii="Times New Roman" w:eastAsia="Times New Roman" w:hAnsi="Times New Roman" w:cs="Times New Roman"/>
+          <w:b/>
+          <w:bCs/>
+          <w:color w:val="000000" w:themeColor="text1"/>
+          <w:kern w:val="0"/>
+          <w:sz w:val="20"/>
+          <w:szCs w:val="20"/>
+          <w:lang w:eastAsia="en-GB"/>
+          <w14:ligatures w14:val="none"/>
+        </w:rPr>
+        <w:t>4. External Interface Requirements</w:t>
+      </w:r>
+    </w:p>
+    <w:p>
+      <w:pPr>
+        <w:shd w:val="clear" w:color="auto" w:fill="FFFFFF"/>
+        <w:spacing w:before="240" w:after="0" w:line="240" w:lineRule="auto"/>
+        <w:jc w:val="both"/>
+        <w:rPr>
+          <w:rFonts w:ascii="Times New Roman" w:eastAsia="Times New Roman" w:hAnsi="Times New Roman" w:cs="Times New Roman"/>
+          <w:color w:val="000000" w:themeColor="text1"/>
+          <w:kern w:val="0"/>
+          <w:sz w:val="20"/>
+          <w:szCs w:val="20"/>
+          <w:lang w:eastAsia="en-GB"/>
+          <w14:ligatures w14:val="none"/>
+        </w:rPr>
+      </w:pPr>
+      <w:r>
+        <w:rPr>
+          <w:rFonts w:ascii="Times New Roman" w:eastAsia="Times New Roman" w:hAnsi="Times New Roman" w:cs="Times New Roman"/>
+          <w:b/>
+          <w:bCs/>
+          <w:color w:val="000000" w:themeColor="text1"/>
+          <w:kern w:val="0"/>
+          <w:sz w:val="20"/>
+          <w:szCs w:val="20"/>
+          <w:lang w:eastAsia="en-GB"/>
+          <w14:ligatures w14:val="none"/>
+        </w:rPr>
+        <w:t>4.1. User Interfaces Overview</w:t>
+      </w:r>
+    </w:p>
+    <w:p>
+      <w:pPr>
+        <w:shd w:val="clear" w:color="auto" w:fill="FFFFFF"/>
+        <w:spacing w:before="240" w:after="0" w:line="240" w:lineRule="auto"/>
+        <w:jc w:val="both"/>
+        <w:rPr>
+          <w:rFonts w:ascii="Times New Roman" w:eastAsia="Times New Roman" w:hAnsi="Times New Roman" w:cs="Times New Roman"/>
+          <w:color w:val="000000" w:themeColor="text1"/>
+          <w:kern w:val="0"/>
+          <w:sz w:val="20"/>
+          <w:szCs w:val="20"/>
+          <w:lang w:eastAsia="en-GB"/>
+          <w14:ligatures w14:val="none"/>
+        </w:rPr>
+      </w:pPr>
+      <w:r>
+        <w:rPr>
+          <w:rFonts w:ascii="Times New Roman" w:eastAsia="Times New Roman" w:hAnsi="Times New Roman" w:cs="Times New Roman"/>
+          <w:b/>
+          <w:bCs/>
+          <w:color w:val="000000" w:themeColor="text1"/>
+          <w:kern w:val="0"/>
+          <w:sz w:val="20"/>
+          <w:szCs w:val="20"/>
+          <w:lang w:eastAsia="en-GB"/>
+          <w14:ligatures w14:val="none"/>
+        </w:rPr>
+        <w:t>4.2. Hardware Interfaces</w:t>
+      </w:r>
+    </w:p>
+    <w:p>
+      <w:pPr>
+        <w:shd w:val="clear" w:color="auto" w:fill="FFFFFF"/>
+        <w:spacing w:before="240" w:after="0" w:line="240" w:lineRule="auto"/>
+        <w:jc w:val="both"/>
+        <w:rPr>
+          <w:rFonts w:ascii="Times New Roman" w:eastAsia="Times New Roman" w:hAnsi="Times New Roman" w:cs="Times New Roman"/>
+          <w:color w:val="000000" w:themeColor="text1"/>
+          <w:kern w:val="0"/>
+          <w:sz w:val="20"/>
+          <w:szCs w:val="20"/>
+          <w:lang w:eastAsia="en-GB"/>
+          <w14:ligatures w14:val="none"/>
+        </w:rPr>
+      </w:pPr>
+      <w:r>
+        <w:rPr>
+          <w:rFonts w:ascii="Times New Roman" w:eastAsia="Times New Roman" w:hAnsi="Times New Roman" w:cs="Times New Roman"/>
+          <w:b/>
+          <w:bCs/>
+          <w:color w:val="000000" w:themeColor="text1"/>
+          <w:kern w:val="0"/>
+          <w:sz w:val="20"/>
+          <w:szCs w:val="20"/>
+          <w:lang w:eastAsia="en-GB"/>
+          <w14:ligatures w14:val="none"/>
+        </w:rPr>
+        <w:t>4.3. Software Interfaces</w:t>
+      </w:r>
+    </w:p>
+    <w:p>
+      <w:pPr>
+        <w:shd w:val="clear" w:color="auto" w:fill="FFFFFF"/>
+        <w:spacing w:before="240" w:after="0" w:line="240" w:lineRule="auto"/>
+        <w:jc w:val="both"/>
+        <w:rPr>
+          <w:rFonts w:ascii="Times New Roman" w:eastAsia="Times New Roman" w:hAnsi="Times New Roman" w:cs="Times New Roman"/>
+          <w:color w:val="000000" w:themeColor="text1"/>
+          <w:kern w:val="0"/>
+          <w:sz w:val="20"/>
+          <w:szCs w:val="20"/>
+          <w:lang w:eastAsia="en-GB"/>
+          <w14:ligatures w14:val="none"/>
+        </w:rPr>
+      </w:pPr>
+      <w:r>
+        <w:rPr>
+          <w:rFonts w:ascii="Times New Roman" w:eastAsia="Times New Roman" w:hAnsi="Times New Roman" w:cs="Times New Roman"/>
+          <w:b/>
+          <w:bCs/>
+          <w:color w:val="000000" w:themeColor="text1"/>
+          <w:kern w:val="0"/>
+          <w:sz w:val="20"/>
+          <w:szCs w:val="20"/>
+          <w:lang w:eastAsia="en-GB"/>
+          <w14:ligatures w14:val="none"/>
+        </w:rPr>
+        <w:t>5. System Features/Modules</w:t>
+      </w:r>
+    </w:p>
+    <w:p>
+      <w:pPr>
+        <w:shd w:val="clear" w:color="auto" w:fill="FFFFFF"/>
+        <w:spacing w:before="240" w:after="0" w:line="240" w:lineRule="auto"/>
+        <w:jc w:val="both"/>
+        <w:rPr>
+          <w:rFonts w:ascii="Times New Roman" w:eastAsia="Times New Roman" w:hAnsi="Times New Roman" w:cs="Times New Roman"/>
+          <w:b/>
+          <w:bCs/>
+          <w:color w:val="000000" w:themeColor="text1"/>
+          <w:kern w:val="0"/>
+          <w:sz w:val="20"/>
+          <w:szCs w:val="20"/>
+          <w:lang w:eastAsia="en-GB"/>
+          <w14:ligatures w14:val="none"/>
+        </w:rPr>
+      </w:pPr>
+      <w:r>
+        <w:rPr>
+          <w:rFonts w:ascii="Times New Roman" w:eastAsia="Times New Roman" w:hAnsi="Times New Roman" w:cs="Times New Roman"/>
+          <w:b/>
+          <w:bCs/>
+          <w:color w:val="000000" w:themeColor="text1"/>
+          <w:kern w:val="0"/>
+          <w:sz w:val="20"/>
+          <w:szCs w:val="20"/>
+          <w:lang w:eastAsia="en-GB"/>
+          <w14:ligatures w14:val="none"/>
+        </w:rPr>
+        <w:t>5.1 System Feature Name</w:t>
+      </w:r>
+    </w:p>
+    <w:p>
+      <w:pPr>
+        <w:shd w:val="clear" w:color="auto" w:fill="FFFFFF"/>
+        <w:spacing w:before="240" w:after="0" w:line="240" w:lineRule="auto"/>
+        <w:jc w:val="both"/>
+        <w:rPr>
+          <w:rFonts w:ascii="Times New Roman" w:eastAsia="Times New Roman" w:hAnsi="Times New Roman" w:cs="Times New Roman"/>
+          <w:color w:val="000000" w:themeColor="text1"/>
+          <w:kern w:val="0"/>
+          <w:sz w:val="20"/>
+          <w:szCs w:val="20"/>
+          <w:lang w:eastAsia="en-GB"/>
+          <w14:ligatures w14:val="none"/>
+        </w:rPr>
+      </w:pPr>
+      <w:r>
+        <w:rPr>
+          <w:rFonts w:ascii="Times New Roman" w:eastAsia="Times New Roman" w:hAnsi="Times New Roman" w:cs="Times New Roman"/>
+          <w:b/>
+          <w:bCs/>
+          <w:color w:val="000000" w:themeColor="text1"/>
+          <w:kern w:val="0"/>
+          <w:sz w:val="20"/>
+          <w:szCs w:val="20"/>
+          <w:lang w:eastAsia="en-GB"/>
+          <w14:ligatures w14:val="none"/>
+        </w:rPr>
+        <w:t>5.1.</w:t>
+      </w:r>
+      <w:r>
+        <w:rPr>
+          <w:rFonts w:ascii="Times New Roman" w:eastAsia="Times New Roman" w:hAnsi="Times New Roman" w:cs="Times New Roman"/>
+          <w:b/>
+          <w:bCs/>
+          <w:color w:val="000000" w:themeColor="text1"/>
+          <w:kern w:val="0"/>
+          <w:sz w:val="20"/>
+          <w:szCs w:val="20"/>
+          <w:lang w:eastAsia="en-GB"/>
+          <w14:ligatures w14:val="none"/>
+        </w:rPr>
+        <w:t>1.</w:t>
+      </w:r>
+      <w:r>
+        <w:rPr>
+          <w:rFonts w:ascii="Times New Roman" w:eastAsia="Times New Roman" w:hAnsi="Times New Roman" w:cs="Times New Roman"/>
+          <w:b/>
+          <w:bCs/>
+          <w:color w:val="000000" w:themeColor="text1"/>
+          <w:kern w:val="0"/>
+          <w:sz w:val="20"/>
+          <w:szCs w:val="20"/>
+          <w:lang w:eastAsia="en-GB"/>
+          <w14:ligatures w14:val="none"/>
+        </w:rPr>
+        <w:t xml:space="preserve"> Description and Priority</w:t>
+      </w:r>
+    </w:p>
+    <w:p>
+      <w:pPr>
+        <w:shd w:val="clear" w:color="auto" w:fill="FFFFFF"/>
+        <w:spacing w:before="240" w:after="0" w:line="240" w:lineRule="auto"/>
+        <w:jc w:val="both"/>
+        <w:rPr>
+          <w:rFonts w:ascii="Times New Roman" w:eastAsia="Times New Roman" w:hAnsi="Times New Roman" w:cs="Times New Roman"/>
+          <w:color w:val="000000" w:themeColor="text1"/>
+          <w:kern w:val="0"/>
+          <w:sz w:val="20"/>
+          <w:szCs w:val="20"/>
+          <w:lang w:eastAsia="en-GB"/>
+          <w14:ligatures w14:val="none"/>
+        </w:rPr>
+      </w:pPr>
+      <w:r>
+        <w:rPr>
+          <w:rFonts w:ascii="Times New Roman" w:eastAsia="Times New Roman" w:hAnsi="Times New Roman" w:cs="Times New Roman"/>
+          <w:b/>
+          <w:bCs/>
+          <w:color w:val="000000" w:themeColor="text1"/>
+          <w:kern w:val="0"/>
+          <w:sz w:val="20"/>
+          <w:szCs w:val="20"/>
+          <w:lang w:eastAsia="en-GB"/>
+          <w14:ligatures w14:val="none"/>
+        </w:rPr>
+        <w:t>5.1.2 Stimulus/Response Sequences</w:t>
+      </w:r>
+    </w:p>
+    <w:p>
+      <w:pPr>
+        <w:shd w:val="clear" w:color="auto" w:fill="FFFFFF"/>
+        <w:spacing w:before="240" w:after="0" w:line="240" w:lineRule="auto"/>
+        <w:jc w:val="both"/>
+        <w:rPr>
+          <w:rFonts w:ascii="Times New Roman" w:eastAsia="Times New Roman" w:hAnsi="Times New Roman" w:cs="Times New Roman"/>
+          <w:b/>
+          <w:bCs/>
+          <w:color w:val="000000" w:themeColor="text1"/>
+          <w:kern w:val="0"/>
+          <w:sz w:val="20"/>
+          <w:szCs w:val="20"/>
+          <w:lang w:eastAsia="en-GB"/>
+          <w14:ligatures w14:val="none"/>
+        </w:rPr>
+      </w:pPr>
+    </w:p>
+    <w:p>
+      <w:pPr>
+        <w:shd w:val="clear" w:color="auto" w:fill="FFFFFF"/>
+        <w:spacing w:before="240" w:after="0" w:line="240" w:lineRule="auto"/>
+        <w:jc w:val="both"/>
+        <w:rPr>
+          <w:rFonts w:ascii="Times New Roman" w:eastAsia="Times New Roman" w:hAnsi="Times New Roman" w:cs="Times New Roman"/>
+          <w:b/>
+          <w:bCs/>
+          <w:color w:val="000000" w:themeColor="text1"/>
+          <w:kern w:val="0"/>
+          <w:sz w:val="20"/>
+          <w:szCs w:val="20"/>
+          <w:lang w:eastAsia="en-GB"/>
+          <w14:ligatures w14:val="none"/>
+        </w:rPr>
+      </w:pPr>
+    </w:p>
+    <w:p>
+      <w:pPr>
+        <w:shd w:val="clear" w:color="auto" w:fill="FFFFFF"/>
+        <w:spacing w:before="240" w:after="0" w:line="240" w:lineRule="auto"/>
+        <w:jc w:val="both"/>
+        <w:rPr>
+          <w:rFonts w:ascii="Times New Roman" w:eastAsia="Times New Roman" w:hAnsi="Times New Roman" w:cs="Times New Roman"/>
+          <w:b/>
+          <w:bCs/>
+          <w:color w:val="000000" w:themeColor="text1"/>
+          <w:kern w:val="0"/>
+          <w:sz w:val="20"/>
+          <w:szCs w:val="20"/>
+          <w:lang w:eastAsia="en-GB"/>
+          <w14:ligatures w14:val="none"/>
+        </w:rPr>
+      </w:pPr>
+    </w:p>
+    <w:p>
+      <w:pPr>
+        <w:shd w:val="clear" w:color="auto" w:fill="FFFFFF"/>
+        <w:spacing w:before="240" w:after="0" w:line="240" w:lineRule="auto"/>
+        <w:jc w:val="both"/>
+        <w:rPr>
+          <w:rFonts w:ascii="Times New Roman" w:eastAsia="Times New Roman" w:hAnsi="Times New Roman" w:cs="Times New Roman"/>
+          <w:b/>
+          <w:bCs/>
+          <w:color w:val="000000" w:themeColor="text1"/>
+          <w:kern w:val="0"/>
+          <w:sz w:val="20"/>
+          <w:szCs w:val="20"/>
+          <w:lang w:eastAsia="en-GB"/>
+          <w14:ligatures w14:val="none"/>
+        </w:rPr>
+      </w:pPr>
+    </w:p>
+    <w:p>
+      <w:pPr>
+        <w:shd w:val="clear" w:color="auto" w:fill="FFFFFF"/>
+        <w:spacing w:before="240" w:after="0" w:line="240" w:lineRule="auto"/>
+        <w:jc w:val="both"/>
+        <w:rPr>
+          <w:rFonts w:ascii="Times New Roman" w:eastAsia="Times New Roman" w:hAnsi="Times New Roman" w:cs="Times New Roman"/>
+          <w:b/>
+          <w:bCs/>
+          <w:color w:val="000000" w:themeColor="text1"/>
+          <w:kern w:val="0"/>
+          <w:sz w:val="20"/>
+          <w:szCs w:val="20"/>
+          <w:lang w:eastAsia="en-GB"/>
+          <w14:ligatures w14:val="none"/>
+        </w:rPr>
+      </w:pPr>
+    </w:p>
+    <w:p>
+      <w:pPr>
+        <w:shd w:val="clear" w:color="auto" w:fill="FFFFFF"/>
+        <w:spacing w:before="240" w:after="0" w:line="240" w:lineRule="auto"/>
+        <w:jc w:val="both"/>
+        <w:rPr>
+          <w:rFonts w:ascii="Times New Roman" w:eastAsia="Times New Roman" w:hAnsi="Times New Roman" w:cs="Times New Roman"/>
+          <w:b/>
+          <w:bCs/>
+          <w:color w:val="000000" w:themeColor="text1"/>
+          <w:kern w:val="0"/>
+          <w:sz w:val="20"/>
+          <w:szCs w:val="20"/>
+          <w:lang w:eastAsia="en-GB"/>
+          <w14:ligatures w14:val="none"/>
+        </w:rPr>
+      </w:pPr>
+      <w:r>
+        <w:rPr>
+          <w:rFonts w:ascii="Times New Roman" w:eastAsia="Times New Roman" w:hAnsi="Times New Roman" w:cs="Times New Roman"/>
+          <w:b/>
+          <w:bCs/>
+          <w:color w:val="000000" w:themeColor="text1"/>
+          <w:kern w:val="0"/>
+          <w:sz w:val="20"/>
+          <w:szCs w:val="20"/>
+          <w:lang w:eastAsia="en-GB"/>
+          <w14:ligatures w14:val="none"/>
+        </w:rPr>
+        <w:t>5.1.3 Functional Requirements</w:t>
+      </w:r>
+    </w:p>
+    <w:p>
+      <w:pPr>
+        <w:shd w:val="clear" w:color="auto" w:fill="FFFFFF"/>
+        <w:spacing w:before="240" w:after="0" w:line="240" w:lineRule="auto"/>
+        <w:jc w:val="both"/>
+        <w:rPr>
+          <w:rFonts w:ascii="Times New Roman" w:eastAsia="Times New Roman" w:hAnsi="Times New Roman" w:cs="Times New Roman"/>
+          <w:color w:val="000000" w:themeColor="text1"/>
+          <w:kern w:val="0"/>
+          <w:sz w:val="20"/>
+          <w:szCs w:val="20"/>
+          <w:lang w:eastAsia="en-GB"/>
+          <w14:ligatures w14:val="none"/>
+        </w:rPr>
+      </w:pPr>
+      <w:r>
+        <w:rPr>
+          <w:rFonts w:ascii="Times New Roman" w:eastAsia="Times New Roman" w:hAnsi="Times New Roman" w:cs="Times New Roman"/>
+          <w:color w:val="000000" w:themeColor="text1"/>
+          <w:kern w:val="0"/>
+          <w:sz w:val="20"/>
+          <w:szCs w:val="20"/>
+          <w:lang w:eastAsia="en-GB"/>
+          <w14:ligatures w14:val="none"/>
+        </w:rPr>
         <w:lastRenderedPageBreak/>
-        <w:t>3. System Features</w:t>
+        <w:t>REQ-1.1: System shall detect human count in the house using sensors.</w:t>
       </w:r>
     </w:p>
     <w:p>
@@ -2480,16 +3158,14 @@
       <w:r>
         <w:rPr>
           <w:rFonts w:ascii="Times New Roman" w:eastAsia="Times New Roman" w:hAnsi="Times New Roman" w:cs="Times New Roman"/>
-          <w:b/>
-          <w:bCs/>
-          <w:color w:val="000000" w:themeColor="text1"/>
-          <w:kern w:val="0"/>
-          <w:sz w:val="20"/>
-          <w:szCs w:val="20"/>
-          <w:lang w:eastAsia="en-GB"/>
-          <w14:ligatures w14:val="none"/>
-        </w:rPr>
-        <w:t>4. External Interface Requirements</w:t>
+          <w:color w:val="000000" w:themeColor="text1"/>
+          <w:kern w:val="0"/>
+          <w:sz w:val="20"/>
+          <w:szCs w:val="20"/>
+          <w:lang w:eastAsia="en-GB"/>
+          <w14:ligatures w14:val="none"/>
+        </w:rPr>
+        <w:t xml:space="preserve">REQ-1.2: When human count in house is zero system, shall turn of the all climate units </w:t>
       </w:r>
     </w:p>
     <w:p>
@@ -2510,16 +3186,14 @@
       <w:r>
         <w:rPr>
           <w:rFonts w:ascii="Times New Roman" w:eastAsia="Times New Roman" w:hAnsi="Times New Roman" w:cs="Times New Roman"/>
-          <w:b/>
-          <w:bCs/>
-          <w:color w:val="000000" w:themeColor="text1"/>
-          <w:kern w:val="0"/>
-          <w:sz w:val="20"/>
-          <w:szCs w:val="20"/>
-          <w:lang w:eastAsia="en-GB"/>
-          <w14:ligatures w14:val="none"/>
-        </w:rPr>
-        <w:t>4.1. User Interfaces Overview</w:t>
+          <w:color w:val="000000" w:themeColor="text1"/>
+          <w:kern w:val="0"/>
+          <w:sz w:val="20"/>
+          <w:szCs w:val="20"/>
+          <w:lang w:eastAsia="en-GB"/>
+          <w14:ligatures w14:val="none"/>
+        </w:rPr>
+        <w:t>REQ-1.3: When the number of people in the house increases or decreases, the system shall dynamically adjust the temperature.</w:t>
       </w:r>
     </w:p>
     <w:p>
@@ -2540,16 +3214,14 @@
       <w:r>
         <w:rPr>
           <w:rFonts w:ascii="Times New Roman" w:eastAsia="Times New Roman" w:hAnsi="Times New Roman" w:cs="Times New Roman"/>
-          <w:b/>
-          <w:bCs/>
-          <w:color w:val="000000" w:themeColor="text1"/>
-          <w:kern w:val="0"/>
-          <w:sz w:val="20"/>
-          <w:szCs w:val="20"/>
-          <w:lang w:eastAsia="en-GB"/>
-          <w14:ligatures w14:val="none"/>
-        </w:rPr>
-        <w:t>4.2. Hardware Interfaces</w:t>
+          <w:color w:val="000000" w:themeColor="text1"/>
+          <w:kern w:val="0"/>
+          <w:sz w:val="20"/>
+          <w:szCs w:val="20"/>
+          <w:lang w:eastAsia="en-GB"/>
+          <w14:ligatures w14:val="none"/>
+        </w:rPr>
+        <w:t>REQ-1.4: The system shall allow the user to disable autonomous mode and enter manual temperature via the interface</w:t>
       </w:r>
     </w:p>
     <w:p>
@@ -2570,16 +3242,14 @@
       <w:r>
         <w:rPr>
           <w:rFonts w:ascii="Times New Roman" w:eastAsia="Times New Roman" w:hAnsi="Times New Roman" w:cs="Times New Roman"/>
-          <w:b/>
-          <w:bCs/>
-          <w:color w:val="000000" w:themeColor="text1"/>
-          <w:kern w:val="0"/>
-          <w:sz w:val="20"/>
-          <w:szCs w:val="20"/>
-          <w:lang w:eastAsia="en-GB"/>
-          <w14:ligatures w14:val="none"/>
-        </w:rPr>
-        <w:t>4.3. Software Interfaces</w:t>
+          <w:color w:val="000000" w:themeColor="text1"/>
+          <w:kern w:val="0"/>
+          <w:sz w:val="20"/>
+          <w:szCs w:val="20"/>
+          <w:lang w:eastAsia="en-GB"/>
+          <w14:ligatures w14:val="none"/>
+        </w:rPr>
+        <w:t>REQ-1.5: If the sensor is disconnected, the system shall enter safe mode and operate at a standard temperature (e.g. 21°C).</w:t>
       </w:r>
     </w:p>
     <w:p>
@@ -2597,20 +3267,6 @@
           <w14:ligatures w14:val="none"/>
         </w:rPr>
       </w:pPr>
-      <w:r>
-        <w:rPr>
-          <w:rFonts w:ascii="Times New Roman" w:eastAsia="Times New Roman" w:hAnsi="Times New Roman" w:cs="Times New Roman"/>
-          <w:b/>
-          <w:bCs/>
-          <w:color w:val="000000" w:themeColor="text1"/>
-          <w:kern w:val="0"/>
-          <w:sz w:val="20"/>
-          <w:szCs w:val="20"/>
-          <w:lang w:eastAsia="en-GB"/>
-          <w14:ligatures w14:val="none"/>
-        </w:rPr>
-        <w:t>5. System Features/Modules</w:t>
-      </w:r>
     </w:p>
     <w:p>
       <w:pPr>
@@ -2619,29 +3275,27 @@
         <w:jc w:val="both"/>
         <w:rPr>
           <w:rFonts w:ascii="Times New Roman" w:eastAsia="Times New Roman" w:hAnsi="Times New Roman" w:cs="Times New Roman"/>
-          <w:b/>
-          <w:bCs/>
-          <w:color w:val="000000" w:themeColor="text1"/>
-          <w:kern w:val="0"/>
-          <w:sz w:val="20"/>
-          <w:szCs w:val="20"/>
-          <w:lang w:eastAsia="en-GB"/>
-          <w14:ligatures w14:val="none"/>
-        </w:rPr>
-      </w:pPr>
-      <w:r>
-        <w:rPr>
-          <w:rFonts w:ascii="Times New Roman" w:eastAsia="Times New Roman" w:hAnsi="Times New Roman" w:cs="Times New Roman"/>
-          <w:b/>
-          <w:bCs/>
-          <w:color w:val="000000" w:themeColor="text1"/>
-          <w:kern w:val="0"/>
-          <w:sz w:val="20"/>
-          <w:szCs w:val="20"/>
-          <w:lang w:eastAsia="en-GB"/>
-          <w14:ligatures w14:val="none"/>
-        </w:rPr>
-        <w:t>5.1 System Feature Name</w:t>
+          <w:color w:val="000000" w:themeColor="text1"/>
+          <w:kern w:val="0"/>
+          <w:sz w:val="20"/>
+          <w:szCs w:val="20"/>
+          <w:lang w:eastAsia="en-GB"/>
+          <w14:ligatures w14:val="none"/>
+        </w:rPr>
+      </w:pPr>
+      <w:r>
+        <w:rPr>
+          <w:rFonts w:ascii="Times New Roman" w:eastAsia="Times New Roman" w:hAnsi="Times New Roman" w:cs="Times New Roman"/>
+          <w:b/>
+          <w:bCs/>
+          <w:color w:val="000000" w:themeColor="text1"/>
+          <w:kern w:val="0"/>
+          <w:sz w:val="20"/>
+          <w:szCs w:val="20"/>
+          <w:lang w:eastAsia="en-GB"/>
+          <w14:ligatures w14:val="none"/>
+        </w:rPr>
+        <w:t>6. Nonfunctional Requirements</w:t>
       </w:r>
     </w:p>
     <w:p>
@@ -2671,35 +3325,7 @@
           <w:lang w:eastAsia="en-GB"/>
           <w14:ligatures w14:val="none"/>
         </w:rPr>
-        <w:t>5.1.</w:t>
-      </w:r>
-      <w:r>
-        <w:rPr>
-          <w:rFonts w:ascii="Times New Roman" w:eastAsia="Times New Roman" w:hAnsi="Times New Roman" w:cs="Times New Roman"/>
-          <w:b/>
-          <w:bCs/>
-          <w:color w:val="000000" w:themeColor="text1"/>
-          <w:kern w:val="0"/>
-          <w:sz w:val="20"/>
-          <w:szCs w:val="20"/>
-          <w:lang w:eastAsia="en-GB"/>
-          <w14:ligatures w14:val="none"/>
-        </w:rPr>
-        <w:t>1.</w:t>
-      </w:r>
-      <w:r>
-        <w:rPr>
-          <w:rFonts w:ascii="Times New Roman" w:eastAsia="Times New Roman" w:hAnsi="Times New Roman" w:cs="Times New Roman"/>
-          <w:b/>
-          <w:bCs/>
-          <w:color w:val="000000" w:themeColor="text1"/>
-          <w:kern w:val="0"/>
-          <w:sz w:val="20"/>
-          <w:szCs w:val="20"/>
-          <w:lang w:eastAsia="en-GB"/>
-          <w14:ligatures w14:val="none"/>
-        </w:rPr>
-        <w:t xml:space="preserve"> Description and Priority</w:t>
+        <w:t>6.1. Performance  </w:t>
       </w:r>
     </w:p>
     <w:p>
@@ -2720,16 +3346,14 @@
       <w:r>
         <w:rPr>
           <w:rFonts w:ascii="Times New Roman" w:eastAsia="Times New Roman" w:hAnsi="Times New Roman" w:cs="Times New Roman"/>
-          <w:b/>
-          <w:bCs/>
-          <w:color w:val="000000" w:themeColor="text1"/>
-          <w:kern w:val="0"/>
-          <w:sz w:val="20"/>
-          <w:szCs w:val="20"/>
-          <w:lang w:eastAsia="en-GB"/>
-          <w14:ligatures w14:val="none"/>
-        </w:rPr>
-        <w:t>5.1.2 Stimulus/Response Sequences</w:t>
+          <w:color w:val="000000" w:themeColor="text1"/>
+          <w:kern w:val="0"/>
+          <w:sz w:val="20"/>
+          <w:szCs w:val="20"/>
+          <w:lang w:eastAsia="en-GB"/>
+          <w14:ligatures w14:val="none"/>
+        </w:rPr>
+        <w:t>NF-1.1: The system shall process the data from sensors &lt; 3 seconds and send commands to the climate units.</w:t>
       </w:r>
     </w:p>
     <w:p>
@@ -2739,16 +3363,26 @@
         <w:jc w:val="both"/>
         <w:rPr>
           <w:rFonts w:ascii="Times New Roman" w:eastAsia="Times New Roman" w:hAnsi="Times New Roman" w:cs="Times New Roman"/>
-          <w:b/>
-          <w:bCs/>
-          <w:color w:val="000000" w:themeColor="text1"/>
-          <w:kern w:val="0"/>
-          <w:sz w:val="20"/>
-          <w:szCs w:val="20"/>
-          <w:lang w:eastAsia="en-GB"/>
-          <w14:ligatures w14:val="none"/>
-        </w:rPr>
-      </w:pPr>
+          <w:color w:val="000000" w:themeColor="text1"/>
+          <w:kern w:val="0"/>
+          <w:sz w:val="20"/>
+          <w:szCs w:val="20"/>
+          <w:lang w:eastAsia="en-GB"/>
+          <w14:ligatures w14:val="none"/>
+        </w:rPr>
+      </w:pPr>
+      <w:r>
+        <w:rPr>
+          <w:rFonts w:ascii="Times New Roman" w:eastAsia="Times New Roman" w:hAnsi="Times New Roman" w:cs="Times New Roman"/>
+          <w:color w:val="000000" w:themeColor="text1"/>
+          <w:kern w:val="0"/>
+          <w:sz w:val="20"/>
+          <w:szCs w:val="20"/>
+          <w:lang w:eastAsia="en-GB"/>
+          <w14:ligatures w14:val="none"/>
+        </w:rPr>
+        <w:t>NF-1.2: The situation of house shall recorded securely using encryption.</w:t>
+      </w:r>
     </w:p>
     <w:p>
       <w:pPr>
@@ -2757,16 +3391,28 @@
         <w:jc w:val="both"/>
         <w:rPr>
           <w:rFonts w:ascii="Times New Roman" w:eastAsia="Times New Roman" w:hAnsi="Times New Roman" w:cs="Times New Roman"/>
-          <w:b/>
-          <w:bCs/>
-          <w:color w:val="000000" w:themeColor="text1"/>
-          <w:kern w:val="0"/>
-          <w:sz w:val="20"/>
-          <w:szCs w:val="20"/>
-          <w:lang w:eastAsia="en-GB"/>
-          <w14:ligatures w14:val="none"/>
-        </w:rPr>
-      </w:pPr>
+          <w:color w:val="000000" w:themeColor="text1"/>
+          <w:kern w:val="0"/>
+          <w:sz w:val="20"/>
+          <w:szCs w:val="20"/>
+          <w:lang w:eastAsia="en-GB"/>
+          <w14:ligatures w14:val="none"/>
+        </w:rPr>
+      </w:pPr>
+      <w:r>
+        <w:rPr>
+          <w:rFonts w:ascii="Times New Roman" w:eastAsia="Times New Roman" w:hAnsi="Times New Roman" w:cs="Times New Roman"/>
+          <w:b/>
+          <w:bCs/>
+          <w:color w:val="000000" w:themeColor="text1"/>
+          <w:kern w:val="0"/>
+          <w:sz w:val="20"/>
+          <w:szCs w:val="20"/>
+          <w:lang w:eastAsia="en-GB"/>
+          <w14:ligatures w14:val="none"/>
+        </w:rPr>
+        <w:t>6.2. Security  </w:t>
+      </w:r>
     </w:p>
     <w:p>
       <w:pPr>
@@ -2775,413 +3421,51 @@
         <w:jc w:val="both"/>
         <w:rPr>
           <w:rFonts w:ascii="Times New Roman" w:eastAsia="Times New Roman" w:hAnsi="Times New Roman" w:cs="Times New Roman"/>
-          <w:b/>
-          <w:bCs/>
-          <w:color w:val="000000" w:themeColor="text1"/>
-          <w:kern w:val="0"/>
-          <w:sz w:val="20"/>
-          <w:szCs w:val="20"/>
-          <w:lang w:eastAsia="en-GB"/>
-          <w14:ligatures w14:val="none"/>
-        </w:rPr>
-      </w:pPr>
-    </w:p>
-    <w:p>
-      <w:pPr>
-        <w:shd w:val="clear" w:color="auto" w:fill="FFFFFF"/>
-        <w:spacing w:before="240" w:after="0" w:line="240" w:lineRule="auto"/>
-        <w:jc w:val="both"/>
-        <w:rPr>
-          <w:rFonts w:ascii="Times New Roman" w:eastAsia="Times New Roman" w:hAnsi="Times New Roman" w:cs="Times New Roman"/>
-          <w:b/>
-          <w:bCs/>
-          <w:color w:val="000000" w:themeColor="text1"/>
-          <w:kern w:val="0"/>
-          <w:sz w:val="20"/>
-          <w:szCs w:val="20"/>
-          <w:lang w:eastAsia="en-GB"/>
-          <w14:ligatures w14:val="none"/>
-        </w:rPr>
-      </w:pPr>
-    </w:p>
-    <w:p>
-      <w:pPr>
-        <w:shd w:val="clear" w:color="auto" w:fill="FFFFFF"/>
-        <w:spacing w:before="240" w:after="0" w:line="240" w:lineRule="auto"/>
-        <w:jc w:val="both"/>
-        <w:rPr>
-          <w:rFonts w:ascii="Times New Roman" w:eastAsia="Times New Roman" w:hAnsi="Times New Roman" w:cs="Times New Roman"/>
-          <w:b/>
-          <w:bCs/>
-          <w:color w:val="000000" w:themeColor="text1"/>
-          <w:kern w:val="0"/>
-          <w:sz w:val="20"/>
-          <w:szCs w:val="20"/>
-          <w:lang w:eastAsia="en-GB"/>
-          <w14:ligatures w14:val="none"/>
-        </w:rPr>
-      </w:pPr>
-    </w:p>
-    <w:p>
-      <w:pPr>
-        <w:shd w:val="clear" w:color="auto" w:fill="FFFFFF"/>
-        <w:spacing w:before="240" w:after="0" w:line="240" w:lineRule="auto"/>
-        <w:jc w:val="both"/>
-        <w:rPr>
-          <w:rFonts w:ascii="Times New Roman" w:eastAsia="Times New Roman" w:hAnsi="Times New Roman" w:cs="Times New Roman"/>
-          <w:b/>
-          <w:bCs/>
-          <w:color w:val="000000" w:themeColor="text1"/>
-          <w:kern w:val="0"/>
-          <w:sz w:val="20"/>
-          <w:szCs w:val="20"/>
-          <w:lang w:eastAsia="en-GB"/>
-          <w14:ligatures w14:val="none"/>
-        </w:rPr>
-      </w:pPr>
-      <w:r>
-        <w:rPr>
-          <w:rFonts w:ascii="Times New Roman" w:eastAsia="Times New Roman" w:hAnsi="Times New Roman" w:cs="Times New Roman"/>
-          <w:b/>
-          <w:bCs/>
-          <w:color w:val="000000" w:themeColor="text1"/>
-          <w:kern w:val="0"/>
-          <w:sz w:val="20"/>
-          <w:szCs w:val="20"/>
-          <w:lang w:eastAsia="en-GB"/>
-          <w14:ligatures w14:val="none"/>
-        </w:rPr>
-        <w:t>5.1.3 Functional Requirements</w:t>
-      </w:r>
-    </w:p>
-    <w:p>
-      <w:pPr>
-        <w:shd w:val="clear" w:color="auto" w:fill="FFFFFF"/>
-        <w:spacing w:before="240" w:after="0" w:line="240" w:lineRule="auto"/>
-        <w:jc w:val="both"/>
-        <w:rPr>
-          <w:rFonts w:ascii="Times New Roman" w:eastAsia="Times New Roman" w:hAnsi="Times New Roman" w:cs="Times New Roman"/>
-          <w:color w:val="000000" w:themeColor="text1"/>
-          <w:kern w:val="0"/>
-          <w:sz w:val="20"/>
-          <w:szCs w:val="20"/>
-          <w:lang w:eastAsia="en-GB"/>
-          <w14:ligatures w14:val="none"/>
-        </w:rPr>
-      </w:pPr>
-      <w:r>
-        <w:rPr>
-          <w:rFonts w:ascii="Times New Roman" w:eastAsia="Times New Roman" w:hAnsi="Times New Roman" w:cs="Times New Roman"/>
-          <w:color w:val="000000" w:themeColor="text1"/>
-          <w:kern w:val="0"/>
-          <w:sz w:val="20"/>
-          <w:szCs w:val="20"/>
-          <w:lang w:eastAsia="en-GB"/>
-          <w14:ligatures w14:val="none"/>
-        </w:rPr>
-        <w:t>REQ-1.1: System shall detect human count in the house using sensors.</w:t>
-      </w:r>
-    </w:p>
-    <w:p>
-      <w:pPr>
-        <w:shd w:val="clear" w:color="auto" w:fill="FFFFFF"/>
-        <w:spacing w:before="240" w:after="0" w:line="240" w:lineRule="auto"/>
-        <w:jc w:val="both"/>
-        <w:rPr>
-          <w:rFonts w:ascii="Times New Roman" w:eastAsia="Times New Roman" w:hAnsi="Times New Roman" w:cs="Times New Roman"/>
-          <w:color w:val="000000" w:themeColor="text1"/>
-          <w:kern w:val="0"/>
-          <w:sz w:val="20"/>
-          <w:szCs w:val="20"/>
-          <w:lang w:eastAsia="en-GB"/>
-          <w14:ligatures w14:val="none"/>
-        </w:rPr>
-      </w:pPr>
-      <w:r>
-        <w:rPr>
-          <w:rFonts w:ascii="Times New Roman" w:eastAsia="Times New Roman" w:hAnsi="Times New Roman" w:cs="Times New Roman"/>
-          <w:color w:val="000000" w:themeColor="text1"/>
-          <w:kern w:val="0"/>
-          <w:sz w:val="20"/>
-          <w:szCs w:val="20"/>
-          <w:lang w:eastAsia="en-GB"/>
-          <w14:ligatures w14:val="none"/>
-        </w:rPr>
-        <w:t xml:space="preserve">REQ-1.2: When human count in house is zero system, shall turn of the all climate units </w:t>
-      </w:r>
-    </w:p>
-    <w:p>
-      <w:pPr>
-        <w:shd w:val="clear" w:color="auto" w:fill="FFFFFF"/>
-        <w:spacing w:before="240" w:after="0" w:line="240" w:lineRule="auto"/>
-        <w:jc w:val="both"/>
-        <w:rPr>
-          <w:rFonts w:ascii="Times New Roman" w:eastAsia="Times New Roman" w:hAnsi="Times New Roman" w:cs="Times New Roman"/>
-          <w:color w:val="000000" w:themeColor="text1"/>
-          <w:kern w:val="0"/>
-          <w:sz w:val="20"/>
-          <w:szCs w:val="20"/>
-          <w:lang w:eastAsia="en-GB"/>
-          <w14:ligatures w14:val="none"/>
-        </w:rPr>
-      </w:pPr>
-      <w:r>
-        <w:rPr>
-          <w:rFonts w:ascii="Times New Roman" w:eastAsia="Times New Roman" w:hAnsi="Times New Roman" w:cs="Times New Roman"/>
-          <w:color w:val="000000" w:themeColor="text1"/>
-          <w:kern w:val="0"/>
-          <w:sz w:val="20"/>
-          <w:szCs w:val="20"/>
-          <w:lang w:eastAsia="en-GB"/>
-          <w14:ligatures w14:val="none"/>
-        </w:rPr>
-        <w:t>REQ-1.3: When the number of people in the house increases or decreases, the system shall dynamically adjust the temperature.</w:t>
-      </w:r>
-    </w:p>
-    <w:p>
-      <w:pPr>
-        <w:shd w:val="clear" w:color="auto" w:fill="FFFFFF"/>
-        <w:spacing w:before="240" w:after="0" w:line="240" w:lineRule="auto"/>
-        <w:jc w:val="both"/>
-        <w:rPr>
-          <w:rFonts w:ascii="Times New Roman" w:eastAsia="Times New Roman" w:hAnsi="Times New Roman" w:cs="Times New Roman"/>
-          <w:color w:val="000000" w:themeColor="text1"/>
-          <w:kern w:val="0"/>
-          <w:sz w:val="20"/>
-          <w:szCs w:val="20"/>
-          <w:lang w:eastAsia="en-GB"/>
-          <w14:ligatures w14:val="none"/>
-        </w:rPr>
-      </w:pPr>
-      <w:r>
-        <w:rPr>
-          <w:rFonts w:ascii="Times New Roman" w:eastAsia="Times New Roman" w:hAnsi="Times New Roman" w:cs="Times New Roman"/>
-          <w:color w:val="000000" w:themeColor="text1"/>
-          <w:kern w:val="0"/>
-          <w:sz w:val="20"/>
-          <w:szCs w:val="20"/>
-          <w:lang w:eastAsia="en-GB"/>
-          <w14:ligatures w14:val="none"/>
-        </w:rPr>
-        <w:t>REQ-1.4: The system shall allow the user to disable autonomous mode and enter manual temperature via the interface</w:t>
-      </w:r>
-    </w:p>
-    <w:p>
-      <w:pPr>
-        <w:shd w:val="clear" w:color="auto" w:fill="FFFFFF"/>
-        <w:spacing w:before="240" w:after="0" w:line="240" w:lineRule="auto"/>
-        <w:jc w:val="both"/>
-        <w:rPr>
-          <w:rFonts w:ascii="Times New Roman" w:eastAsia="Times New Roman" w:hAnsi="Times New Roman" w:cs="Times New Roman"/>
-          <w:color w:val="000000" w:themeColor="text1"/>
-          <w:kern w:val="0"/>
-          <w:sz w:val="20"/>
-          <w:szCs w:val="20"/>
-          <w:lang w:eastAsia="en-GB"/>
-          <w14:ligatures w14:val="none"/>
-        </w:rPr>
-      </w:pPr>
-      <w:r>
-        <w:rPr>
-          <w:rFonts w:ascii="Times New Roman" w:eastAsia="Times New Roman" w:hAnsi="Times New Roman" w:cs="Times New Roman"/>
-          <w:color w:val="000000" w:themeColor="text1"/>
-          <w:kern w:val="0"/>
-          <w:sz w:val="20"/>
-          <w:szCs w:val="20"/>
-          <w:lang w:eastAsia="en-GB"/>
-          <w14:ligatures w14:val="none"/>
-        </w:rPr>
-        <w:t>REQ-1.5: If the sensor is disconnected, the system shall enter safe mode and operate at a standard temperature (e.g. 21°C).</w:t>
-      </w:r>
-    </w:p>
-    <w:p>
-      <w:pPr>
-        <w:shd w:val="clear" w:color="auto" w:fill="FFFFFF"/>
-        <w:spacing w:before="240" w:after="0" w:line="240" w:lineRule="auto"/>
-        <w:jc w:val="both"/>
-        <w:rPr>
-          <w:rFonts w:ascii="Times New Roman" w:eastAsia="Times New Roman" w:hAnsi="Times New Roman" w:cs="Times New Roman"/>
-          <w:color w:val="000000" w:themeColor="text1"/>
-          <w:kern w:val="0"/>
-          <w:sz w:val="20"/>
-          <w:szCs w:val="20"/>
-          <w:lang w:eastAsia="en-GB"/>
-          <w14:ligatures w14:val="none"/>
-        </w:rPr>
-      </w:pPr>
-    </w:p>
-    <w:p>
-      <w:pPr>
-        <w:shd w:val="clear" w:color="auto" w:fill="FFFFFF"/>
-        <w:spacing w:before="240" w:after="0" w:line="240" w:lineRule="auto"/>
-        <w:jc w:val="both"/>
-        <w:rPr>
-          <w:rFonts w:ascii="Times New Roman" w:eastAsia="Times New Roman" w:hAnsi="Times New Roman" w:cs="Times New Roman"/>
-          <w:color w:val="000000" w:themeColor="text1"/>
-          <w:kern w:val="0"/>
-          <w:sz w:val="20"/>
-          <w:szCs w:val="20"/>
-          <w:lang w:eastAsia="en-GB"/>
-          <w14:ligatures w14:val="none"/>
-        </w:rPr>
-      </w:pPr>
-      <w:r>
-        <w:rPr>
-          <w:rFonts w:ascii="Times New Roman" w:eastAsia="Times New Roman" w:hAnsi="Times New Roman" w:cs="Times New Roman"/>
-          <w:b/>
-          <w:bCs/>
-          <w:color w:val="000000" w:themeColor="text1"/>
-          <w:kern w:val="0"/>
-          <w:sz w:val="20"/>
-          <w:szCs w:val="20"/>
-          <w:lang w:eastAsia="en-GB"/>
-          <w14:ligatures w14:val="none"/>
-        </w:rPr>
-        <w:t>6. Nonfunctional Requirements</w:t>
-      </w:r>
-    </w:p>
-    <w:p>
-      <w:pPr>
-        <w:shd w:val="clear" w:color="auto" w:fill="FFFFFF"/>
-        <w:spacing w:before="240" w:after="0" w:line="240" w:lineRule="auto"/>
-        <w:jc w:val="both"/>
-        <w:rPr>
-          <w:rFonts w:ascii="Times New Roman" w:eastAsia="Times New Roman" w:hAnsi="Times New Roman" w:cs="Times New Roman"/>
-          <w:color w:val="000000" w:themeColor="text1"/>
-          <w:kern w:val="0"/>
-          <w:sz w:val="20"/>
-          <w:szCs w:val="20"/>
-          <w:lang w:eastAsia="en-GB"/>
-          <w14:ligatures w14:val="none"/>
-        </w:rPr>
-      </w:pPr>
-      <w:r>
-        <w:rPr>
-          <w:rFonts w:ascii="Times New Roman" w:eastAsia="Times New Roman" w:hAnsi="Times New Roman" w:cs="Times New Roman"/>
-          <w:b/>
-          <w:bCs/>
-          <w:color w:val="000000" w:themeColor="text1"/>
-          <w:kern w:val="0"/>
-          <w:sz w:val="20"/>
-          <w:szCs w:val="20"/>
-          <w:lang w:eastAsia="en-GB"/>
-          <w14:ligatures w14:val="none"/>
-        </w:rPr>
-        <w:t>6.1. Performance  </w:t>
-      </w:r>
-    </w:p>
-    <w:p>
-      <w:pPr>
-        <w:shd w:val="clear" w:color="auto" w:fill="FFFFFF"/>
-        <w:spacing w:before="240" w:after="0" w:line="240" w:lineRule="auto"/>
-        <w:jc w:val="both"/>
-        <w:rPr>
-          <w:rFonts w:ascii="Times New Roman" w:eastAsia="Times New Roman" w:hAnsi="Times New Roman" w:cs="Times New Roman"/>
-          <w:color w:val="000000" w:themeColor="text1"/>
-          <w:kern w:val="0"/>
-          <w:sz w:val="20"/>
-          <w:szCs w:val="20"/>
-          <w:lang w:eastAsia="en-GB"/>
-          <w14:ligatures w14:val="none"/>
-        </w:rPr>
-      </w:pPr>
-      <w:r>
-        <w:rPr>
-          <w:rFonts w:ascii="Times New Roman" w:eastAsia="Times New Roman" w:hAnsi="Times New Roman" w:cs="Times New Roman"/>
-          <w:color w:val="000000" w:themeColor="text1"/>
-          <w:kern w:val="0"/>
-          <w:sz w:val="20"/>
-          <w:szCs w:val="20"/>
-          <w:lang w:eastAsia="en-GB"/>
-          <w14:ligatures w14:val="none"/>
-        </w:rPr>
-        <w:t>NF-1.1: The system shall process the data from sensors &lt; 3 seconds and send commands to the climate units.</w:t>
-      </w:r>
-    </w:p>
-    <w:p>
-      <w:pPr>
-        <w:shd w:val="clear" w:color="auto" w:fill="FFFFFF"/>
-        <w:spacing w:before="240" w:after="0" w:line="240" w:lineRule="auto"/>
-        <w:jc w:val="both"/>
-        <w:rPr>
-          <w:rFonts w:ascii="Times New Roman" w:eastAsia="Times New Roman" w:hAnsi="Times New Roman" w:cs="Times New Roman"/>
-          <w:color w:val="000000" w:themeColor="text1"/>
-          <w:kern w:val="0"/>
-          <w:sz w:val="20"/>
-          <w:szCs w:val="20"/>
-          <w:lang w:eastAsia="en-GB"/>
-          <w14:ligatures w14:val="none"/>
-        </w:rPr>
-      </w:pPr>
-      <w:r>
-        <w:rPr>
-          <w:rFonts w:ascii="Times New Roman" w:eastAsia="Times New Roman" w:hAnsi="Times New Roman" w:cs="Times New Roman"/>
-          <w:color w:val="000000" w:themeColor="text1"/>
-          <w:kern w:val="0"/>
-          <w:sz w:val="20"/>
-          <w:szCs w:val="20"/>
-          <w:lang w:eastAsia="en-GB"/>
-          <w14:ligatures w14:val="none"/>
-        </w:rPr>
-        <w:t>NF-1.2: The situation of house shall recorded securely using encryption.</w:t>
-      </w:r>
-    </w:p>
-    <w:p>
-      <w:pPr>
-        <w:shd w:val="clear" w:color="auto" w:fill="FFFFFF"/>
-        <w:spacing w:before="240" w:after="0" w:line="240" w:lineRule="auto"/>
-        <w:jc w:val="both"/>
-        <w:rPr>
-          <w:rFonts w:ascii="Times New Roman" w:eastAsia="Times New Roman" w:hAnsi="Times New Roman" w:cs="Times New Roman"/>
-          <w:color w:val="000000" w:themeColor="text1"/>
-          <w:kern w:val="0"/>
-          <w:sz w:val="20"/>
-          <w:szCs w:val="20"/>
-          <w:lang w:eastAsia="en-GB"/>
-          <w14:ligatures w14:val="none"/>
-        </w:rPr>
-      </w:pPr>
-      <w:r>
-        <w:rPr>
-          <w:rFonts w:ascii="Times New Roman" w:eastAsia="Times New Roman" w:hAnsi="Times New Roman" w:cs="Times New Roman"/>
-          <w:b/>
-          <w:bCs/>
-          <w:color w:val="000000" w:themeColor="text1"/>
-          <w:kern w:val="0"/>
-          <w:sz w:val="20"/>
-          <w:szCs w:val="20"/>
-          <w:lang w:eastAsia="en-GB"/>
-          <w14:ligatures w14:val="none"/>
-        </w:rPr>
-        <w:t>6.2. Security  </w:t>
-      </w:r>
-    </w:p>
-    <w:p>
-      <w:pPr>
-        <w:shd w:val="clear" w:color="auto" w:fill="FFFFFF"/>
-        <w:spacing w:before="240" w:after="0" w:line="240" w:lineRule="auto"/>
-        <w:jc w:val="both"/>
-        <w:rPr>
-          <w:rFonts w:ascii="Times New Roman" w:eastAsia="Times New Roman" w:hAnsi="Times New Roman" w:cs="Times New Roman"/>
-          <w:color w:val="000000" w:themeColor="text1"/>
-          <w:kern w:val="0"/>
-          <w:sz w:val="20"/>
-          <w:szCs w:val="20"/>
-          <w:lang w:eastAsia="en-GB"/>
-          <w14:ligatures w14:val="none"/>
-        </w:rPr>
-      </w:pPr>
-      <w:r>
-        <w:rPr>
-          <w:rFonts w:ascii="Times New Roman" w:eastAsia="Times New Roman" w:hAnsi="Times New Roman" w:cs="Times New Roman"/>
-          <w:color w:val="000000" w:themeColor="text1"/>
-          <w:kern w:val="0"/>
-          <w:sz w:val="20"/>
-          <w:szCs w:val="20"/>
-          <w:lang w:eastAsia="en-GB"/>
-          <w14:ligatures w14:val="none"/>
-        </w:rPr>
-        <w:t>NF-2.1: The system shall start automatically after the blacouts.</w:t>
+          <w:color w:val="000000" w:themeColor="text1"/>
+          <w:kern w:val="0"/>
+          <w:sz w:val="20"/>
+          <w:szCs w:val="20"/>
+          <w:lang w:eastAsia="en-GB"/>
+          <w14:ligatures w14:val="none"/>
+        </w:rPr>
+      </w:pPr>
+      <w:r>
+        <w:rPr>
+          <w:rFonts w:ascii="Times New Roman" w:eastAsia="Times New Roman" w:hAnsi="Times New Roman" w:cs="Times New Roman"/>
+          <w:color w:val="000000" w:themeColor="text1"/>
+          <w:kern w:val="0"/>
+          <w:sz w:val="20"/>
+          <w:szCs w:val="20"/>
+          <w:lang w:eastAsia="en-GB"/>
+          <w14:ligatures w14:val="none"/>
+        </w:rPr>
+        <w:t xml:space="preserve">NF-2.1: The system shall start automatically after the </w:t>
+      </w:r>
+      <w:proofErr w:type="spellStart"/>
+      <w:r>
+        <w:rPr>
+          <w:rFonts w:ascii="Times New Roman" w:eastAsia="Times New Roman" w:hAnsi="Times New Roman" w:cs="Times New Roman"/>
+          <w:color w:val="000000" w:themeColor="text1"/>
+          <w:kern w:val="0"/>
+          <w:sz w:val="20"/>
+          <w:szCs w:val="20"/>
+          <w:lang w:eastAsia="en-GB"/>
+          <w14:ligatures w14:val="none"/>
+        </w:rPr>
+        <w:t>blacouts</w:t>
+      </w:r>
+      <w:proofErr w:type="spellEnd"/>
+      <w:r>
+        <w:rPr>
+          <w:rFonts w:ascii="Times New Roman" w:eastAsia="Times New Roman" w:hAnsi="Times New Roman" w:cs="Times New Roman"/>
+          <w:color w:val="000000" w:themeColor="text1"/>
+          <w:kern w:val="0"/>
+          <w:sz w:val="20"/>
+          <w:szCs w:val="20"/>
+          <w:lang w:eastAsia="en-GB"/>
+          <w14:ligatures w14:val="none"/>
+        </w:rPr>
+        <w:t>.</w:t>
       </w:r>
     </w:p>
     <w:p>

</xml_diff>

<commit_message>
UML Activiy Diagram Added
</commit_message>
<xml_diff>
--- a/Srs Document/Home Tempature Adjustment System Srs.docx
+++ b/Srs Document/Home Tempature Adjustment System Srs.docx
@@ -1072,6 +1072,7 @@
                 <w14:ligatures w14:val="none"/>
               </w:rPr>
             </w:pPr>
+            <w:proofErr w:type="gramStart"/>
             <w:r>
               <w:rPr>
                 <w:rFonts w:ascii="Times New Roman" w:eastAsia="Times New Roman" w:hAnsi="Times New Roman" w:cs="Times New Roman"/>
@@ -1082,7 +1083,20 @@
                 <w:lang w:eastAsia="en-GB"/>
                 <w14:ligatures w14:val="none"/>
               </w:rPr>
-              <w:t>”Initial version”</w:t>
+              <w:t>”Initial</w:t>
+            </w:r>
+            <w:proofErr w:type="gramEnd"/>
+            <w:r>
+              <w:rPr>
+                <w:rFonts w:ascii="Times New Roman" w:eastAsia="Times New Roman" w:hAnsi="Times New Roman" w:cs="Times New Roman"/>
+                <w:color w:val="000000" w:themeColor="text1"/>
+                <w:kern w:val="0"/>
+                <w:sz w:val="16"/>
+                <w:szCs w:val="16"/>
+                <w:lang w:eastAsia="en-GB"/>
+                <w14:ligatures w14:val="none"/>
+              </w:rPr>
+              <w:t xml:space="preserve"> version”</w:t>
             </w:r>
           </w:p>
         </w:tc>
@@ -1712,6 +1726,191 @@
           </w:p>
         </w:tc>
       </w:tr>
+      <w:tr>
+        <w:trPr>
+          <w:trHeight w:val="836"/>
+        </w:trPr>
+        <w:tc>
+          <w:tcPr>
+            <w:tcW w:w="0" w:type="auto"/>
+            <w:tcBorders>
+              <w:top w:val="single" w:sz="6" w:space="0" w:color="000000"/>
+              <w:left w:val="single" w:sz="6" w:space="0" w:color="000000"/>
+              <w:bottom w:val="single" w:sz="6" w:space="0" w:color="000000"/>
+              <w:right w:val="single" w:sz="6" w:space="0" w:color="000000"/>
+            </w:tcBorders>
+            <w:shd w:val="clear" w:color="auto" w:fill="FFFFFF"/>
+            <w:tcMar>
+              <w:top w:w="108" w:type="dxa"/>
+              <w:left w:w="108" w:type="dxa"/>
+              <w:bottom w:w="108" w:type="dxa"/>
+              <w:right w:w="108" w:type="dxa"/>
+            </w:tcMar>
+            <w:vAlign w:val="center"/>
+          </w:tcPr>
+          <w:p>
+            <w:pPr>
+              <w:spacing w:before="360" w:after="360" w:line="264" w:lineRule="atLeast"/>
+              <w:rPr>
+                <w:rFonts w:ascii="Times New Roman" w:eastAsia="Times New Roman" w:hAnsi="Times New Roman" w:cs="Times New Roman"/>
+                <w:color w:val="000000" w:themeColor="text1"/>
+                <w:kern w:val="0"/>
+                <w:sz w:val="16"/>
+                <w:szCs w:val="16"/>
+                <w:lang w:eastAsia="en-GB"/>
+                <w14:ligatures w14:val="none"/>
+              </w:rPr>
+            </w:pPr>
+            <w:r>
+              <w:rPr>
+                <w:rFonts w:ascii="Times New Roman" w:eastAsia="Times New Roman" w:hAnsi="Times New Roman" w:cs="Times New Roman"/>
+                <w:color w:val="000000" w:themeColor="text1"/>
+                <w:kern w:val="0"/>
+                <w:sz w:val="16"/>
+                <w:szCs w:val="16"/>
+                <w:lang w:eastAsia="en-GB"/>
+                <w14:ligatures w14:val="none"/>
+              </w:rPr>
+              <w:t>Ahmet Talha Sivrikaya</w:t>
+            </w:r>
+          </w:p>
+        </w:tc>
+        <w:tc>
+          <w:tcPr>
+            <w:tcW w:w="0" w:type="auto"/>
+            <w:tcBorders>
+              <w:top w:val="single" w:sz="6" w:space="0" w:color="000000"/>
+              <w:left w:val="single" w:sz="6" w:space="0" w:color="000000"/>
+              <w:bottom w:val="single" w:sz="6" w:space="0" w:color="000000"/>
+              <w:right w:val="single" w:sz="6" w:space="0" w:color="000000"/>
+            </w:tcBorders>
+            <w:shd w:val="clear" w:color="auto" w:fill="FFFFFF"/>
+            <w:tcMar>
+              <w:top w:w="108" w:type="dxa"/>
+              <w:left w:w="108" w:type="dxa"/>
+              <w:bottom w:w="108" w:type="dxa"/>
+              <w:right w:w="108" w:type="dxa"/>
+            </w:tcMar>
+            <w:vAlign w:val="center"/>
+          </w:tcPr>
+          <w:p>
+            <w:pPr>
+              <w:spacing w:before="360" w:after="360" w:line="264" w:lineRule="atLeast"/>
+              <w:rPr>
+                <w:rFonts w:ascii="Times New Roman" w:eastAsia="Times New Roman" w:hAnsi="Times New Roman" w:cs="Times New Roman"/>
+                <w:color w:val="000000" w:themeColor="text1"/>
+                <w:kern w:val="0"/>
+                <w:sz w:val="16"/>
+                <w:szCs w:val="16"/>
+                <w:lang w:eastAsia="en-GB"/>
+                <w14:ligatures w14:val="none"/>
+              </w:rPr>
+            </w:pPr>
+            <w:r>
+              <w:rPr>
+                <w:rFonts w:ascii="Times New Roman" w:eastAsia="Times New Roman" w:hAnsi="Times New Roman" w:cs="Times New Roman"/>
+                <w:color w:val="000000" w:themeColor="text1"/>
+                <w:kern w:val="0"/>
+                <w:sz w:val="16"/>
+                <w:szCs w:val="16"/>
+                <w:lang w:eastAsia="en-GB"/>
+                <w14:ligatures w14:val="none"/>
+              </w:rPr>
+              <w:t>24.04.2026</w:t>
+            </w:r>
+          </w:p>
+        </w:tc>
+        <w:tc>
+          <w:tcPr>
+            <w:tcW w:w="0" w:type="auto"/>
+            <w:tcBorders>
+              <w:top w:val="single" w:sz="6" w:space="0" w:color="000000"/>
+              <w:left w:val="single" w:sz="6" w:space="0" w:color="000000"/>
+              <w:bottom w:val="single" w:sz="6" w:space="0" w:color="000000"/>
+              <w:right w:val="single" w:sz="6" w:space="0" w:color="000000"/>
+            </w:tcBorders>
+            <w:shd w:val="clear" w:color="auto" w:fill="FFFFFF"/>
+            <w:tcMar>
+              <w:top w:w="108" w:type="dxa"/>
+              <w:left w:w="108" w:type="dxa"/>
+              <w:bottom w:w="108" w:type="dxa"/>
+              <w:right w:w="108" w:type="dxa"/>
+            </w:tcMar>
+            <w:vAlign w:val="center"/>
+          </w:tcPr>
+          <w:p>
+            <w:pPr>
+              <w:spacing w:before="360" w:after="360" w:line="264" w:lineRule="atLeast"/>
+              <w:rPr>
+                <w:rFonts w:ascii="Times New Roman" w:eastAsia="Times New Roman" w:hAnsi="Times New Roman" w:cs="Times New Roman"/>
+                <w:color w:val="000000" w:themeColor="text1"/>
+                <w:kern w:val="0"/>
+                <w:sz w:val="16"/>
+                <w:szCs w:val="16"/>
+                <w:lang w:eastAsia="en-GB"/>
+                <w14:ligatures w14:val="none"/>
+              </w:rPr>
+            </w:pPr>
+            <w:r>
+              <w:rPr>
+                <w:rFonts w:ascii="Times New Roman" w:eastAsia="Times New Roman" w:hAnsi="Times New Roman" w:cs="Times New Roman"/>
+                <w:color w:val="000000" w:themeColor="text1"/>
+                <w:kern w:val="0"/>
+                <w:sz w:val="16"/>
+                <w:szCs w:val="16"/>
+                <w:lang w:eastAsia="en-GB"/>
+                <w14:ligatures w14:val="none"/>
+              </w:rPr>
+              <w:t>“UML Activity Diagram Added”</w:t>
+            </w:r>
+          </w:p>
+        </w:tc>
+        <w:tc>
+          <w:tcPr>
+            <w:tcW w:w="0" w:type="auto"/>
+            <w:tcBorders>
+              <w:top w:val="single" w:sz="6" w:space="0" w:color="000000"/>
+              <w:left w:val="single" w:sz="6" w:space="0" w:color="000000"/>
+              <w:bottom w:val="single" w:sz="6" w:space="0" w:color="000000"/>
+              <w:right w:val="single" w:sz="6" w:space="0" w:color="000000"/>
+            </w:tcBorders>
+            <w:shd w:val="clear" w:color="auto" w:fill="FFFFFF"/>
+            <w:tcMar>
+              <w:top w:w="108" w:type="dxa"/>
+              <w:left w:w="108" w:type="dxa"/>
+              <w:bottom w:w="108" w:type="dxa"/>
+              <w:right w:w="108" w:type="dxa"/>
+            </w:tcMar>
+            <w:vAlign w:val="center"/>
+          </w:tcPr>
+          <w:p>
+            <w:pPr>
+              <w:spacing w:before="360" w:after="360" w:line="264" w:lineRule="atLeast"/>
+              <w:rPr>
+                <w:rFonts w:ascii="Times New Roman" w:eastAsia="Times New Roman" w:hAnsi="Times New Roman" w:cs="Times New Roman"/>
+                <w:color w:val="000000" w:themeColor="text1"/>
+                <w:kern w:val="0"/>
+                <w:sz w:val="16"/>
+                <w:szCs w:val="16"/>
+                <w:lang w:eastAsia="en-GB"/>
+                <w14:ligatures w14:val="none"/>
+              </w:rPr>
+            </w:pPr>
+            <w:r>
+              <w:rPr>
+                <w:rFonts w:ascii="Times New Roman" w:eastAsia="Times New Roman" w:hAnsi="Times New Roman" w:cs="Times New Roman"/>
+                <w:color w:val="000000" w:themeColor="text1"/>
+                <w:kern w:val="0"/>
+                <w:sz w:val="16"/>
+                <w:szCs w:val="16"/>
+                <w:lang w:eastAsia="en-GB"/>
+                <w14:ligatures w14:val="none"/>
+              </w:rPr>
+              <w:t>1.4</w:t>
+            </w:r>
+          </w:p>
+        </w:tc>
+      </w:tr>
     </w:tbl>
     <w:p>
       <w:pPr>
@@ -2470,6 +2669,7 @@
           <w:lang w:eastAsia="en-GB"/>
           <w14:ligatures w14:val="none"/>
         </w:rPr>
+        <w:lastRenderedPageBreak/>
         <w:t>2.3. User Classes and Characteris</w:t>
       </w:r>
       <w:r>
@@ -2516,7 +2716,6 @@
           <w:lang w:val="tr-TR" w:eastAsia="en-GB"/>
           <w14:ligatures w14:val="none"/>
         </w:rPr>
-        <w:lastRenderedPageBreak/>
         <w:drawing>
           <wp:inline distT="0" distB="0" distL="0" distR="0" wp14:anchorId="637BE7FA" wp14:editId="4254FB94">
             <wp:extent cx="3970020" cy="2977735"/>
@@ -2726,6 +2925,132 @@
         <w:jc w:val="both"/>
         <w:rPr>
           <w:rFonts w:ascii="Times New Roman" w:eastAsia="Times New Roman" w:hAnsi="Times New Roman" w:cs="Times New Roman"/>
+          <w:b/>
+          <w:bCs/>
+          <w:color w:val="000000" w:themeColor="text1"/>
+          <w:kern w:val="0"/>
+          <w:sz w:val="20"/>
+          <w:szCs w:val="20"/>
+          <w:lang w:eastAsia="en-GB"/>
+          <w14:ligatures w14:val="none"/>
+        </w:rPr>
+      </w:pPr>
+      <w:r>
+        <w:rPr>
+          <w:rFonts w:ascii="Times New Roman" w:hAnsi="Times New Roman" w:cs="Times New Roman"/>
+          <w:noProof/>
+        </w:rPr>
+        <w:drawing>
+          <wp:anchor distT="0" distB="0" distL="114300" distR="114300" simplePos="0" relativeHeight="251659264" behindDoc="0" locked="0" layoutInCell="1" allowOverlap="1" wp14:anchorId="01CC31EB" wp14:editId="6446711C">
+            <wp:simplePos x="0" y="0"/>
+            <wp:positionH relativeFrom="column">
+              <wp:posOffset>0</wp:posOffset>
+            </wp:positionH>
+            <wp:positionV relativeFrom="paragraph">
+              <wp:posOffset>295910</wp:posOffset>
+            </wp:positionV>
+            <wp:extent cx="5731510" cy="2195195"/>
+            <wp:effectExtent l="0" t="0" r="2540" b="0"/>
+            <wp:wrapSquare wrapText="bothSides"/>
+            <wp:docPr id="108236790" name="Resim 1"/>
+            <wp:cNvGraphicFramePr>
+              <a:graphicFrameLocks xmlns:a="http://schemas.openxmlformats.org/drawingml/2006/main" noChangeAspect="1"/>
+            </wp:cNvGraphicFramePr>
+            <a:graphic xmlns:a="http://schemas.openxmlformats.org/drawingml/2006/main">
+              <a:graphicData uri="http://schemas.openxmlformats.org/drawingml/2006/picture">
+                <pic:pic xmlns:pic="http://schemas.openxmlformats.org/drawingml/2006/picture">
+                  <pic:nvPicPr>
+                    <pic:cNvPr id="0" name="Picture 1"/>
+                    <pic:cNvPicPr>
+                      <a:picLocks noChangeAspect="1" noChangeArrowheads="1"/>
+                    </pic:cNvPicPr>
+                  </pic:nvPicPr>
+                  <pic:blipFill>
+                    <a:blip r:embed="rId7" cstate="print">
+                      <a:extLst>
+                        <a:ext uri="{28A0092B-C50C-407E-A947-70E740481C1C}">
+                          <a14:useLocalDpi xmlns:a14="http://schemas.microsoft.com/office/drawing/2010/main" val="0"/>
+                        </a:ext>
+                      </a:extLst>
+                    </a:blip>
+                    <a:srcRect/>
+                    <a:stretch>
+                      <a:fillRect/>
+                    </a:stretch>
+                  </pic:blipFill>
+                  <pic:spPr bwMode="auto">
+                    <a:xfrm>
+                      <a:off x="0" y="0"/>
+                      <a:ext cx="5731510" cy="2195195"/>
+                    </a:xfrm>
+                    <a:prstGeom prst="rect">
+                      <a:avLst/>
+                    </a:prstGeom>
+                    <a:noFill/>
+                    <a:ln>
+                      <a:noFill/>
+                    </a:ln>
+                  </pic:spPr>
+                </pic:pic>
+              </a:graphicData>
+            </a:graphic>
+          </wp:anchor>
+        </w:drawing>
+      </w:r>
+    </w:p>
+    <w:p>
+      <w:pPr>
+        <w:shd w:val="clear" w:color="auto" w:fill="FFFFFF"/>
+        <w:spacing w:before="240" w:after="0" w:line="240" w:lineRule="auto"/>
+        <w:jc w:val="both"/>
+        <w:rPr>
+          <w:rFonts w:ascii="Times New Roman" w:eastAsia="Times New Roman" w:hAnsi="Times New Roman" w:cs="Times New Roman"/>
+          <w:color w:val="000000" w:themeColor="text1"/>
+          <w:kern w:val="0"/>
+          <w:sz w:val="20"/>
+          <w:szCs w:val="20"/>
+          <w:lang w:eastAsia="en-GB"/>
+          <w14:ligatures w14:val="none"/>
+        </w:rPr>
+      </w:pPr>
+      <w:r>
+        <w:rPr>
+          <w:rFonts w:ascii="Times New Roman" w:eastAsia="Times New Roman" w:hAnsi="Times New Roman" w:cs="Times New Roman"/>
+          <w:color w:val="000000" w:themeColor="text1"/>
+          <w:kern w:val="0"/>
+          <w:sz w:val="20"/>
+          <w:szCs w:val="20"/>
+          <w:lang w:eastAsia="en-GB"/>
+          <w14:ligatures w14:val="none"/>
+        </w:rPr>
+        <w:t>When the system is turned on, the user is given the option of Manual or Automatic mode. In automatic mode, the system constantly monitors the occupancy rate in the house. If there is no one at home, it switches to 'Energy Saving' mode; If someone has it, they adjust the air conditioning unit until it reaches the target temperature.</w:t>
+      </w:r>
+    </w:p>
+    <w:p>
+      <w:pPr>
+        <w:shd w:val="clear" w:color="auto" w:fill="FFFFFF"/>
+        <w:spacing w:before="240" w:after="0" w:line="240" w:lineRule="auto"/>
+        <w:jc w:val="both"/>
+        <w:rPr>
+          <w:rFonts w:ascii="Times New Roman" w:eastAsia="Times New Roman" w:hAnsi="Times New Roman" w:cs="Times New Roman"/>
+          <w:b/>
+          <w:bCs/>
+          <w:color w:val="000000" w:themeColor="text1"/>
+          <w:kern w:val="0"/>
+          <w:sz w:val="20"/>
+          <w:szCs w:val="20"/>
+          <w:lang w:eastAsia="en-GB"/>
+          <w14:ligatures w14:val="none"/>
+        </w:rPr>
+      </w:pPr>
+    </w:p>
+    <w:p>
+      <w:pPr>
+        <w:shd w:val="clear" w:color="auto" w:fill="FFFFFF"/>
+        <w:spacing w:before="240" w:after="0" w:line="240" w:lineRule="auto"/>
+        <w:jc w:val="both"/>
+        <w:rPr>
+          <w:rFonts w:ascii="Times New Roman" w:eastAsia="Times New Roman" w:hAnsi="Times New Roman" w:cs="Times New Roman"/>
           <w:color w:val="000000" w:themeColor="text1"/>
           <w:kern w:val="0"/>
           <w:sz w:val="20"/>
@@ -2776,6 +3101,7 @@
           <w:lang w:eastAsia="en-GB"/>
           <w14:ligatures w14:val="none"/>
         </w:rPr>
+        <w:lastRenderedPageBreak/>
         <w:t>4.1. User Interfaces Overview</w:t>
       </w:r>
     </w:p>
@@ -3136,7 +3462,6 @@
           <w:lang w:eastAsia="en-GB"/>
           <w14:ligatures w14:val="none"/>
         </w:rPr>
-        <w:lastRenderedPageBreak/>
         <w:t>REQ-1.1: System shall detect human count in the house using sensors.</w:t>
       </w:r>
     </w:p>
@@ -3165,7 +3490,33 @@
           <w:lang w:eastAsia="en-GB"/>
           <w14:ligatures w14:val="none"/>
         </w:rPr>
-        <w:t xml:space="preserve">REQ-1.2: When human count in house is zero system, shall turn of the all climate units </w:t>
+        <w:t xml:space="preserve">REQ-1.2: When human count in house is zero system, shall turn of the </w:t>
+      </w:r>
+      <w:proofErr w:type="gramStart"/>
+      <w:r>
+        <w:rPr>
+          <w:rFonts w:ascii="Times New Roman" w:eastAsia="Times New Roman" w:hAnsi="Times New Roman" w:cs="Times New Roman"/>
+          <w:color w:val="000000" w:themeColor="text1"/>
+          <w:kern w:val="0"/>
+          <w:sz w:val="20"/>
+          <w:szCs w:val="20"/>
+          <w:lang w:eastAsia="en-GB"/>
+          <w14:ligatures w14:val="none"/>
+        </w:rPr>
+        <w:t>all climate</w:t>
+      </w:r>
+      <w:proofErr w:type="gramEnd"/>
+      <w:r>
+        <w:rPr>
+          <w:rFonts w:ascii="Times New Roman" w:eastAsia="Times New Roman" w:hAnsi="Times New Roman" w:cs="Times New Roman"/>
+          <w:color w:val="000000" w:themeColor="text1"/>
+          <w:kern w:val="0"/>
+          <w:sz w:val="20"/>
+          <w:szCs w:val="20"/>
+          <w:lang w:eastAsia="en-GB"/>
+          <w14:ligatures w14:val="none"/>
+        </w:rPr>
+        <w:t xml:space="preserve"> units </w:t>
       </w:r>
     </w:p>
     <w:p>
@@ -3381,7 +3732,33 @@
           <w:lang w:eastAsia="en-GB"/>
           <w14:ligatures w14:val="none"/>
         </w:rPr>
-        <w:t>NF-1.2: The situation of house shall recorded securely using encryption.</w:t>
+        <w:t xml:space="preserve">NF-1.2: The situation of house shall </w:t>
+      </w:r>
+      <w:proofErr w:type="gramStart"/>
+      <w:r>
+        <w:rPr>
+          <w:rFonts w:ascii="Times New Roman" w:eastAsia="Times New Roman" w:hAnsi="Times New Roman" w:cs="Times New Roman"/>
+          <w:color w:val="000000" w:themeColor="text1"/>
+          <w:kern w:val="0"/>
+          <w:sz w:val="20"/>
+          <w:szCs w:val="20"/>
+          <w:lang w:eastAsia="en-GB"/>
+          <w14:ligatures w14:val="none"/>
+        </w:rPr>
+        <w:t>recorded</w:t>
+      </w:r>
+      <w:proofErr w:type="gramEnd"/>
+      <w:r>
+        <w:rPr>
+          <w:rFonts w:ascii="Times New Roman" w:eastAsia="Times New Roman" w:hAnsi="Times New Roman" w:cs="Times New Roman"/>
+          <w:color w:val="000000" w:themeColor="text1"/>
+          <w:kern w:val="0"/>
+          <w:sz w:val="20"/>
+          <w:szCs w:val="20"/>
+          <w:lang w:eastAsia="en-GB"/>
+          <w14:ligatures w14:val="none"/>
+        </w:rPr>
+        <w:t xml:space="preserve"> securely using encryption.</w:t>
       </w:r>
     </w:p>
     <w:p>

</xml_diff>

<commit_message>
UML Sequence Diagram Added
</commit_message>
<xml_diff>
--- a/Srs Document/Home Tempature Adjustment System Srs.docx
+++ b/Srs Document/Home Tempature Adjustment System Srs.docx
@@ -1911,6 +1911,191 @@
           </w:p>
         </w:tc>
       </w:tr>
+      <w:tr>
+        <w:trPr>
+          <w:trHeight w:val="836"/>
+        </w:trPr>
+        <w:tc>
+          <w:tcPr>
+            <w:tcW w:w="0" w:type="auto"/>
+            <w:tcBorders>
+              <w:top w:val="single" w:sz="6" w:space="0" w:color="000000"/>
+              <w:left w:val="single" w:sz="6" w:space="0" w:color="000000"/>
+              <w:bottom w:val="single" w:sz="6" w:space="0" w:color="000000"/>
+              <w:right w:val="single" w:sz="6" w:space="0" w:color="000000"/>
+            </w:tcBorders>
+            <w:shd w:val="clear" w:color="auto" w:fill="FFFFFF"/>
+            <w:tcMar>
+              <w:top w:w="108" w:type="dxa"/>
+              <w:left w:w="108" w:type="dxa"/>
+              <w:bottom w:w="108" w:type="dxa"/>
+              <w:right w:w="108" w:type="dxa"/>
+            </w:tcMar>
+            <w:vAlign w:val="center"/>
+          </w:tcPr>
+          <w:p>
+            <w:pPr>
+              <w:spacing w:before="360" w:after="360" w:line="264" w:lineRule="atLeast"/>
+              <w:rPr>
+                <w:rFonts w:ascii="Times New Roman" w:eastAsia="Times New Roman" w:hAnsi="Times New Roman" w:cs="Times New Roman"/>
+                <w:color w:val="000000" w:themeColor="text1"/>
+                <w:kern w:val="0"/>
+                <w:sz w:val="16"/>
+                <w:szCs w:val="16"/>
+                <w:lang w:eastAsia="en-GB"/>
+                <w14:ligatures w14:val="none"/>
+              </w:rPr>
+            </w:pPr>
+            <w:r>
+              <w:rPr>
+                <w:rFonts w:ascii="Times New Roman" w:eastAsia="Times New Roman" w:hAnsi="Times New Roman" w:cs="Times New Roman"/>
+                <w:color w:val="000000" w:themeColor="text1"/>
+                <w:kern w:val="0"/>
+                <w:sz w:val="16"/>
+                <w:szCs w:val="16"/>
+                <w:lang w:eastAsia="en-GB"/>
+                <w14:ligatures w14:val="none"/>
+              </w:rPr>
+              <w:t>Ahmet Talha Sivrikaya</w:t>
+            </w:r>
+          </w:p>
+        </w:tc>
+        <w:tc>
+          <w:tcPr>
+            <w:tcW w:w="0" w:type="auto"/>
+            <w:tcBorders>
+              <w:top w:val="single" w:sz="6" w:space="0" w:color="000000"/>
+              <w:left w:val="single" w:sz="6" w:space="0" w:color="000000"/>
+              <w:bottom w:val="single" w:sz="6" w:space="0" w:color="000000"/>
+              <w:right w:val="single" w:sz="6" w:space="0" w:color="000000"/>
+            </w:tcBorders>
+            <w:shd w:val="clear" w:color="auto" w:fill="FFFFFF"/>
+            <w:tcMar>
+              <w:top w:w="108" w:type="dxa"/>
+              <w:left w:w="108" w:type="dxa"/>
+              <w:bottom w:w="108" w:type="dxa"/>
+              <w:right w:w="108" w:type="dxa"/>
+            </w:tcMar>
+            <w:vAlign w:val="center"/>
+          </w:tcPr>
+          <w:p>
+            <w:pPr>
+              <w:spacing w:before="360" w:after="360" w:line="264" w:lineRule="atLeast"/>
+              <w:rPr>
+                <w:rFonts w:ascii="Times New Roman" w:eastAsia="Times New Roman" w:hAnsi="Times New Roman" w:cs="Times New Roman"/>
+                <w:color w:val="000000" w:themeColor="text1"/>
+                <w:kern w:val="0"/>
+                <w:sz w:val="16"/>
+                <w:szCs w:val="16"/>
+                <w:lang w:eastAsia="en-GB"/>
+                <w14:ligatures w14:val="none"/>
+              </w:rPr>
+            </w:pPr>
+            <w:r>
+              <w:rPr>
+                <w:rFonts w:ascii="Times New Roman" w:eastAsia="Times New Roman" w:hAnsi="Times New Roman" w:cs="Times New Roman"/>
+                <w:color w:val="000000" w:themeColor="text1"/>
+                <w:kern w:val="0"/>
+                <w:sz w:val="16"/>
+                <w:szCs w:val="16"/>
+                <w:lang w:eastAsia="en-GB"/>
+                <w14:ligatures w14:val="none"/>
+              </w:rPr>
+              <w:t>24.04.2026</w:t>
+            </w:r>
+          </w:p>
+        </w:tc>
+        <w:tc>
+          <w:tcPr>
+            <w:tcW w:w="0" w:type="auto"/>
+            <w:tcBorders>
+              <w:top w:val="single" w:sz="6" w:space="0" w:color="000000"/>
+              <w:left w:val="single" w:sz="6" w:space="0" w:color="000000"/>
+              <w:bottom w:val="single" w:sz="6" w:space="0" w:color="000000"/>
+              <w:right w:val="single" w:sz="6" w:space="0" w:color="000000"/>
+            </w:tcBorders>
+            <w:shd w:val="clear" w:color="auto" w:fill="FFFFFF"/>
+            <w:tcMar>
+              <w:top w:w="108" w:type="dxa"/>
+              <w:left w:w="108" w:type="dxa"/>
+              <w:bottom w:w="108" w:type="dxa"/>
+              <w:right w:w="108" w:type="dxa"/>
+            </w:tcMar>
+            <w:vAlign w:val="center"/>
+          </w:tcPr>
+          <w:p>
+            <w:pPr>
+              <w:spacing w:before="360" w:after="360" w:line="264" w:lineRule="atLeast"/>
+              <w:rPr>
+                <w:rFonts w:ascii="Times New Roman" w:eastAsia="Times New Roman" w:hAnsi="Times New Roman" w:cs="Times New Roman"/>
+                <w:color w:val="000000" w:themeColor="text1"/>
+                <w:kern w:val="0"/>
+                <w:sz w:val="16"/>
+                <w:szCs w:val="16"/>
+                <w:lang w:eastAsia="en-GB"/>
+                <w14:ligatures w14:val="none"/>
+              </w:rPr>
+            </w:pPr>
+            <w:r>
+              <w:rPr>
+                <w:rFonts w:ascii="Times New Roman" w:eastAsia="Times New Roman" w:hAnsi="Times New Roman" w:cs="Times New Roman"/>
+                <w:color w:val="000000" w:themeColor="text1"/>
+                <w:kern w:val="0"/>
+                <w:sz w:val="16"/>
+                <w:szCs w:val="16"/>
+                <w:lang w:eastAsia="en-GB"/>
+                <w14:ligatures w14:val="none"/>
+              </w:rPr>
+              <w:t>“UML Sequence Diagram Added”</w:t>
+            </w:r>
+          </w:p>
+        </w:tc>
+        <w:tc>
+          <w:tcPr>
+            <w:tcW w:w="0" w:type="auto"/>
+            <w:tcBorders>
+              <w:top w:val="single" w:sz="6" w:space="0" w:color="000000"/>
+              <w:left w:val="single" w:sz="6" w:space="0" w:color="000000"/>
+              <w:bottom w:val="single" w:sz="6" w:space="0" w:color="000000"/>
+              <w:right w:val="single" w:sz="6" w:space="0" w:color="000000"/>
+            </w:tcBorders>
+            <w:shd w:val="clear" w:color="auto" w:fill="FFFFFF"/>
+            <w:tcMar>
+              <w:top w:w="108" w:type="dxa"/>
+              <w:left w:w="108" w:type="dxa"/>
+              <w:bottom w:w="108" w:type="dxa"/>
+              <w:right w:w="108" w:type="dxa"/>
+            </w:tcMar>
+            <w:vAlign w:val="center"/>
+          </w:tcPr>
+          <w:p>
+            <w:pPr>
+              <w:spacing w:before="360" w:after="360" w:line="264" w:lineRule="atLeast"/>
+              <w:rPr>
+                <w:rFonts w:ascii="Times New Roman" w:eastAsia="Times New Roman" w:hAnsi="Times New Roman" w:cs="Times New Roman"/>
+                <w:color w:val="000000" w:themeColor="text1"/>
+                <w:kern w:val="0"/>
+                <w:sz w:val="16"/>
+                <w:szCs w:val="16"/>
+                <w:lang w:eastAsia="en-GB"/>
+                <w14:ligatures w14:val="none"/>
+              </w:rPr>
+            </w:pPr>
+            <w:r>
+              <w:rPr>
+                <w:rFonts w:ascii="Times New Roman" w:eastAsia="Times New Roman" w:hAnsi="Times New Roman" w:cs="Times New Roman"/>
+                <w:color w:val="000000" w:themeColor="text1"/>
+                <w:kern w:val="0"/>
+                <w:sz w:val="16"/>
+                <w:szCs w:val="16"/>
+                <w:lang w:eastAsia="en-GB"/>
+                <w14:ligatures w14:val="none"/>
+              </w:rPr>
+              <w:t>1.5</w:t>
+            </w:r>
+          </w:p>
+        </w:tc>
+      </w:tr>
     </w:tbl>
     <w:p>
       <w:pPr>
@@ -2560,6 +2745,7 @@
           <w:rFonts w:ascii="Times New Roman" w:hAnsi="Times New Roman" w:cs="Times New Roman"/>
           <w:noProof/>
         </w:rPr>
+        <w:lastRenderedPageBreak/>
         <w:drawing>
           <wp:inline distT="0" distB="0" distL="0" distR="0" wp14:anchorId="06EBEC48" wp14:editId="279FAD77">
             <wp:extent cx="5731510" cy="2962275"/>
@@ -2669,7 +2855,6 @@
           <w:lang w:eastAsia="en-GB"/>
           <w14:ligatures w14:val="none"/>
         </w:rPr>
-        <w:lastRenderedPageBreak/>
         <w:t>2.3. User Classes and Characteris</w:t>
       </w:r>
       <w:r>
@@ -2940,6 +3125,7 @@
           <w:rFonts w:ascii="Times New Roman" w:hAnsi="Times New Roman" w:cs="Times New Roman"/>
           <w:noProof/>
         </w:rPr>
+        <w:lastRenderedPageBreak/>
         <w:drawing>
           <wp:anchor distT="0" distB="0" distL="114300" distR="114300" simplePos="0" relativeHeight="251659264" behindDoc="0" locked="0" layoutInCell="1" allowOverlap="1" wp14:anchorId="01CC31EB" wp14:editId="6446711C">
             <wp:simplePos x="0" y="0"/>
@@ -3101,8 +3287,416 @@
           <w:lang w:eastAsia="en-GB"/>
           <w14:ligatures w14:val="none"/>
         </w:rPr>
+        <w:t>4.1. User Interfaces Overview</w:t>
+      </w:r>
+    </w:p>
+    <w:p>
+      <w:pPr>
+        <w:shd w:val="clear" w:color="auto" w:fill="FFFFFF"/>
+        <w:spacing w:before="240" w:after="0" w:line="240" w:lineRule="auto"/>
+        <w:jc w:val="both"/>
+        <w:rPr>
+          <w:rFonts w:ascii="Times New Roman" w:eastAsia="Times New Roman" w:hAnsi="Times New Roman" w:cs="Times New Roman"/>
+          <w:color w:val="000000" w:themeColor="text1"/>
+          <w:kern w:val="0"/>
+          <w:sz w:val="20"/>
+          <w:szCs w:val="20"/>
+          <w:lang w:eastAsia="en-GB"/>
+          <w14:ligatures w14:val="none"/>
+        </w:rPr>
+      </w:pPr>
+      <w:r>
+        <w:rPr>
+          <w:rFonts w:ascii="Times New Roman" w:eastAsia="Times New Roman" w:hAnsi="Times New Roman" w:cs="Times New Roman"/>
+          <w:b/>
+          <w:bCs/>
+          <w:color w:val="000000" w:themeColor="text1"/>
+          <w:kern w:val="0"/>
+          <w:sz w:val="20"/>
+          <w:szCs w:val="20"/>
+          <w:lang w:eastAsia="en-GB"/>
+          <w14:ligatures w14:val="none"/>
+        </w:rPr>
+        <w:t>4.2. Hardware Interfaces</w:t>
+      </w:r>
+    </w:p>
+    <w:p>
+      <w:pPr>
+        <w:shd w:val="clear" w:color="auto" w:fill="FFFFFF"/>
+        <w:spacing w:before="240" w:after="0" w:line="240" w:lineRule="auto"/>
+        <w:jc w:val="both"/>
+        <w:rPr>
+          <w:rFonts w:ascii="Times New Roman" w:eastAsia="Times New Roman" w:hAnsi="Times New Roman" w:cs="Times New Roman"/>
+          <w:color w:val="000000" w:themeColor="text1"/>
+          <w:kern w:val="0"/>
+          <w:sz w:val="20"/>
+          <w:szCs w:val="20"/>
+          <w:lang w:eastAsia="en-GB"/>
+          <w14:ligatures w14:val="none"/>
+        </w:rPr>
+      </w:pPr>
+      <w:r>
+        <w:rPr>
+          <w:rFonts w:ascii="Times New Roman" w:eastAsia="Times New Roman" w:hAnsi="Times New Roman" w:cs="Times New Roman"/>
+          <w:b/>
+          <w:bCs/>
+          <w:color w:val="000000" w:themeColor="text1"/>
+          <w:kern w:val="0"/>
+          <w:sz w:val="20"/>
+          <w:szCs w:val="20"/>
+          <w:lang w:eastAsia="en-GB"/>
+          <w14:ligatures w14:val="none"/>
+        </w:rPr>
+        <w:t>4.3. Software Interfaces</w:t>
+      </w:r>
+    </w:p>
+    <w:p>
+      <w:pPr>
+        <w:shd w:val="clear" w:color="auto" w:fill="FFFFFF"/>
+        <w:spacing w:before="240" w:after="0" w:line="240" w:lineRule="auto"/>
+        <w:jc w:val="both"/>
+        <w:rPr>
+          <w:rFonts w:ascii="Times New Roman" w:eastAsia="Times New Roman" w:hAnsi="Times New Roman" w:cs="Times New Roman"/>
+          <w:color w:val="000000" w:themeColor="text1"/>
+          <w:kern w:val="0"/>
+          <w:sz w:val="20"/>
+          <w:szCs w:val="20"/>
+          <w:lang w:eastAsia="en-GB"/>
+          <w14:ligatures w14:val="none"/>
+        </w:rPr>
+      </w:pPr>
+      <w:r>
+        <w:rPr>
+          <w:rFonts w:ascii="Times New Roman" w:eastAsia="Times New Roman" w:hAnsi="Times New Roman" w:cs="Times New Roman"/>
+          <w:b/>
+          <w:bCs/>
+          <w:color w:val="000000" w:themeColor="text1"/>
+          <w:kern w:val="0"/>
+          <w:sz w:val="20"/>
+          <w:szCs w:val="20"/>
+          <w:lang w:eastAsia="en-GB"/>
+          <w14:ligatures w14:val="none"/>
+        </w:rPr>
+        <w:t>5. System Features/Modules</w:t>
+      </w:r>
+    </w:p>
+    <w:p>
+      <w:pPr>
+        <w:shd w:val="clear" w:color="auto" w:fill="FFFFFF"/>
+        <w:spacing w:before="240" w:after="0" w:line="240" w:lineRule="auto"/>
+        <w:jc w:val="both"/>
+        <w:rPr>
+          <w:rFonts w:ascii="Times New Roman" w:eastAsia="Times New Roman" w:hAnsi="Times New Roman" w:cs="Times New Roman"/>
+          <w:b/>
+          <w:bCs/>
+          <w:color w:val="000000" w:themeColor="text1"/>
+          <w:kern w:val="0"/>
+          <w:sz w:val="20"/>
+          <w:szCs w:val="20"/>
+          <w:lang w:eastAsia="en-GB"/>
+          <w14:ligatures w14:val="none"/>
+        </w:rPr>
+      </w:pPr>
+      <w:r>
+        <w:rPr>
+          <w:rFonts w:ascii="Times New Roman" w:eastAsia="Times New Roman" w:hAnsi="Times New Roman" w:cs="Times New Roman"/>
+          <w:b/>
+          <w:bCs/>
+          <w:color w:val="000000" w:themeColor="text1"/>
+          <w:kern w:val="0"/>
+          <w:sz w:val="20"/>
+          <w:szCs w:val="20"/>
+          <w:lang w:eastAsia="en-GB"/>
+          <w14:ligatures w14:val="none"/>
+        </w:rPr>
+        <w:t>5.1 System Feature Name</w:t>
+      </w:r>
+    </w:p>
+    <w:p>
+      <w:pPr>
+        <w:shd w:val="clear" w:color="auto" w:fill="FFFFFF"/>
+        <w:spacing w:before="240" w:after="0" w:line="240" w:lineRule="auto"/>
+        <w:jc w:val="both"/>
+        <w:rPr>
+          <w:rFonts w:ascii="Times New Roman" w:eastAsia="Times New Roman" w:hAnsi="Times New Roman" w:cs="Times New Roman"/>
+          <w:color w:val="000000" w:themeColor="text1"/>
+          <w:kern w:val="0"/>
+          <w:sz w:val="20"/>
+          <w:szCs w:val="20"/>
+          <w:lang w:eastAsia="en-GB"/>
+          <w14:ligatures w14:val="none"/>
+        </w:rPr>
+      </w:pPr>
+      <w:r>
+        <w:rPr>
+          <w:rFonts w:ascii="Times New Roman" w:eastAsia="Times New Roman" w:hAnsi="Times New Roman" w:cs="Times New Roman"/>
+          <w:b/>
+          <w:bCs/>
+          <w:color w:val="000000" w:themeColor="text1"/>
+          <w:kern w:val="0"/>
+          <w:sz w:val="20"/>
+          <w:szCs w:val="20"/>
+          <w:lang w:eastAsia="en-GB"/>
+          <w14:ligatures w14:val="none"/>
+        </w:rPr>
+        <w:t>5.1.</w:t>
+      </w:r>
+      <w:r>
+        <w:rPr>
+          <w:rFonts w:ascii="Times New Roman" w:eastAsia="Times New Roman" w:hAnsi="Times New Roman" w:cs="Times New Roman"/>
+          <w:b/>
+          <w:bCs/>
+          <w:color w:val="000000" w:themeColor="text1"/>
+          <w:kern w:val="0"/>
+          <w:sz w:val="20"/>
+          <w:szCs w:val="20"/>
+          <w:lang w:eastAsia="en-GB"/>
+          <w14:ligatures w14:val="none"/>
+        </w:rPr>
+        <w:t>1.</w:t>
+      </w:r>
+      <w:r>
+        <w:rPr>
+          <w:rFonts w:ascii="Times New Roman" w:eastAsia="Times New Roman" w:hAnsi="Times New Roman" w:cs="Times New Roman"/>
+          <w:b/>
+          <w:bCs/>
+          <w:color w:val="000000" w:themeColor="text1"/>
+          <w:kern w:val="0"/>
+          <w:sz w:val="20"/>
+          <w:szCs w:val="20"/>
+          <w:lang w:eastAsia="en-GB"/>
+          <w14:ligatures w14:val="none"/>
+        </w:rPr>
+        <w:t xml:space="preserve"> Description and Priority</w:t>
+      </w:r>
+    </w:p>
+    <w:p>
+      <w:pPr>
+        <w:shd w:val="clear" w:color="auto" w:fill="FFFFFF"/>
+        <w:spacing w:before="240" w:after="0" w:line="240" w:lineRule="auto"/>
+        <w:jc w:val="both"/>
+        <w:rPr>
+          <w:rFonts w:ascii="Times New Roman" w:eastAsia="Times New Roman" w:hAnsi="Times New Roman" w:cs="Times New Roman"/>
+          <w:b/>
+          <w:bCs/>
+          <w:color w:val="000000" w:themeColor="text1"/>
+          <w:kern w:val="0"/>
+          <w:sz w:val="20"/>
+          <w:szCs w:val="20"/>
+          <w:lang w:eastAsia="en-GB"/>
+          <w14:ligatures w14:val="none"/>
+        </w:rPr>
+      </w:pPr>
+    </w:p>
+    <w:p>
+      <w:pPr>
+        <w:shd w:val="clear" w:color="auto" w:fill="FFFFFF"/>
+        <w:spacing w:before="240" w:after="0" w:line="240" w:lineRule="auto"/>
+        <w:jc w:val="both"/>
+        <w:rPr>
+          <w:rFonts w:ascii="Times New Roman" w:eastAsia="Times New Roman" w:hAnsi="Times New Roman" w:cs="Times New Roman"/>
+          <w:b/>
+          <w:bCs/>
+          <w:color w:val="000000" w:themeColor="text1"/>
+          <w:kern w:val="0"/>
+          <w:sz w:val="20"/>
+          <w:szCs w:val="20"/>
+          <w:lang w:eastAsia="en-GB"/>
+          <w14:ligatures w14:val="none"/>
+        </w:rPr>
+      </w:pPr>
+    </w:p>
+    <w:p>
+      <w:pPr>
+        <w:shd w:val="clear" w:color="auto" w:fill="FFFFFF"/>
+        <w:spacing w:before="240" w:after="0" w:line="240" w:lineRule="auto"/>
+        <w:jc w:val="both"/>
+        <w:rPr>
+          <w:rFonts w:ascii="Times New Roman" w:eastAsia="Times New Roman" w:hAnsi="Times New Roman" w:cs="Times New Roman"/>
+          <w:b/>
+          <w:bCs/>
+          <w:color w:val="000000" w:themeColor="text1"/>
+          <w:kern w:val="0"/>
+          <w:sz w:val="20"/>
+          <w:szCs w:val="20"/>
+          <w:lang w:eastAsia="en-GB"/>
+          <w14:ligatures w14:val="none"/>
+        </w:rPr>
+      </w:pPr>
+    </w:p>
+    <w:p>
+      <w:pPr>
+        <w:shd w:val="clear" w:color="auto" w:fill="FFFFFF"/>
+        <w:spacing w:before="240" w:after="0" w:line="240" w:lineRule="auto"/>
+        <w:jc w:val="both"/>
+        <w:rPr>
+          <w:rFonts w:ascii="Times New Roman" w:eastAsia="Times New Roman" w:hAnsi="Times New Roman" w:cs="Times New Roman"/>
+          <w:b/>
+          <w:bCs/>
+          <w:color w:val="000000" w:themeColor="text1"/>
+          <w:kern w:val="0"/>
+          <w:sz w:val="20"/>
+          <w:szCs w:val="20"/>
+          <w:lang w:eastAsia="en-GB"/>
+          <w14:ligatures w14:val="none"/>
+        </w:rPr>
+      </w:pPr>
+    </w:p>
+    <w:p>
+      <w:pPr>
+        <w:shd w:val="clear" w:color="auto" w:fill="FFFFFF"/>
+        <w:spacing w:before="240" w:after="0" w:line="240" w:lineRule="auto"/>
+        <w:jc w:val="both"/>
+        <w:rPr>
+          <w:rFonts w:ascii="Times New Roman" w:eastAsia="Times New Roman" w:hAnsi="Times New Roman" w:cs="Times New Roman"/>
+          <w:b/>
+          <w:bCs/>
+          <w:color w:val="000000" w:themeColor="text1"/>
+          <w:kern w:val="0"/>
+          <w:sz w:val="20"/>
+          <w:szCs w:val="20"/>
+          <w:lang w:eastAsia="en-GB"/>
+          <w14:ligatures w14:val="none"/>
+        </w:rPr>
+      </w:pPr>
+    </w:p>
+    <w:p>
+      <w:pPr>
+        <w:shd w:val="clear" w:color="auto" w:fill="FFFFFF"/>
+        <w:spacing w:before="240" w:after="0" w:line="240" w:lineRule="auto"/>
+        <w:jc w:val="both"/>
+        <w:rPr>
+          <w:rFonts w:ascii="Times New Roman" w:eastAsia="Times New Roman" w:hAnsi="Times New Roman" w:cs="Times New Roman"/>
+          <w:b/>
+          <w:bCs/>
+          <w:color w:val="000000" w:themeColor="text1"/>
+          <w:kern w:val="0"/>
+          <w:sz w:val="20"/>
+          <w:szCs w:val="20"/>
+          <w:lang w:eastAsia="en-GB"/>
+          <w14:ligatures w14:val="none"/>
+        </w:rPr>
+      </w:pPr>
+    </w:p>
+    <w:p>
+      <w:pPr>
+        <w:shd w:val="clear" w:color="auto" w:fill="FFFFFF"/>
+        <w:spacing w:before="240" w:after="0" w:line="240" w:lineRule="auto"/>
+        <w:jc w:val="both"/>
+        <w:rPr>
+          <w:rFonts w:ascii="Times New Roman" w:eastAsia="Times New Roman" w:hAnsi="Times New Roman" w:cs="Times New Roman"/>
+          <w:b/>
+          <w:bCs/>
+          <w:color w:val="000000" w:themeColor="text1"/>
+          <w:kern w:val="0"/>
+          <w:sz w:val="20"/>
+          <w:szCs w:val="20"/>
+          <w:lang w:eastAsia="en-GB"/>
+          <w14:ligatures w14:val="none"/>
+        </w:rPr>
+      </w:pPr>
+    </w:p>
+    <w:p>
+      <w:pPr>
+        <w:shd w:val="clear" w:color="auto" w:fill="FFFFFF"/>
+        <w:spacing w:before="240" w:after="0" w:line="240" w:lineRule="auto"/>
+        <w:jc w:val="both"/>
+        <w:rPr>
+          <w:rFonts w:ascii="Times New Roman" w:eastAsia="Times New Roman" w:hAnsi="Times New Roman" w:cs="Times New Roman"/>
+          <w:b/>
+          <w:bCs/>
+          <w:color w:val="000000" w:themeColor="text1"/>
+          <w:kern w:val="0"/>
+          <w:sz w:val="20"/>
+          <w:szCs w:val="20"/>
+          <w:lang w:eastAsia="en-GB"/>
+          <w14:ligatures w14:val="none"/>
+        </w:rPr>
+      </w:pPr>
+    </w:p>
+    <w:p>
+      <w:pPr>
+        <w:shd w:val="clear" w:color="auto" w:fill="FFFFFF"/>
+        <w:spacing w:before="240" w:after="0" w:line="240" w:lineRule="auto"/>
+        <w:jc w:val="both"/>
+        <w:rPr>
+          <w:rFonts w:ascii="Times New Roman" w:eastAsia="Times New Roman" w:hAnsi="Times New Roman" w:cs="Times New Roman"/>
+          <w:b/>
+          <w:bCs/>
+          <w:color w:val="000000" w:themeColor="text1"/>
+          <w:kern w:val="0"/>
+          <w:sz w:val="20"/>
+          <w:szCs w:val="20"/>
+          <w:lang w:eastAsia="en-GB"/>
+          <w14:ligatures w14:val="none"/>
+        </w:rPr>
+      </w:pPr>
+    </w:p>
+    <w:p>
+      <w:pPr>
+        <w:shd w:val="clear" w:color="auto" w:fill="FFFFFF"/>
+        <w:spacing w:before="240" w:after="0" w:line="240" w:lineRule="auto"/>
+        <w:jc w:val="both"/>
+        <w:rPr>
+          <w:rFonts w:ascii="Times New Roman" w:eastAsia="Times New Roman" w:hAnsi="Times New Roman" w:cs="Times New Roman"/>
+          <w:b/>
+          <w:bCs/>
+          <w:color w:val="000000" w:themeColor="text1"/>
+          <w:kern w:val="0"/>
+          <w:sz w:val="20"/>
+          <w:szCs w:val="20"/>
+          <w:lang w:eastAsia="en-GB"/>
+          <w14:ligatures w14:val="none"/>
+        </w:rPr>
+      </w:pPr>
+    </w:p>
+    <w:p>
+      <w:pPr>
+        <w:shd w:val="clear" w:color="auto" w:fill="FFFFFF"/>
+        <w:spacing w:before="240" w:after="0" w:line="240" w:lineRule="auto"/>
+        <w:jc w:val="both"/>
+        <w:rPr>
+          <w:rFonts w:ascii="Times New Roman" w:eastAsia="Times New Roman" w:hAnsi="Times New Roman" w:cs="Times New Roman"/>
+          <w:b/>
+          <w:bCs/>
+          <w:color w:val="000000" w:themeColor="text1"/>
+          <w:kern w:val="0"/>
+          <w:sz w:val="20"/>
+          <w:szCs w:val="20"/>
+          <w:lang w:eastAsia="en-GB"/>
+          <w14:ligatures w14:val="none"/>
+        </w:rPr>
+      </w:pPr>
+    </w:p>
+    <w:p>
+      <w:pPr>
+        <w:shd w:val="clear" w:color="auto" w:fill="FFFFFF"/>
+        <w:spacing w:before="240" w:after="0" w:line="240" w:lineRule="auto"/>
+        <w:jc w:val="both"/>
+        <w:rPr>
+          <w:rFonts w:ascii="Times New Roman" w:eastAsia="Times New Roman" w:hAnsi="Times New Roman" w:cs="Times New Roman"/>
+          <w:color w:val="000000" w:themeColor="text1"/>
+          <w:kern w:val="0"/>
+          <w:sz w:val="20"/>
+          <w:szCs w:val="20"/>
+          <w:lang w:eastAsia="en-GB"/>
+          <w14:ligatures w14:val="none"/>
+        </w:rPr>
+      </w:pPr>
+      <w:r>
+        <w:rPr>
+          <w:rFonts w:ascii="Times New Roman" w:eastAsia="Times New Roman" w:hAnsi="Times New Roman" w:cs="Times New Roman"/>
+          <w:b/>
+          <w:bCs/>
+          <w:color w:val="000000" w:themeColor="text1"/>
+          <w:kern w:val="0"/>
+          <w:sz w:val="20"/>
+          <w:szCs w:val="20"/>
+          <w:lang w:eastAsia="en-GB"/>
+          <w14:ligatures w14:val="none"/>
+        </w:rPr>
         <w:lastRenderedPageBreak/>
-        <w:t>4.1. User Interfaces Overview</w:t>
+        <w:t>5.1.2 Stimulus/Response Sequences</w:t>
       </w:r>
     </w:p>
     <w:p>
@@ -3112,27 +3706,69 @@
         <w:jc w:val="both"/>
         <w:rPr>
           <w:rFonts w:ascii="Times New Roman" w:eastAsia="Times New Roman" w:hAnsi="Times New Roman" w:cs="Times New Roman"/>
-          <w:color w:val="000000" w:themeColor="text1"/>
-          <w:kern w:val="0"/>
-          <w:sz w:val="20"/>
-          <w:szCs w:val="20"/>
-          <w:lang w:eastAsia="en-GB"/>
-          <w14:ligatures w14:val="none"/>
-        </w:rPr>
-      </w:pPr>
-      <w:r>
-        <w:rPr>
-          <w:rFonts w:ascii="Times New Roman" w:eastAsia="Times New Roman" w:hAnsi="Times New Roman" w:cs="Times New Roman"/>
-          <w:b/>
-          <w:bCs/>
-          <w:color w:val="000000" w:themeColor="text1"/>
-          <w:kern w:val="0"/>
-          <w:sz w:val="20"/>
-          <w:szCs w:val="20"/>
-          <w:lang w:eastAsia="en-GB"/>
-          <w14:ligatures w14:val="none"/>
-        </w:rPr>
-        <w:t>4.2. Hardware Interfaces</w:t>
+          <w:b/>
+          <w:bCs/>
+          <w:color w:val="000000" w:themeColor="text1"/>
+          <w:kern w:val="0"/>
+          <w:sz w:val="20"/>
+          <w:szCs w:val="20"/>
+          <w:lang w:eastAsia="en-GB"/>
+          <w14:ligatures w14:val="none"/>
+        </w:rPr>
+      </w:pPr>
+      <w:r>
+        <w:rPr>
+          <w:rFonts w:ascii="Times New Roman" w:hAnsi="Times New Roman" w:cs="Times New Roman"/>
+          <w:noProof/>
+        </w:rPr>
+        <w:drawing>
+          <wp:inline distT="0" distB="0" distL="0" distR="0" wp14:anchorId="0F46FF0C" wp14:editId="00B08CDD">
+            <wp:extent cx="4326467" cy="4261278"/>
+            <wp:effectExtent l="0" t="0" r="0" b="6350"/>
+            <wp:docPr id="400781830" name="Resim 2"/>
+            <wp:cNvGraphicFramePr>
+              <a:graphicFrameLocks xmlns:a="http://schemas.openxmlformats.org/drawingml/2006/main" noChangeAspect="1"/>
+            </wp:cNvGraphicFramePr>
+            <a:graphic xmlns:a="http://schemas.openxmlformats.org/drawingml/2006/main">
+              <a:graphicData uri="http://schemas.openxmlformats.org/drawingml/2006/picture">
+                <pic:pic xmlns:pic="http://schemas.openxmlformats.org/drawingml/2006/picture">
+                  <pic:nvPicPr>
+                    <pic:cNvPr id="0" name="Picture 3"/>
+                    <pic:cNvPicPr>
+                      <a:picLocks noChangeAspect="1" noChangeArrowheads="1"/>
+                    </pic:cNvPicPr>
+                  </pic:nvPicPr>
+                  <pic:blipFill>
+                    <a:blip r:embed="rId8" cstate="print">
+                      <a:extLst>
+                        <a:ext uri="{28A0092B-C50C-407E-A947-70E740481C1C}">
+                          <a14:useLocalDpi xmlns:a14="http://schemas.microsoft.com/office/drawing/2010/main" val="0"/>
+                        </a:ext>
+                      </a:extLst>
+                    </a:blip>
+                    <a:srcRect/>
+                    <a:stretch>
+                      <a:fillRect/>
+                    </a:stretch>
+                  </pic:blipFill>
+                  <pic:spPr bwMode="auto">
+                    <a:xfrm>
+                      <a:off x="0" y="0"/>
+                      <a:ext cx="4366217" cy="4300429"/>
+                    </a:xfrm>
+                    <a:prstGeom prst="rect">
+                      <a:avLst/>
+                    </a:prstGeom>
+                    <a:noFill/>
+                    <a:ln>
+                      <a:noFill/>
+                    </a:ln>
+                  </pic:spPr>
+                </pic:pic>
+              </a:graphicData>
+            </a:graphic>
+          </wp:inline>
+        </w:drawing>
       </w:r>
     </w:p>
     <w:p>
@@ -3142,28 +3778,16 @@
         <w:jc w:val="both"/>
         <w:rPr>
           <w:rFonts w:ascii="Times New Roman" w:eastAsia="Times New Roman" w:hAnsi="Times New Roman" w:cs="Times New Roman"/>
-          <w:color w:val="000000" w:themeColor="text1"/>
-          <w:kern w:val="0"/>
-          <w:sz w:val="20"/>
-          <w:szCs w:val="20"/>
-          <w:lang w:eastAsia="en-GB"/>
-          <w14:ligatures w14:val="none"/>
-        </w:rPr>
-      </w:pPr>
-      <w:r>
-        <w:rPr>
-          <w:rFonts w:ascii="Times New Roman" w:eastAsia="Times New Roman" w:hAnsi="Times New Roman" w:cs="Times New Roman"/>
-          <w:b/>
-          <w:bCs/>
-          <w:color w:val="000000" w:themeColor="text1"/>
-          <w:kern w:val="0"/>
-          <w:sz w:val="20"/>
-          <w:szCs w:val="20"/>
-          <w:lang w:eastAsia="en-GB"/>
-          <w14:ligatures w14:val="none"/>
-        </w:rPr>
-        <w:t>4.3. Software Interfaces</w:t>
-      </w:r>
+          <w:b/>
+          <w:bCs/>
+          <w:color w:val="000000" w:themeColor="text1"/>
+          <w:kern w:val="0"/>
+          <w:sz w:val="20"/>
+          <w:szCs w:val="20"/>
+          <w:lang w:eastAsia="en-GB"/>
+          <w14:ligatures w14:val="none"/>
+        </w:rPr>
+      </w:pPr>
     </w:p>
     <w:p>
       <w:pPr>
@@ -3183,16 +3807,104 @@
       <w:r>
         <w:rPr>
           <w:rFonts w:ascii="Times New Roman" w:eastAsia="Times New Roman" w:hAnsi="Times New Roman" w:cs="Times New Roman"/>
-          <w:b/>
-          <w:bCs/>
-          <w:color w:val="000000" w:themeColor="text1"/>
-          <w:kern w:val="0"/>
-          <w:sz w:val="20"/>
-          <w:szCs w:val="20"/>
-          <w:lang w:eastAsia="en-GB"/>
-          <w14:ligatures w14:val="none"/>
-        </w:rPr>
-        <w:t>5. System Features/Modules</w:t>
+          <w:color w:val="000000" w:themeColor="text1"/>
+          <w:kern w:val="0"/>
+          <w:sz w:val="20"/>
+          <w:szCs w:val="20"/>
+          <w:lang w:eastAsia="en-GB"/>
+          <w14:ligatures w14:val="none"/>
+        </w:rPr>
+        <w:t xml:space="preserve">The system reads occupancy and </w:t>
+      </w:r>
+      <w:proofErr w:type="spellStart"/>
+      <w:r>
+        <w:rPr>
+          <w:rFonts w:ascii="Times New Roman" w:eastAsia="Times New Roman" w:hAnsi="Times New Roman" w:cs="Times New Roman"/>
+          <w:color w:val="000000" w:themeColor="text1"/>
+          <w:kern w:val="0"/>
+          <w:sz w:val="20"/>
+          <w:szCs w:val="20"/>
+          <w:lang w:eastAsia="en-GB"/>
+          <w14:ligatures w14:val="none"/>
+        </w:rPr>
+        <w:t>currentTemp</w:t>
+      </w:r>
+      <w:proofErr w:type="spellEnd"/>
+      <w:r>
+        <w:rPr>
+          <w:rFonts w:ascii="Times New Roman" w:eastAsia="Times New Roman" w:hAnsi="Times New Roman" w:cs="Times New Roman"/>
+          <w:color w:val="000000" w:themeColor="text1"/>
+          <w:kern w:val="0"/>
+          <w:sz w:val="20"/>
+          <w:szCs w:val="20"/>
+          <w:lang w:eastAsia="en-GB"/>
+          <w14:ligatures w14:val="none"/>
+        </w:rPr>
+        <w:t xml:space="preserve"> data from the sensors. If automatic mode is selected, it sends the </w:t>
+      </w:r>
+      <w:proofErr w:type="spellStart"/>
+      <w:r>
+        <w:rPr>
+          <w:rFonts w:ascii="Times New Roman" w:eastAsia="Times New Roman" w:hAnsi="Times New Roman" w:cs="Times New Roman"/>
+          <w:color w:val="000000" w:themeColor="text1"/>
+          <w:kern w:val="0"/>
+          <w:sz w:val="20"/>
+          <w:szCs w:val="20"/>
+          <w:lang w:eastAsia="en-GB"/>
+          <w14:ligatures w14:val="none"/>
+        </w:rPr>
+        <w:t>turnOnHeater</w:t>
+      </w:r>
+      <w:proofErr w:type="spellEnd"/>
+      <w:r>
+        <w:rPr>
+          <w:rFonts w:ascii="Times New Roman" w:eastAsia="Times New Roman" w:hAnsi="Times New Roman" w:cs="Times New Roman"/>
+          <w:color w:val="000000" w:themeColor="text1"/>
+          <w:kern w:val="0"/>
+          <w:sz w:val="20"/>
+          <w:szCs w:val="20"/>
+          <w:lang w:eastAsia="en-GB"/>
+          <w14:ligatures w14:val="none"/>
+        </w:rPr>
+        <w:t xml:space="preserve"> command to the air conditioning unit based on this data. If the user wishes, he can switch the system to manual mode with the </w:t>
+      </w:r>
+      <w:proofErr w:type="spellStart"/>
+      <w:r>
+        <w:rPr>
+          <w:rFonts w:ascii="Times New Roman" w:eastAsia="Times New Roman" w:hAnsi="Times New Roman" w:cs="Times New Roman"/>
+          <w:color w:val="000000" w:themeColor="text1"/>
+          <w:kern w:val="0"/>
+          <w:sz w:val="20"/>
+          <w:szCs w:val="20"/>
+          <w:lang w:eastAsia="en-GB"/>
+          <w14:ligatures w14:val="none"/>
+        </w:rPr>
+        <w:t>setTemp</w:t>
+      </w:r>
+      <w:proofErr w:type="spellEnd"/>
+      <w:r>
+        <w:rPr>
+          <w:rFonts w:ascii="Times New Roman" w:eastAsia="Times New Roman" w:hAnsi="Times New Roman" w:cs="Times New Roman"/>
+          <w:color w:val="000000" w:themeColor="text1"/>
+          <w:kern w:val="0"/>
+          <w:sz w:val="20"/>
+          <w:szCs w:val="20"/>
+          <w:lang w:eastAsia="en-GB"/>
+          <w14:ligatures w14:val="none"/>
+        </w:rPr>
+        <w:t xml:space="preserve"> command</w:t>
+      </w:r>
+      <w:r>
+        <w:rPr>
+          <w:rFonts w:ascii="Times New Roman" w:eastAsia="Times New Roman" w:hAnsi="Times New Roman" w:cs="Times New Roman"/>
+          <w:color w:val="000000" w:themeColor="text1"/>
+          <w:kern w:val="0"/>
+          <w:sz w:val="20"/>
+          <w:szCs w:val="20"/>
+          <w:lang w:eastAsia="en-GB"/>
+          <w14:ligatures w14:val="none"/>
+        </w:rPr>
+        <w:t>.</w:t>
       </w:r>
     </w:p>
     <w:p>
@@ -3224,7 +3936,7 @@
           <w:lang w:eastAsia="en-GB"/>
           <w14:ligatures w14:val="none"/>
         </w:rPr>
-        <w:t>5.1 System Feature Name</w:t>
+        <w:t>5.1.3 Functional Requirements</w:t>
       </w:r>
     </w:p>
     <w:p>
@@ -3245,44 +3957,14 @@
       <w:r>
         <w:rPr>
           <w:rFonts w:ascii="Times New Roman" w:eastAsia="Times New Roman" w:hAnsi="Times New Roman" w:cs="Times New Roman"/>
-          <w:b/>
-          <w:bCs/>
-          <w:color w:val="000000" w:themeColor="text1"/>
-          <w:kern w:val="0"/>
-          <w:sz w:val="20"/>
-          <w:szCs w:val="20"/>
-          <w:lang w:eastAsia="en-GB"/>
-          <w14:ligatures w14:val="none"/>
-        </w:rPr>
-        <w:t>5.1.</w:t>
-      </w:r>
-      <w:r>
-        <w:rPr>
-          <w:rFonts w:ascii="Times New Roman" w:eastAsia="Times New Roman" w:hAnsi="Times New Roman" w:cs="Times New Roman"/>
-          <w:b/>
-          <w:bCs/>
-          <w:color w:val="000000" w:themeColor="text1"/>
-          <w:kern w:val="0"/>
-          <w:sz w:val="20"/>
-          <w:szCs w:val="20"/>
-          <w:lang w:eastAsia="en-GB"/>
-          <w14:ligatures w14:val="none"/>
-        </w:rPr>
-        <w:t>1.</w:t>
-      </w:r>
-      <w:r>
-        <w:rPr>
-          <w:rFonts w:ascii="Times New Roman" w:eastAsia="Times New Roman" w:hAnsi="Times New Roman" w:cs="Times New Roman"/>
-          <w:b/>
-          <w:bCs/>
-          <w:color w:val="000000" w:themeColor="text1"/>
-          <w:kern w:val="0"/>
-          <w:sz w:val="20"/>
-          <w:szCs w:val="20"/>
-          <w:lang w:eastAsia="en-GB"/>
-          <w14:ligatures w14:val="none"/>
-        </w:rPr>
-        <w:t xml:space="preserve"> Description and Priority</w:t>
+          <w:color w:val="000000" w:themeColor="text1"/>
+          <w:kern w:val="0"/>
+          <w:sz w:val="20"/>
+          <w:szCs w:val="20"/>
+          <w:lang w:eastAsia="en-GB"/>
+          <w14:ligatures w14:val="none"/>
+        </w:rPr>
+        <w:t>REQ-1.1: System shall detect human count in the house using sensors.</w:t>
       </w:r>
     </w:p>
     <w:p>
@@ -3303,16 +3985,40 @@
       <w:r>
         <w:rPr>
           <w:rFonts w:ascii="Times New Roman" w:eastAsia="Times New Roman" w:hAnsi="Times New Roman" w:cs="Times New Roman"/>
-          <w:b/>
-          <w:bCs/>
-          <w:color w:val="000000" w:themeColor="text1"/>
-          <w:kern w:val="0"/>
-          <w:sz w:val="20"/>
-          <w:szCs w:val="20"/>
-          <w:lang w:eastAsia="en-GB"/>
-          <w14:ligatures w14:val="none"/>
-        </w:rPr>
-        <w:t>5.1.2 Stimulus/Response Sequences</w:t>
+          <w:color w:val="000000" w:themeColor="text1"/>
+          <w:kern w:val="0"/>
+          <w:sz w:val="20"/>
+          <w:szCs w:val="20"/>
+          <w:lang w:eastAsia="en-GB"/>
+          <w14:ligatures w14:val="none"/>
+        </w:rPr>
+        <w:t xml:space="preserve">REQ-1.2: When human count in house is zero system, shall turn of the </w:t>
+      </w:r>
+      <w:proofErr w:type="gramStart"/>
+      <w:r>
+        <w:rPr>
+          <w:rFonts w:ascii="Times New Roman" w:eastAsia="Times New Roman" w:hAnsi="Times New Roman" w:cs="Times New Roman"/>
+          <w:color w:val="000000" w:themeColor="text1"/>
+          <w:kern w:val="0"/>
+          <w:sz w:val="20"/>
+          <w:szCs w:val="20"/>
+          <w:lang w:eastAsia="en-GB"/>
+          <w14:ligatures w14:val="none"/>
+        </w:rPr>
+        <w:t>all climate</w:t>
+      </w:r>
+      <w:proofErr w:type="gramEnd"/>
+      <w:r>
+        <w:rPr>
+          <w:rFonts w:ascii="Times New Roman" w:eastAsia="Times New Roman" w:hAnsi="Times New Roman" w:cs="Times New Roman"/>
+          <w:color w:val="000000" w:themeColor="text1"/>
+          <w:kern w:val="0"/>
+          <w:sz w:val="20"/>
+          <w:szCs w:val="20"/>
+          <w:lang w:eastAsia="en-GB"/>
+          <w14:ligatures w14:val="none"/>
+        </w:rPr>
+        <w:t xml:space="preserve"> units </w:t>
       </w:r>
     </w:p>
     <w:p>
@@ -3322,16 +4028,26 @@
         <w:jc w:val="both"/>
         <w:rPr>
           <w:rFonts w:ascii="Times New Roman" w:eastAsia="Times New Roman" w:hAnsi="Times New Roman" w:cs="Times New Roman"/>
-          <w:b/>
-          <w:bCs/>
-          <w:color w:val="000000" w:themeColor="text1"/>
-          <w:kern w:val="0"/>
-          <w:sz w:val="20"/>
-          <w:szCs w:val="20"/>
-          <w:lang w:eastAsia="en-GB"/>
-          <w14:ligatures w14:val="none"/>
-        </w:rPr>
-      </w:pPr>
+          <w:color w:val="000000" w:themeColor="text1"/>
+          <w:kern w:val="0"/>
+          <w:sz w:val="20"/>
+          <w:szCs w:val="20"/>
+          <w:lang w:eastAsia="en-GB"/>
+          <w14:ligatures w14:val="none"/>
+        </w:rPr>
+      </w:pPr>
+      <w:r>
+        <w:rPr>
+          <w:rFonts w:ascii="Times New Roman" w:eastAsia="Times New Roman" w:hAnsi="Times New Roman" w:cs="Times New Roman"/>
+          <w:color w:val="000000" w:themeColor="text1"/>
+          <w:kern w:val="0"/>
+          <w:sz w:val="20"/>
+          <w:szCs w:val="20"/>
+          <w:lang w:eastAsia="en-GB"/>
+          <w14:ligatures w14:val="none"/>
+        </w:rPr>
+        <w:t>REQ-1.3: When the number of people in the house increases or decreases, the system shall dynamically adjust the temperature.</w:t>
+      </w:r>
     </w:p>
     <w:p>
       <w:pPr>
@@ -3340,16 +4056,26 @@
         <w:jc w:val="both"/>
         <w:rPr>
           <w:rFonts w:ascii="Times New Roman" w:eastAsia="Times New Roman" w:hAnsi="Times New Roman" w:cs="Times New Roman"/>
-          <w:b/>
-          <w:bCs/>
-          <w:color w:val="000000" w:themeColor="text1"/>
-          <w:kern w:val="0"/>
-          <w:sz w:val="20"/>
-          <w:szCs w:val="20"/>
-          <w:lang w:eastAsia="en-GB"/>
-          <w14:ligatures w14:val="none"/>
-        </w:rPr>
-      </w:pPr>
+          <w:color w:val="000000" w:themeColor="text1"/>
+          <w:kern w:val="0"/>
+          <w:sz w:val="20"/>
+          <w:szCs w:val="20"/>
+          <w:lang w:eastAsia="en-GB"/>
+          <w14:ligatures w14:val="none"/>
+        </w:rPr>
+      </w:pPr>
+      <w:r>
+        <w:rPr>
+          <w:rFonts w:ascii="Times New Roman" w:eastAsia="Times New Roman" w:hAnsi="Times New Roman" w:cs="Times New Roman"/>
+          <w:color w:val="000000" w:themeColor="text1"/>
+          <w:kern w:val="0"/>
+          <w:sz w:val="20"/>
+          <w:szCs w:val="20"/>
+          <w:lang w:eastAsia="en-GB"/>
+          <w14:ligatures w14:val="none"/>
+        </w:rPr>
+        <w:t>REQ-1.4: The system shall allow the user to disable autonomous mode and enter manual temperature via the interface</w:t>
+      </w:r>
     </w:p>
     <w:p>
       <w:pPr>
@@ -3358,16 +4084,26 @@
         <w:jc w:val="both"/>
         <w:rPr>
           <w:rFonts w:ascii="Times New Roman" w:eastAsia="Times New Roman" w:hAnsi="Times New Roman" w:cs="Times New Roman"/>
-          <w:b/>
-          <w:bCs/>
-          <w:color w:val="000000" w:themeColor="text1"/>
-          <w:kern w:val="0"/>
-          <w:sz w:val="20"/>
-          <w:szCs w:val="20"/>
-          <w:lang w:eastAsia="en-GB"/>
-          <w14:ligatures w14:val="none"/>
-        </w:rPr>
-      </w:pPr>
+          <w:color w:val="000000" w:themeColor="text1"/>
+          <w:kern w:val="0"/>
+          <w:sz w:val="20"/>
+          <w:szCs w:val="20"/>
+          <w:lang w:eastAsia="en-GB"/>
+          <w14:ligatures w14:val="none"/>
+        </w:rPr>
+      </w:pPr>
+      <w:r>
+        <w:rPr>
+          <w:rFonts w:ascii="Times New Roman" w:eastAsia="Times New Roman" w:hAnsi="Times New Roman" w:cs="Times New Roman"/>
+          <w:color w:val="000000" w:themeColor="text1"/>
+          <w:kern w:val="0"/>
+          <w:sz w:val="20"/>
+          <w:szCs w:val="20"/>
+          <w:lang w:eastAsia="en-GB"/>
+          <w14:ligatures w14:val="none"/>
+        </w:rPr>
+        <w:t>REQ-1.5: If the sensor is disconnected, the system shall enter safe mode and operate at a standard temperature (e.g. 21°C).</w:t>
+      </w:r>
     </w:p>
     <w:p>
       <w:pPr>
@@ -3376,8 +4112,6 @@
         <w:jc w:val="both"/>
         <w:rPr>
           <w:rFonts w:ascii="Times New Roman" w:eastAsia="Times New Roman" w:hAnsi="Times New Roman" w:cs="Times New Roman"/>
-          <w:b/>
-          <w:bCs/>
           <w:color w:val="000000" w:themeColor="text1"/>
           <w:kern w:val="0"/>
           <w:sz w:val="20"/>
@@ -3394,16 +4128,28 @@
         <w:jc w:val="both"/>
         <w:rPr>
           <w:rFonts w:ascii="Times New Roman" w:eastAsia="Times New Roman" w:hAnsi="Times New Roman" w:cs="Times New Roman"/>
-          <w:b/>
-          <w:bCs/>
-          <w:color w:val="000000" w:themeColor="text1"/>
-          <w:kern w:val="0"/>
-          <w:sz w:val="20"/>
-          <w:szCs w:val="20"/>
-          <w:lang w:eastAsia="en-GB"/>
-          <w14:ligatures w14:val="none"/>
-        </w:rPr>
-      </w:pPr>
+          <w:color w:val="000000" w:themeColor="text1"/>
+          <w:kern w:val="0"/>
+          <w:sz w:val="20"/>
+          <w:szCs w:val="20"/>
+          <w:lang w:eastAsia="en-GB"/>
+          <w14:ligatures w14:val="none"/>
+        </w:rPr>
+      </w:pPr>
+      <w:r>
+        <w:rPr>
+          <w:rFonts w:ascii="Times New Roman" w:eastAsia="Times New Roman" w:hAnsi="Times New Roman" w:cs="Times New Roman"/>
+          <w:b/>
+          <w:bCs/>
+          <w:color w:val="000000" w:themeColor="text1"/>
+          <w:kern w:val="0"/>
+          <w:sz w:val="20"/>
+          <w:szCs w:val="20"/>
+          <w:lang w:eastAsia="en-GB"/>
+          <w14:ligatures w14:val="none"/>
+        </w:rPr>
+        <w:t>6. Nonfunctional Requirements</w:t>
+      </w:r>
     </w:p>
     <w:p>
       <w:pPr>
@@ -3412,29 +4158,27 @@
         <w:jc w:val="both"/>
         <w:rPr>
           <w:rFonts w:ascii="Times New Roman" w:eastAsia="Times New Roman" w:hAnsi="Times New Roman" w:cs="Times New Roman"/>
-          <w:b/>
-          <w:bCs/>
-          <w:color w:val="000000" w:themeColor="text1"/>
-          <w:kern w:val="0"/>
-          <w:sz w:val="20"/>
-          <w:szCs w:val="20"/>
-          <w:lang w:eastAsia="en-GB"/>
-          <w14:ligatures w14:val="none"/>
-        </w:rPr>
-      </w:pPr>
-      <w:r>
-        <w:rPr>
-          <w:rFonts w:ascii="Times New Roman" w:eastAsia="Times New Roman" w:hAnsi="Times New Roman" w:cs="Times New Roman"/>
-          <w:b/>
-          <w:bCs/>
-          <w:color w:val="000000" w:themeColor="text1"/>
-          <w:kern w:val="0"/>
-          <w:sz w:val="20"/>
-          <w:szCs w:val="20"/>
-          <w:lang w:eastAsia="en-GB"/>
-          <w14:ligatures w14:val="none"/>
-        </w:rPr>
-        <w:t>5.1.3 Functional Requirements</w:t>
+          <w:color w:val="000000" w:themeColor="text1"/>
+          <w:kern w:val="0"/>
+          <w:sz w:val="20"/>
+          <w:szCs w:val="20"/>
+          <w:lang w:eastAsia="en-GB"/>
+          <w14:ligatures w14:val="none"/>
+        </w:rPr>
+      </w:pPr>
+      <w:r>
+        <w:rPr>
+          <w:rFonts w:ascii="Times New Roman" w:eastAsia="Times New Roman" w:hAnsi="Times New Roman" w:cs="Times New Roman"/>
+          <w:b/>
+          <w:bCs/>
+          <w:color w:val="000000" w:themeColor="text1"/>
+          <w:kern w:val="0"/>
+          <w:sz w:val="20"/>
+          <w:szCs w:val="20"/>
+          <w:lang w:eastAsia="en-GB"/>
+          <w14:ligatures w14:val="none"/>
+        </w:rPr>
+        <w:t>6.1. Performance  </w:t>
       </w:r>
     </w:p>
     <w:p>
@@ -3462,248 +4206,7 @@
           <w:lang w:eastAsia="en-GB"/>
           <w14:ligatures w14:val="none"/>
         </w:rPr>
-        <w:t>REQ-1.1: System shall detect human count in the house using sensors.</w:t>
-      </w:r>
-    </w:p>
-    <w:p>
-      <w:pPr>
-        <w:shd w:val="clear" w:color="auto" w:fill="FFFFFF"/>
-        <w:spacing w:before="240" w:after="0" w:line="240" w:lineRule="auto"/>
-        <w:jc w:val="both"/>
-        <w:rPr>
-          <w:rFonts w:ascii="Times New Roman" w:eastAsia="Times New Roman" w:hAnsi="Times New Roman" w:cs="Times New Roman"/>
-          <w:color w:val="000000" w:themeColor="text1"/>
-          <w:kern w:val="0"/>
-          <w:sz w:val="20"/>
-          <w:szCs w:val="20"/>
-          <w:lang w:eastAsia="en-GB"/>
-          <w14:ligatures w14:val="none"/>
-        </w:rPr>
-      </w:pPr>
-      <w:r>
-        <w:rPr>
-          <w:rFonts w:ascii="Times New Roman" w:eastAsia="Times New Roman" w:hAnsi="Times New Roman" w:cs="Times New Roman"/>
-          <w:color w:val="000000" w:themeColor="text1"/>
-          <w:kern w:val="0"/>
-          <w:sz w:val="20"/>
-          <w:szCs w:val="20"/>
-          <w:lang w:eastAsia="en-GB"/>
-          <w14:ligatures w14:val="none"/>
-        </w:rPr>
-        <w:t xml:space="preserve">REQ-1.2: When human count in house is zero system, shall turn of the </w:t>
-      </w:r>
-      <w:proofErr w:type="gramStart"/>
-      <w:r>
-        <w:rPr>
-          <w:rFonts w:ascii="Times New Roman" w:eastAsia="Times New Roman" w:hAnsi="Times New Roman" w:cs="Times New Roman"/>
-          <w:color w:val="000000" w:themeColor="text1"/>
-          <w:kern w:val="0"/>
-          <w:sz w:val="20"/>
-          <w:szCs w:val="20"/>
-          <w:lang w:eastAsia="en-GB"/>
-          <w14:ligatures w14:val="none"/>
-        </w:rPr>
-        <w:t>all climate</w:t>
-      </w:r>
-      <w:proofErr w:type="gramEnd"/>
-      <w:r>
-        <w:rPr>
-          <w:rFonts w:ascii="Times New Roman" w:eastAsia="Times New Roman" w:hAnsi="Times New Roman" w:cs="Times New Roman"/>
-          <w:color w:val="000000" w:themeColor="text1"/>
-          <w:kern w:val="0"/>
-          <w:sz w:val="20"/>
-          <w:szCs w:val="20"/>
-          <w:lang w:eastAsia="en-GB"/>
-          <w14:ligatures w14:val="none"/>
-        </w:rPr>
-        <w:t xml:space="preserve"> units </w:t>
-      </w:r>
-    </w:p>
-    <w:p>
-      <w:pPr>
-        <w:shd w:val="clear" w:color="auto" w:fill="FFFFFF"/>
-        <w:spacing w:before="240" w:after="0" w:line="240" w:lineRule="auto"/>
-        <w:jc w:val="both"/>
-        <w:rPr>
-          <w:rFonts w:ascii="Times New Roman" w:eastAsia="Times New Roman" w:hAnsi="Times New Roman" w:cs="Times New Roman"/>
-          <w:color w:val="000000" w:themeColor="text1"/>
-          <w:kern w:val="0"/>
-          <w:sz w:val="20"/>
-          <w:szCs w:val="20"/>
-          <w:lang w:eastAsia="en-GB"/>
-          <w14:ligatures w14:val="none"/>
-        </w:rPr>
-      </w:pPr>
-      <w:r>
-        <w:rPr>
-          <w:rFonts w:ascii="Times New Roman" w:eastAsia="Times New Roman" w:hAnsi="Times New Roman" w:cs="Times New Roman"/>
-          <w:color w:val="000000" w:themeColor="text1"/>
-          <w:kern w:val="0"/>
-          <w:sz w:val="20"/>
-          <w:szCs w:val="20"/>
-          <w:lang w:eastAsia="en-GB"/>
-          <w14:ligatures w14:val="none"/>
-        </w:rPr>
-        <w:t>REQ-1.3: When the number of people in the house increases or decreases, the system shall dynamically adjust the temperature.</w:t>
-      </w:r>
-    </w:p>
-    <w:p>
-      <w:pPr>
-        <w:shd w:val="clear" w:color="auto" w:fill="FFFFFF"/>
-        <w:spacing w:before="240" w:after="0" w:line="240" w:lineRule="auto"/>
-        <w:jc w:val="both"/>
-        <w:rPr>
-          <w:rFonts w:ascii="Times New Roman" w:eastAsia="Times New Roman" w:hAnsi="Times New Roman" w:cs="Times New Roman"/>
-          <w:color w:val="000000" w:themeColor="text1"/>
-          <w:kern w:val="0"/>
-          <w:sz w:val="20"/>
-          <w:szCs w:val="20"/>
-          <w:lang w:eastAsia="en-GB"/>
-          <w14:ligatures w14:val="none"/>
-        </w:rPr>
-      </w:pPr>
-      <w:r>
-        <w:rPr>
-          <w:rFonts w:ascii="Times New Roman" w:eastAsia="Times New Roman" w:hAnsi="Times New Roman" w:cs="Times New Roman"/>
-          <w:color w:val="000000" w:themeColor="text1"/>
-          <w:kern w:val="0"/>
-          <w:sz w:val="20"/>
-          <w:szCs w:val="20"/>
-          <w:lang w:eastAsia="en-GB"/>
-          <w14:ligatures w14:val="none"/>
-        </w:rPr>
-        <w:t>REQ-1.4: The system shall allow the user to disable autonomous mode and enter manual temperature via the interface</w:t>
-      </w:r>
-    </w:p>
-    <w:p>
-      <w:pPr>
-        <w:shd w:val="clear" w:color="auto" w:fill="FFFFFF"/>
-        <w:spacing w:before="240" w:after="0" w:line="240" w:lineRule="auto"/>
-        <w:jc w:val="both"/>
-        <w:rPr>
-          <w:rFonts w:ascii="Times New Roman" w:eastAsia="Times New Roman" w:hAnsi="Times New Roman" w:cs="Times New Roman"/>
-          <w:color w:val="000000" w:themeColor="text1"/>
-          <w:kern w:val="0"/>
-          <w:sz w:val="20"/>
-          <w:szCs w:val="20"/>
-          <w:lang w:eastAsia="en-GB"/>
-          <w14:ligatures w14:val="none"/>
-        </w:rPr>
-      </w:pPr>
-      <w:r>
-        <w:rPr>
-          <w:rFonts w:ascii="Times New Roman" w:eastAsia="Times New Roman" w:hAnsi="Times New Roman" w:cs="Times New Roman"/>
-          <w:color w:val="000000" w:themeColor="text1"/>
-          <w:kern w:val="0"/>
-          <w:sz w:val="20"/>
-          <w:szCs w:val="20"/>
-          <w:lang w:eastAsia="en-GB"/>
-          <w14:ligatures w14:val="none"/>
-        </w:rPr>
-        <w:t>REQ-1.5: If the sensor is disconnected, the system shall enter safe mode and operate at a standard temperature (e.g. 21°C).</w:t>
-      </w:r>
-    </w:p>
-    <w:p>
-      <w:pPr>
-        <w:shd w:val="clear" w:color="auto" w:fill="FFFFFF"/>
-        <w:spacing w:before="240" w:after="0" w:line="240" w:lineRule="auto"/>
-        <w:jc w:val="both"/>
-        <w:rPr>
-          <w:rFonts w:ascii="Times New Roman" w:eastAsia="Times New Roman" w:hAnsi="Times New Roman" w:cs="Times New Roman"/>
-          <w:color w:val="000000" w:themeColor="text1"/>
-          <w:kern w:val="0"/>
-          <w:sz w:val="20"/>
-          <w:szCs w:val="20"/>
-          <w:lang w:eastAsia="en-GB"/>
-          <w14:ligatures w14:val="none"/>
-        </w:rPr>
-      </w:pPr>
-    </w:p>
-    <w:p>
-      <w:pPr>
-        <w:shd w:val="clear" w:color="auto" w:fill="FFFFFF"/>
-        <w:spacing w:before="240" w:after="0" w:line="240" w:lineRule="auto"/>
-        <w:jc w:val="both"/>
-        <w:rPr>
-          <w:rFonts w:ascii="Times New Roman" w:eastAsia="Times New Roman" w:hAnsi="Times New Roman" w:cs="Times New Roman"/>
-          <w:color w:val="000000" w:themeColor="text1"/>
-          <w:kern w:val="0"/>
-          <w:sz w:val="20"/>
-          <w:szCs w:val="20"/>
-          <w:lang w:eastAsia="en-GB"/>
-          <w14:ligatures w14:val="none"/>
-        </w:rPr>
-      </w:pPr>
-      <w:r>
-        <w:rPr>
-          <w:rFonts w:ascii="Times New Roman" w:eastAsia="Times New Roman" w:hAnsi="Times New Roman" w:cs="Times New Roman"/>
-          <w:b/>
-          <w:bCs/>
-          <w:color w:val="000000" w:themeColor="text1"/>
-          <w:kern w:val="0"/>
-          <w:sz w:val="20"/>
-          <w:szCs w:val="20"/>
-          <w:lang w:eastAsia="en-GB"/>
-          <w14:ligatures w14:val="none"/>
-        </w:rPr>
-        <w:t>6. Nonfunctional Requirements</w:t>
-      </w:r>
-    </w:p>
-    <w:p>
-      <w:pPr>
-        <w:shd w:val="clear" w:color="auto" w:fill="FFFFFF"/>
-        <w:spacing w:before="240" w:after="0" w:line="240" w:lineRule="auto"/>
-        <w:jc w:val="both"/>
-        <w:rPr>
-          <w:rFonts w:ascii="Times New Roman" w:eastAsia="Times New Roman" w:hAnsi="Times New Roman" w:cs="Times New Roman"/>
-          <w:color w:val="000000" w:themeColor="text1"/>
-          <w:kern w:val="0"/>
-          <w:sz w:val="20"/>
-          <w:szCs w:val="20"/>
-          <w:lang w:eastAsia="en-GB"/>
-          <w14:ligatures w14:val="none"/>
-        </w:rPr>
-      </w:pPr>
-      <w:r>
-        <w:rPr>
-          <w:rFonts w:ascii="Times New Roman" w:eastAsia="Times New Roman" w:hAnsi="Times New Roman" w:cs="Times New Roman"/>
-          <w:b/>
-          <w:bCs/>
-          <w:color w:val="000000" w:themeColor="text1"/>
-          <w:kern w:val="0"/>
-          <w:sz w:val="20"/>
-          <w:szCs w:val="20"/>
-          <w:lang w:eastAsia="en-GB"/>
-          <w14:ligatures w14:val="none"/>
-        </w:rPr>
-        <w:t>6.1. Performance  </w:t>
-      </w:r>
-    </w:p>
-    <w:p>
-      <w:pPr>
-        <w:shd w:val="clear" w:color="auto" w:fill="FFFFFF"/>
-        <w:spacing w:before="240" w:after="0" w:line="240" w:lineRule="auto"/>
-        <w:jc w:val="both"/>
-        <w:rPr>
-          <w:rFonts w:ascii="Times New Roman" w:eastAsia="Times New Roman" w:hAnsi="Times New Roman" w:cs="Times New Roman"/>
-          <w:color w:val="000000" w:themeColor="text1"/>
-          <w:kern w:val="0"/>
-          <w:sz w:val="20"/>
-          <w:szCs w:val="20"/>
-          <w:lang w:eastAsia="en-GB"/>
-          <w14:ligatures w14:val="none"/>
-        </w:rPr>
-      </w:pPr>
-      <w:r>
-        <w:rPr>
-          <w:rFonts w:ascii="Times New Roman" w:eastAsia="Times New Roman" w:hAnsi="Times New Roman" w:cs="Times New Roman"/>
-          <w:color w:val="000000" w:themeColor="text1"/>
-          <w:kern w:val="0"/>
-          <w:sz w:val="20"/>
-          <w:szCs w:val="20"/>
-          <w:lang w:eastAsia="en-GB"/>
-          <w14:ligatures w14:val="none"/>
-        </w:rPr>
+        <w:lastRenderedPageBreak/>
         <w:t>NF-1.1: The system shall process the data from sensors &lt; 3 seconds and send commands to the climate units.</w:t>
       </w:r>
     </w:p>

</xml_diff>

<commit_message>
UML State Diagram Added and Most of Titles are Filled
</commit_message>
<xml_diff>
--- a/Srs Document/Home Tempature Adjustment System Srs.docx
+++ b/Srs Document/Home Tempature Adjustment System Srs.docx
@@ -219,29 +219,27 @@
         <w:spacing w:before="240" w:after="0" w:line="240" w:lineRule="auto"/>
         <w:rPr>
           <w:rFonts w:ascii="Times New Roman" w:eastAsia="Times New Roman" w:hAnsi="Times New Roman" w:cs="Times New Roman"/>
-          <w:b/>
-          <w:bCs/>
-          <w:color w:val="000000" w:themeColor="text1"/>
-          <w:kern w:val="0"/>
-          <w:sz w:val="20"/>
-          <w:szCs w:val="20"/>
-          <w:lang w:eastAsia="en-GB"/>
-          <w14:ligatures w14:val="none"/>
-        </w:rPr>
-      </w:pPr>
-      <w:r>
-        <w:rPr>
-          <w:rFonts w:ascii="Times New Roman" w:eastAsia="Times New Roman" w:hAnsi="Times New Roman" w:cs="Times New Roman"/>
-          <w:b/>
-          <w:bCs/>
-          <w:color w:val="000000" w:themeColor="text1"/>
-          <w:kern w:val="0"/>
-          <w:sz w:val="20"/>
-          <w:szCs w:val="20"/>
-          <w:lang w:eastAsia="en-GB"/>
-          <w14:ligatures w14:val="none"/>
-        </w:rPr>
-        <w:t>24.04.2026</w:t>
+          <w:color w:val="000000" w:themeColor="text1"/>
+          <w:kern w:val="0"/>
+          <w:sz w:val="20"/>
+          <w:szCs w:val="20"/>
+          <w:lang w:eastAsia="en-GB"/>
+          <w14:ligatures w14:val="none"/>
+        </w:rPr>
+      </w:pPr>
+      <w:r>
+        <w:rPr>
+          <w:rFonts w:ascii="Times New Roman" w:eastAsia="Times New Roman" w:hAnsi="Times New Roman" w:cs="Times New Roman"/>
+          <w:b/>
+          <w:bCs/>
+          <w:color w:val="000000" w:themeColor="text1"/>
+          <w:kern w:val="0"/>
+          <w:sz w:val="20"/>
+          <w:szCs w:val="20"/>
+          <w:lang w:eastAsia="en-GB"/>
+          <w14:ligatures w14:val="none"/>
+        </w:rPr>
+        <w:t>14.03.2026</w:t>
       </w:r>
     </w:p>
     <w:p>
@@ -738,10 +736,10 @@
         <w:tblLook w:val="04A0" w:firstRow="1" w:lastRow="0" w:firstColumn="1" w:lastColumn="0" w:noHBand="0" w:noVBand="1"/>
       </w:tblPr>
       <w:tblGrid>
-        <w:gridCol w:w="2189"/>
-        <w:gridCol w:w="1172"/>
-        <w:gridCol w:w="4597"/>
-        <w:gridCol w:w="905"/>
+        <w:gridCol w:w="2091"/>
+        <w:gridCol w:w="1119"/>
+        <w:gridCol w:w="4789"/>
+        <w:gridCol w:w="864"/>
       </w:tblGrid>
       <w:tr>
         <w:trPr>
@@ -978,19 +976,7 @@
                 <w:lang w:eastAsia="en-GB"/>
                 <w14:ligatures w14:val="none"/>
               </w:rPr>
-              <w:t xml:space="preserve"> </w:t>
-            </w:r>
-            <w:r>
-              <w:rPr>
-                <w:rFonts w:ascii="Times New Roman" w:eastAsia="Times New Roman" w:hAnsi="Times New Roman" w:cs="Times New Roman"/>
-                <w:color w:val="000000" w:themeColor="text1"/>
-                <w:kern w:val="0"/>
-                <w:sz w:val="16"/>
-                <w:szCs w:val="16"/>
-                <w:lang w:eastAsia="en-GB"/>
-                <w14:ligatures w14:val="none"/>
-              </w:rPr>
-              <w:t>Ahmet Talha Sivrikaya</w:t>
+              <w:t xml:space="preserve"> Ahmet Talha Sivrikaya</w:t>
             </w:r>
           </w:p>
         </w:tc>
@@ -1142,31 +1128,7 @@
                 <w:lang w:eastAsia="en-GB"/>
                 <w14:ligatures w14:val="none"/>
               </w:rPr>
-              <w:t>«</w:t>
-            </w:r>
-            <w:r>
-              <w:rPr>
-                <w:rFonts w:ascii="Times New Roman" w:eastAsia="Times New Roman" w:hAnsi="Times New Roman" w:cs="Times New Roman"/>
-                <w:color w:val="000000" w:themeColor="text1"/>
-                <w:kern w:val="0"/>
-                <w:sz w:val="16"/>
-                <w:szCs w:val="16"/>
-                <w:lang w:eastAsia="en-GB"/>
-                <w14:ligatures w14:val="none"/>
-              </w:rPr>
-              <w:t>1.0</w:t>
-            </w:r>
-            <w:r>
-              <w:rPr>
-                <w:rFonts w:ascii="Times New Roman" w:eastAsia="Times New Roman" w:hAnsi="Times New Roman" w:cs="Times New Roman"/>
-                <w:color w:val="000000" w:themeColor="text1"/>
-                <w:kern w:val="0"/>
-                <w:sz w:val="16"/>
-                <w:szCs w:val="16"/>
-                <w:lang w:eastAsia="en-GB"/>
-                <w14:ligatures w14:val="none"/>
-              </w:rPr>
-              <w:t>»</w:t>
+              <w:t>«1.0»</w:t>
             </w:r>
           </w:p>
         </w:tc>
@@ -2096,6 +2058,191 @@
           </w:p>
         </w:tc>
       </w:tr>
+      <w:tr>
+        <w:trPr>
+          <w:trHeight w:val="836"/>
+        </w:trPr>
+        <w:tc>
+          <w:tcPr>
+            <w:tcW w:w="0" w:type="auto"/>
+            <w:tcBorders>
+              <w:top w:val="single" w:sz="6" w:space="0" w:color="000000"/>
+              <w:left w:val="single" w:sz="6" w:space="0" w:color="000000"/>
+              <w:bottom w:val="single" w:sz="6" w:space="0" w:color="000000"/>
+              <w:right w:val="single" w:sz="6" w:space="0" w:color="000000"/>
+            </w:tcBorders>
+            <w:shd w:val="clear" w:color="auto" w:fill="FFFFFF"/>
+            <w:tcMar>
+              <w:top w:w="108" w:type="dxa"/>
+              <w:left w:w="108" w:type="dxa"/>
+              <w:bottom w:w="108" w:type="dxa"/>
+              <w:right w:w="108" w:type="dxa"/>
+            </w:tcMar>
+            <w:vAlign w:val="center"/>
+          </w:tcPr>
+          <w:p>
+            <w:pPr>
+              <w:spacing w:before="360" w:after="360" w:line="264" w:lineRule="atLeast"/>
+              <w:rPr>
+                <w:rFonts w:ascii="Times New Roman" w:eastAsia="Times New Roman" w:hAnsi="Times New Roman" w:cs="Times New Roman"/>
+                <w:color w:val="000000" w:themeColor="text1"/>
+                <w:kern w:val="0"/>
+                <w:sz w:val="16"/>
+                <w:szCs w:val="16"/>
+                <w:lang w:eastAsia="en-GB"/>
+                <w14:ligatures w14:val="none"/>
+              </w:rPr>
+            </w:pPr>
+            <w:r>
+              <w:rPr>
+                <w:rFonts w:ascii="Times New Roman" w:eastAsia="Times New Roman" w:hAnsi="Times New Roman" w:cs="Times New Roman"/>
+                <w:color w:val="000000" w:themeColor="text1"/>
+                <w:kern w:val="0"/>
+                <w:sz w:val="16"/>
+                <w:szCs w:val="16"/>
+                <w:lang w:eastAsia="en-GB"/>
+                <w14:ligatures w14:val="none"/>
+              </w:rPr>
+              <w:t>Ahmet Talha Sivrikaya</w:t>
+            </w:r>
+          </w:p>
+        </w:tc>
+        <w:tc>
+          <w:tcPr>
+            <w:tcW w:w="0" w:type="auto"/>
+            <w:tcBorders>
+              <w:top w:val="single" w:sz="6" w:space="0" w:color="000000"/>
+              <w:left w:val="single" w:sz="6" w:space="0" w:color="000000"/>
+              <w:bottom w:val="single" w:sz="6" w:space="0" w:color="000000"/>
+              <w:right w:val="single" w:sz="6" w:space="0" w:color="000000"/>
+            </w:tcBorders>
+            <w:shd w:val="clear" w:color="auto" w:fill="FFFFFF"/>
+            <w:tcMar>
+              <w:top w:w="108" w:type="dxa"/>
+              <w:left w:w="108" w:type="dxa"/>
+              <w:bottom w:w="108" w:type="dxa"/>
+              <w:right w:w="108" w:type="dxa"/>
+            </w:tcMar>
+            <w:vAlign w:val="center"/>
+          </w:tcPr>
+          <w:p>
+            <w:pPr>
+              <w:spacing w:before="360" w:after="360" w:line="264" w:lineRule="atLeast"/>
+              <w:rPr>
+                <w:rFonts w:ascii="Times New Roman" w:eastAsia="Times New Roman" w:hAnsi="Times New Roman" w:cs="Times New Roman"/>
+                <w:color w:val="000000" w:themeColor="text1"/>
+                <w:kern w:val="0"/>
+                <w:sz w:val="16"/>
+                <w:szCs w:val="16"/>
+                <w:lang w:eastAsia="en-GB"/>
+                <w14:ligatures w14:val="none"/>
+              </w:rPr>
+            </w:pPr>
+            <w:r>
+              <w:rPr>
+                <w:rFonts w:ascii="Times New Roman" w:eastAsia="Times New Roman" w:hAnsi="Times New Roman" w:cs="Times New Roman"/>
+                <w:color w:val="000000" w:themeColor="text1"/>
+                <w:kern w:val="0"/>
+                <w:sz w:val="16"/>
+                <w:szCs w:val="16"/>
+                <w:lang w:eastAsia="en-GB"/>
+                <w14:ligatures w14:val="none"/>
+              </w:rPr>
+              <w:t>24.04.2026</w:t>
+            </w:r>
+          </w:p>
+        </w:tc>
+        <w:tc>
+          <w:tcPr>
+            <w:tcW w:w="0" w:type="auto"/>
+            <w:tcBorders>
+              <w:top w:val="single" w:sz="6" w:space="0" w:color="000000"/>
+              <w:left w:val="single" w:sz="6" w:space="0" w:color="000000"/>
+              <w:bottom w:val="single" w:sz="6" w:space="0" w:color="000000"/>
+              <w:right w:val="single" w:sz="6" w:space="0" w:color="000000"/>
+            </w:tcBorders>
+            <w:shd w:val="clear" w:color="auto" w:fill="FFFFFF"/>
+            <w:tcMar>
+              <w:top w:w="108" w:type="dxa"/>
+              <w:left w:w="108" w:type="dxa"/>
+              <w:bottom w:w="108" w:type="dxa"/>
+              <w:right w:w="108" w:type="dxa"/>
+            </w:tcMar>
+            <w:vAlign w:val="center"/>
+          </w:tcPr>
+          <w:p>
+            <w:pPr>
+              <w:spacing w:before="360" w:after="360" w:line="264" w:lineRule="atLeast"/>
+              <w:rPr>
+                <w:rFonts w:ascii="Times New Roman" w:eastAsia="Times New Roman" w:hAnsi="Times New Roman" w:cs="Times New Roman"/>
+                <w:color w:val="000000" w:themeColor="text1"/>
+                <w:kern w:val="0"/>
+                <w:sz w:val="16"/>
+                <w:szCs w:val="16"/>
+                <w:lang w:eastAsia="en-GB"/>
+                <w14:ligatures w14:val="none"/>
+              </w:rPr>
+            </w:pPr>
+            <w:r>
+              <w:rPr>
+                <w:rFonts w:ascii="Times New Roman" w:eastAsia="Times New Roman" w:hAnsi="Times New Roman" w:cs="Times New Roman"/>
+                <w:color w:val="000000" w:themeColor="text1"/>
+                <w:kern w:val="0"/>
+                <w:sz w:val="16"/>
+                <w:szCs w:val="16"/>
+                <w:lang w:eastAsia="en-GB"/>
+                <w14:ligatures w14:val="none"/>
+              </w:rPr>
+              <w:t>“UML State Diagram Added and Most of Titles are Filled”</w:t>
+            </w:r>
+          </w:p>
+        </w:tc>
+        <w:tc>
+          <w:tcPr>
+            <w:tcW w:w="0" w:type="auto"/>
+            <w:tcBorders>
+              <w:top w:val="single" w:sz="6" w:space="0" w:color="000000"/>
+              <w:left w:val="single" w:sz="6" w:space="0" w:color="000000"/>
+              <w:bottom w:val="single" w:sz="6" w:space="0" w:color="000000"/>
+              <w:right w:val="single" w:sz="6" w:space="0" w:color="000000"/>
+            </w:tcBorders>
+            <w:shd w:val="clear" w:color="auto" w:fill="FFFFFF"/>
+            <w:tcMar>
+              <w:top w:w="108" w:type="dxa"/>
+              <w:left w:w="108" w:type="dxa"/>
+              <w:bottom w:w="108" w:type="dxa"/>
+              <w:right w:w="108" w:type="dxa"/>
+            </w:tcMar>
+            <w:vAlign w:val="center"/>
+          </w:tcPr>
+          <w:p>
+            <w:pPr>
+              <w:spacing w:before="360" w:after="360" w:line="264" w:lineRule="atLeast"/>
+              <w:rPr>
+                <w:rFonts w:ascii="Times New Roman" w:eastAsia="Times New Roman" w:hAnsi="Times New Roman" w:cs="Times New Roman"/>
+                <w:color w:val="000000" w:themeColor="text1"/>
+                <w:kern w:val="0"/>
+                <w:sz w:val="16"/>
+                <w:szCs w:val="16"/>
+                <w:lang w:eastAsia="en-GB"/>
+                <w14:ligatures w14:val="none"/>
+              </w:rPr>
+            </w:pPr>
+            <w:r>
+              <w:rPr>
+                <w:rFonts w:ascii="Times New Roman" w:eastAsia="Times New Roman" w:hAnsi="Times New Roman" w:cs="Times New Roman"/>
+                <w:color w:val="000000" w:themeColor="text1"/>
+                <w:kern w:val="0"/>
+                <w:sz w:val="16"/>
+                <w:szCs w:val="16"/>
+                <w:lang w:eastAsia="en-GB"/>
+                <w14:ligatures w14:val="none"/>
+              </w:rPr>
+              <w:t>1.6</w:t>
+            </w:r>
+          </w:p>
+        </w:tc>
+      </w:tr>
     </w:tbl>
     <w:p>
       <w:pPr>
@@ -2111,6 +2258,21 @@
           <w14:ligatures w14:val="none"/>
         </w:rPr>
       </w:pPr>
+    </w:p>
+    <w:p>
+      <w:pPr>
+        <w:shd w:val="clear" w:color="auto" w:fill="FFFFFF"/>
+        <w:spacing w:before="360" w:after="0" w:line="240" w:lineRule="auto"/>
+        <w:rPr>
+          <w:rFonts w:ascii="Times New Roman" w:eastAsia="Times New Roman" w:hAnsi="Times New Roman" w:cs="Times New Roman"/>
+          <w:color w:val="000000" w:themeColor="text1"/>
+          <w:kern w:val="0"/>
+          <w:sz w:val="20"/>
+          <w:szCs w:val="20"/>
+          <w:lang w:eastAsia="en-GB"/>
+          <w14:ligatures w14:val="none"/>
+        </w:rPr>
+      </w:pPr>
       <w:r>
         <w:rPr>
           <w:rFonts w:ascii="Times New Roman" w:eastAsia="Times New Roman" w:hAnsi="Times New Roman" w:cs="Times New Roman"/>
@@ -2266,227 +2428,6 @@
         <w:spacing w:before="240" w:after="0" w:line="240" w:lineRule="auto"/>
         <w:rPr>
           <w:rFonts w:ascii="Times New Roman" w:eastAsia="Times New Roman" w:hAnsi="Times New Roman" w:cs="Times New Roman"/>
-          <w:b/>
-          <w:bCs/>
-          <w:color w:val="000000" w:themeColor="text1"/>
-          <w:kern w:val="0"/>
-          <w:sz w:val="20"/>
-          <w:szCs w:val="20"/>
-          <w:lang w:eastAsia="en-GB"/>
-          <w14:ligatures w14:val="none"/>
-        </w:rPr>
-      </w:pPr>
-    </w:p>
-    <w:p>
-      <w:pPr>
-        <w:shd w:val="clear" w:color="auto" w:fill="FFFFFF"/>
-        <w:spacing w:before="240" w:after="0" w:line="240" w:lineRule="auto"/>
-        <w:rPr>
-          <w:rFonts w:ascii="Times New Roman" w:eastAsia="Times New Roman" w:hAnsi="Times New Roman" w:cs="Times New Roman"/>
-          <w:b/>
-          <w:bCs/>
-          <w:color w:val="000000" w:themeColor="text1"/>
-          <w:kern w:val="0"/>
-          <w:sz w:val="20"/>
-          <w:szCs w:val="20"/>
-          <w:lang w:eastAsia="en-GB"/>
-          <w14:ligatures w14:val="none"/>
-        </w:rPr>
-      </w:pPr>
-    </w:p>
-    <w:p>
-      <w:pPr>
-        <w:shd w:val="clear" w:color="auto" w:fill="FFFFFF"/>
-        <w:spacing w:before="240" w:after="0" w:line="240" w:lineRule="auto"/>
-        <w:rPr>
-          <w:rFonts w:ascii="Times New Roman" w:eastAsia="Times New Roman" w:hAnsi="Times New Roman" w:cs="Times New Roman"/>
-          <w:b/>
-          <w:bCs/>
-          <w:color w:val="000000" w:themeColor="text1"/>
-          <w:kern w:val="0"/>
-          <w:sz w:val="20"/>
-          <w:szCs w:val="20"/>
-          <w:lang w:eastAsia="en-GB"/>
-          <w14:ligatures w14:val="none"/>
-        </w:rPr>
-      </w:pPr>
-    </w:p>
-    <w:p>
-      <w:pPr>
-        <w:shd w:val="clear" w:color="auto" w:fill="FFFFFF"/>
-        <w:spacing w:before="240" w:after="0" w:line="240" w:lineRule="auto"/>
-        <w:rPr>
-          <w:rFonts w:ascii="Times New Roman" w:eastAsia="Times New Roman" w:hAnsi="Times New Roman" w:cs="Times New Roman"/>
-          <w:b/>
-          <w:bCs/>
-          <w:color w:val="000000" w:themeColor="text1"/>
-          <w:kern w:val="0"/>
-          <w:sz w:val="20"/>
-          <w:szCs w:val="20"/>
-          <w:lang w:eastAsia="en-GB"/>
-          <w14:ligatures w14:val="none"/>
-        </w:rPr>
-      </w:pPr>
-    </w:p>
-    <w:p>
-      <w:pPr>
-        <w:shd w:val="clear" w:color="auto" w:fill="FFFFFF"/>
-        <w:spacing w:before="240" w:after="0" w:line="240" w:lineRule="auto"/>
-        <w:rPr>
-          <w:rFonts w:ascii="Times New Roman" w:eastAsia="Times New Roman" w:hAnsi="Times New Roman" w:cs="Times New Roman"/>
-          <w:b/>
-          <w:bCs/>
-          <w:color w:val="000000" w:themeColor="text1"/>
-          <w:kern w:val="0"/>
-          <w:sz w:val="20"/>
-          <w:szCs w:val="20"/>
-          <w:lang w:eastAsia="en-GB"/>
-          <w14:ligatures w14:val="none"/>
-        </w:rPr>
-      </w:pPr>
-    </w:p>
-    <w:p>
-      <w:pPr>
-        <w:shd w:val="clear" w:color="auto" w:fill="FFFFFF"/>
-        <w:spacing w:before="240" w:after="0" w:line="240" w:lineRule="auto"/>
-        <w:rPr>
-          <w:rFonts w:ascii="Times New Roman" w:eastAsia="Times New Roman" w:hAnsi="Times New Roman" w:cs="Times New Roman"/>
-          <w:b/>
-          <w:bCs/>
-          <w:color w:val="000000" w:themeColor="text1"/>
-          <w:kern w:val="0"/>
-          <w:sz w:val="20"/>
-          <w:szCs w:val="20"/>
-          <w:lang w:eastAsia="en-GB"/>
-          <w14:ligatures w14:val="none"/>
-        </w:rPr>
-      </w:pPr>
-    </w:p>
-    <w:p>
-      <w:pPr>
-        <w:shd w:val="clear" w:color="auto" w:fill="FFFFFF"/>
-        <w:spacing w:before="240" w:after="0" w:line="240" w:lineRule="auto"/>
-        <w:rPr>
-          <w:rFonts w:ascii="Times New Roman" w:eastAsia="Times New Roman" w:hAnsi="Times New Roman" w:cs="Times New Roman"/>
-          <w:b/>
-          <w:bCs/>
-          <w:color w:val="000000" w:themeColor="text1"/>
-          <w:kern w:val="0"/>
-          <w:sz w:val="20"/>
-          <w:szCs w:val="20"/>
-          <w:lang w:eastAsia="en-GB"/>
-          <w14:ligatures w14:val="none"/>
-        </w:rPr>
-      </w:pPr>
-    </w:p>
-    <w:p>
-      <w:pPr>
-        <w:shd w:val="clear" w:color="auto" w:fill="FFFFFF"/>
-        <w:spacing w:before="240" w:after="0" w:line="240" w:lineRule="auto"/>
-        <w:rPr>
-          <w:rFonts w:ascii="Times New Roman" w:eastAsia="Times New Roman" w:hAnsi="Times New Roman" w:cs="Times New Roman"/>
-          <w:b/>
-          <w:bCs/>
-          <w:color w:val="000000" w:themeColor="text1"/>
-          <w:kern w:val="0"/>
-          <w:sz w:val="20"/>
-          <w:szCs w:val="20"/>
-          <w:lang w:eastAsia="en-GB"/>
-          <w14:ligatures w14:val="none"/>
-        </w:rPr>
-      </w:pPr>
-    </w:p>
-    <w:p>
-      <w:pPr>
-        <w:shd w:val="clear" w:color="auto" w:fill="FFFFFF"/>
-        <w:spacing w:before="240" w:after="0" w:line="240" w:lineRule="auto"/>
-        <w:rPr>
-          <w:rFonts w:ascii="Times New Roman" w:eastAsia="Times New Roman" w:hAnsi="Times New Roman" w:cs="Times New Roman"/>
-          <w:b/>
-          <w:bCs/>
-          <w:color w:val="000000" w:themeColor="text1"/>
-          <w:kern w:val="0"/>
-          <w:sz w:val="20"/>
-          <w:szCs w:val="20"/>
-          <w:lang w:eastAsia="en-GB"/>
-          <w14:ligatures w14:val="none"/>
-        </w:rPr>
-      </w:pPr>
-    </w:p>
-    <w:p>
-      <w:pPr>
-        <w:shd w:val="clear" w:color="auto" w:fill="FFFFFF"/>
-        <w:spacing w:before="240" w:after="0" w:line="240" w:lineRule="auto"/>
-        <w:rPr>
-          <w:rFonts w:ascii="Times New Roman" w:eastAsia="Times New Roman" w:hAnsi="Times New Roman" w:cs="Times New Roman"/>
-          <w:b/>
-          <w:bCs/>
-          <w:color w:val="000000" w:themeColor="text1"/>
-          <w:kern w:val="0"/>
-          <w:sz w:val="20"/>
-          <w:szCs w:val="20"/>
-          <w:lang w:eastAsia="en-GB"/>
-          <w14:ligatures w14:val="none"/>
-        </w:rPr>
-      </w:pPr>
-    </w:p>
-    <w:p>
-      <w:pPr>
-        <w:shd w:val="clear" w:color="auto" w:fill="FFFFFF"/>
-        <w:spacing w:before="240" w:after="0" w:line="240" w:lineRule="auto"/>
-        <w:rPr>
-          <w:rFonts w:ascii="Times New Roman" w:eastAsia="Times New Roman" w:hAnsi="Times New Roman" w:cs="Times New Roman"/>
-          <w:b/>
-          <w:bCs/>
-          <w:color w:val="000000" w:themeColor="text1"/>
-          <w:kern w:val="0"/>
-          <w:sz w:val="20"/>
-          <w:szCs w:val="20"/>
-          <w:lang w:eastAsia="en-GB"/>
-          <w14:ligatures w14:val="none"/>
-        </w:rPr>
-      </w:pPr>
-    </w:p>
-    <w:p>
-      <w:pPr>
-        <w:shd w:val="clear" w:color="auto" w:fill="FFFFFF"/>
-        <w:spacing w:before="240" w:after="0" w:line="240" w:lineRule="auto"/>
-        <w:rPr>
-          <w:rFonts w:ascii="Times New Roman" w:eastAsia="Times New Roman" w:hAnsi="Times New Roman" w:cs="Times New Roman"/>
-          <w:b/>
-          <w:bCs/>
-          <w:color w:val="000000" w:themeColor="text1"/>
-          <w:kern w:val="0"/>
-          <w:sz w:val="20"/>
-          <w:szCs w:val="20"/>
-          <w:lang w:eastAsia="en-GB"/>
-          <w14:ligatures w14:val="none"/>
-        </w:rPr>
-      </w:pPr>
-    </w:p>
-    <w:p>
-      <w:pPr>
-        <w:shd w:val="clear" w:color="auto" w:fill="FFFFFF"/>
-        <w:spacing w:before="240" w:after="0" w:line="240" w:lineRule="auto"/>
-        <w:rPr>
-          <w:rFonts w:ascii="Times New Roman" w:eastAsia="Times New Roman" w:hAnsi="Times New Roman" w:cs="Times New Roman"/>
-          <w:b/>
-          <w:bCs/>
-          <w:color w:val="000000" w:themeColor="text1"/>
-          <w:kern w:val="0"/>
-          <w:sz w:val="20"/>
-          <w:szCs w:val="20"/>
-          <w:lang w:eastAsia="en-GB"/>
-          <w14:ligatures w14:val="none"/>
-        </w:rPr>
-      </w:pPr>
-    </w:p>
-    <w:p>
-      <w:pPr>
-        <w:shd w:val="clear" w:color="auto" w:fill="FFFFFF"/>
-        <w:spacing w:before="240" w:after="0" w:line="240" w:lineRule="auto"/>
-        <w:rPr>
-          <w:rFonts w:ascii="Times New Roman" w:eastAsia="Times New Roman" w:hAnsi="Times New Roman" w:cs="Times New Roman"/>
           <w:color w:val="000000" w:themeColor="text1"/>
           <w:kern w:val="0"/>
           <w:sz w:val="20"/>
@@ -2516,8 +2457,6 @@
         <w:spacing w:before="240" w:after="0" w:line="240" w:lineRule="auto"/>
         <w:rPr>
           <w:rFonts w:ascii="Times New Roman" w:eastAsia="Times New Roman" w:hAnsi="Times New Roman" w:cs="Times New Roman"/>
-          <w:b/>
-          <w:bCs/>
           <w:color w:val="000000" w:themeColor="text1"/>
           <w:kern w:val="0"/>
           <w:sz w:val="20"/>
@@ -2559,6 +2498,60 @@
       <w:r>
         <w:rPr>
           <w:rFonts w:ascii="Times New Roman" w:eastAsia="Times New Roman" w:hAnsi="Times New Roman" w:cs="Times New Roman"/>
+          <w:color w:val="000000" w:themeColor="text1"/>
+          <w:kern w:val="0"/>
+          <w:sz w:val="20"/>
+          <w:szCs w:val="20"/>
+          <w:lang w:eastAsia="en-GB"/>
+          <w14:ligatures w14:val="none"/>
+        </w:rPr>
+        <w:t xml:space="preserve">The purpose of this document is to introduce the functions and requirements of the Home Temperature Adjustment System. This system contains a user interface and an authorized interface. The technical team can use the authorized interface and users can use the user interface. This document also includes the system’s features and </w:t>
+      </w:r>
+      <w:proofErr w:type="spellStart"/>
+      <w:r>
+        <w:rPr>
+          <w:rFonts w:ascii="Times New Roman" w:eastAsia="Times New Roman" w:hAnsi="Times New Roman" w:cs="Times New Roman"/>
+          <w:color w:val="000000" w:themeColor="text1"/>
+          <w:kern w:val="0"/>
+          <w:sz w:val="20"/>
+          <w:szCs w:val="20"/>
+          <w:lang w:eastAsia="en-GB"/>
+          <w14:ligatures w14:val="none"/>
+        </w:rPr>
+        <w:t>behaviors</w:t>
+      </w:r>
+      <w:proofErr w:type="spellEnd"/>
+      <w:r>
+        <w:rPr>
+          <w:rFonts w:ascii="Times New Roman" w:eastAsia="Times New Roman" w:hAnsi="Times New Roman" w:cs="Times New Roman"/>
+          <w:color w:val="000000" w:themeColor="text1"/>
+          <w:kern w:val="0"/>
+          <w:sz w:val="20"/>
+          <w:szCs w:val="20"/>
+          <w:lang w:eastAsia="en-GB"/>
+          <w14:ligatures w14:val="none"/>
+        </w:rPr>
+        <w:t>.</w:t>
+      </w:r>
+    </w:p>
+    <w:p>
+      <w:pPr>
+        <w:shd w:val="clear" w:color="auto" w:fill="FFFFFF"/>
+        <w:spacing w:before="240" w:after="0" w:line="240" w:lineRule="auto"/>
+        <w:jc w:val="both"/>
+        <w:rPr>
+          <w:rFonts w:ascii="Times New Roman" w:eastAsia="Times New Roman" w:hAnsi="Times New Roman" w:cs="Times New Roman"/>
+          <w:color w:val="000000" w:themeColor="text1"/>
+          <w:kern w:val="0"/>
+          <w:sz w:val="20"/>
+          <w:szCs w:val="20"/>
+          <w:lang w:eastAsia="en-GB"/>
+          <w14:ligatures w14:val="none"/>
+        </w:rPr>
+      </w:pPr>
+      <w:r>
+        <w:rPr>
+          <w:rFonts w:ascii="Times New Roman" w:eastAsia="Times New Roman" w:hAnsi="Times New Roman" w:cs="Times New Roman"/>
           <w:b/>
           <w:bCs/>
           <w:color w:val="000000" w:themeColor="text1"/>
@@ -2589,6 +2582,60 @@
       <w:r>
         <w:rPr>
           <w:rFonts w:ascii="Times New Roman" w:eastAsia="Times New Roman" w:hAnsi="Times New Roman" w:cs="Times New Roman"/>
+          <w:color w:val="000000" w:themeColor="text1"/>
+          <w:kern w:val="0"/>
+          <w:sz w:val="20"/>
+          <w:szCs w:val="20"/>
+          <w:lang w:eastAsia="en-GB"/>
+          <w14:ligatures w14:val="none"/>
+        </w:rPr>
+        <w:t xml:space="preserve">In this document main titles </w:t>
+      </w:r>
+      <w:proofErr w:type="spellStart"/>
+      <w:r>
+        <w:rPr>
+          <w:rFonts w:ascii="Times New Roman" w:eastAsia="Times New Roman" w:hAnsi="Times New Roman" w:cs="Times New Roman"/>
+          <w:color w:val="000000" w:themeColor="text1"/>
+          <w:kern w:val="0"/>
+          <w:sz w:val="20"/>
+          <w:szCs w:val="20"/>
+          <w:lang w:eastAsia="en-GB"/>
+          <w14:ligatures w14:val="none"/>
+        </w:rPr>
+        <w:t>writed</w:t>
+      </w:r>
+      <w:proofErr w:type="spellEnd"/>
+      <w:r>
+        <w:rPr>
+          <w:rFonts w:ascii="Times New Roman" w:eastAsia="Times New Roman" w:hAnsi="Times New Roman" w:cs="Times New Roman"/>
+          <w:color w:val="000000" w:themeColor="text1"/>
+          <w:kern w:val="0"/>
+          <w:sz w:val="20"/>
+          <w:szCs w:val="20"/>
+          <w:lang w:eastAsia="en-GB"/>
+          <w14:ligatures w14:val="none"/>
+        </w:rPr>
+        <w:t xml:space="preserve"> with bold font. The functional requirements are shown as ‘REQ-1,2’, non-functional requirements are shown as ‘NF-1,2’.</w:t>
+      </w:r>
+    </w:p>
+    <w:p>
+      <w:pPr>
+        <w:shd w:val="clear" w:color="auto" w:fill="FFFFFF"/>
+        <w:spacing w:before="240" w:after="0" w:line="240" w:lineRule="auto"/>
+        <w:jc w:val="both"/>
+        <w:rPr>
+          <w:rFonts w:ascii="Times New Roman" w:eastAsia="Times New Roman" w:hAnsi="Times New Roman" w:cs="Times New Roman"/>
+          <w:color w:val="000000" w:themeColor="text1"/>
+          <w:kern w:val="0"/>
+          <w:sz w:val="20"/>
+          <w:szCs w:val="20"/>
+          <w:lang w:eastAsia="en-GB"/>
+          <w14:ligatures w14:val="none"/>
+        </w:rPr>
+      </w:pPr>
+      <w:r>
+        <w:rPr>
+          <w:rFonts w:ascii="Times New Roman" w:eastAsia="Times New Roman" w:hAnsi="Times New Roman" w:cs="Times New Roman"/>
           <w:b/>
           <w:bCs/>
           <w:color w:val="000000" w:themeColor="text1"/>
@@ -2619,6 +2666,34 @@
       <w:r>
         <w:rPr>
           <w:rFonts w:ascii="Times New Roman" w:eastAsia="Times New Roman" w:hAnsi="Times New Roman" w:cs="Times New Roman"/>
+          <w:color w:val="000000" w:themeColor="text1"/>
+          <w:kern w:val="0"/>
+          <w:sz w:val="20"/>
+          <w:szCs w:val="20"/>
+          <w:lang w:eastAsia="en-GB"/>
+          <w14:ligatures w14:val="none"/>
+        </w:rPr>
+        <w:t>This document written for technical team and lecturers. Please read in title order.</w:t>
+      </w:r>
+    </w:p>
+    <w:p>
+      <w:pPr>
+        <w:shd w:val="clear" w:color="auto" w:fill="FFFFFF"/>
+        <w:spacing w:before="240" w:after="0" w:line="240" w:lineRule="auto"/>
+        <w:jc w:val="both"/>
+        <w:rPr>
+          <w:rFonts w:ascii="Times New Roman" w:eastAsia="Times New Roman" w:hAnsi="Times New Roman" w:cs="Times New Roman"/>
+          <w:color w:val="000000" w:themeColor="text1"/>
+          <w:kern w:val="0"/>
+          <w:sz w:val="20"/>
+          <w:szCs w:val="20"/>
+          <w:lang w:eastAsia="en-GB"/>
+          <w14:ligatures w14:val="none"/>
+        </w:rPr>
+      </w:pPr>
+      <w:r>
+        <w:rPr>
+          <w:rFonts w:ascii="Times New Roman" w:eastAsia="Times New Roman" w:hAnsi="Times New Roman" w:cs="Times New Roman"/>
           <w:b/>
           <w:bCs/>
           <w:color w:val="000000" w:themeColor="text1"/>
@@ -2649,6 +2724,144 @@
       <w:r>
         <w:rPr>
           <w:rFonts w:ascii="Times New Roman" w:eastAsia="Times New Roman" w:hAnsi="Times New Roman" w:cs="Times New Roman"/>
+          <w:color w:val="000000" w:themeColor="text1"/>
+          <w:kern w:val="0"/>
+          <w:sz w:val="20"/>
+          <w:szCs w:val="20"/>
+          <w:lang w:eastAsia="en-GB"/>
+          <w14:ligatures w14:val="none"/>
+        </w:rPr>
+        <w:t>Today, heating and cooling systems in homes are mostly based on manual control and this is not efficient. Forgetting to turn off the heating when leaving the house in the morning or leaving the air conditioner on all day is so common. It causes empty spaces where no one is present to be heated or cooled for hours, resulting in a huge waste of energy and high bills</w:t>
+      </w:r>
+      <w:r>
+        <w:rPr>
+          <w:rFonts w:ascii="Times New Roman" w:eastAsia="Times New Roman" w:hAnsi="Times New Roman" w:cs="Times New Roman"/>
+          <w:color w:val="000000" w:themeColor="text1"/>
+          <w:kern w:val="0"/>
+          <w:sz w:val="20"/>
+          <w:szCs w:val="20"/>
+          <w:lang w:eastAsia="en-GB"/>
+          <w14:ligatures w14:val="none"/>
+        </w:rPr>
+        <w:t>.</w:t>
+      </w:r>
+    </w:p>
+    <w:p>
+      <w:pPr>
+        <w:shd w:val="clear" w:color="auto" w:fill="FFFFFF"/>
+        <w:spacing w:before="240" w:after="0" w:line="240" w:lineRule="auto"/>
+        <w:jc w:val="both"/>
+        <w:rPr>
+          <w:rFonts w:ascii="Times New Roman" w:eastAsia="Times New Roman" w:hAnsi="Times New Roman" w:cs="Times New Roman"/>
+          <w:color w:val="000000" w:themeColor="text1"/>
+          <w:kern w:val="0"/>
+          <w:sz w:val="20"/>
+          <w:szCs w:val="20"/>
+          <w:lang w:eastAsia="en-GB"/>
+          <w14:ligatures w14:val="none"/>
+        </w:rPr>
+      </w:pPr>
+      <w:proofErr w:type="spellStart"/>
+      <w:r>
+        <w:rPr>
+          <w:rFonts w:ascii="Times New Roman" w:eastAsia="Times New Roman" w:hAnsi="Times New Roman" w:cs="Times New Roman"/>
+          <w:color w:val="000000" w:themeColor="text1"/>
+          <w:kern w:val="0"/>
+          <w:sz w:val="20"/>
+          <w:szCs w:val="20"/>
+          <w:lang w:eastAsia="en-GB"/>
+          <w14:ligatures w14:val="none"/>
+        </w:rPr>
+        <w:t>Its</w:t>
+      </w:r>
+      <w:proofErr w:type="spellEnd"/>
+      <w:r>
+        <w:rPr>
+          <w:rFonts w:ascii="Times New Roman" w:eastAsia="Times New Roman" w:hAnsi="Times New Roman" w:cs="Times New Roman"/>
+          <w:color w:val="000000" w:themeColor="text1"/>
+          <w:kern w:val="0"/>
+          <w:sz w:val="20"/>
+          <w:szCs w:val="20"/>
+          <w:lang w:eastAsia="en-GB"/>
+          <w14:ligatures w14:val="none"/>
+        </w:rPr>
+        <w:t xml:space="preserve"> not only about economic, this situation is not comfortable at all. Classical systems do not include human density. For example, the temperature that is ideal when you are alone at home can suddenly become oppressive when several more people come into the room. Since the system cannot detect this change, you have to constantly go and make manual adjustments on the device.</w:t>
+      </w:r>
+    </w:p>
+    <w:p>
+      <w:pPr>
+        <w:shd w:val="clear" w:color="auto" w:fill="FFFFFF"/>
+        <w:spacing w:before="240" w:after="0" w:line="240" w:lineRule="auto"/>
+        <w:jc w:val="both"/>
+        <w:rPr>
+          <w:rFonts w:ascii="Times New Roman" w:eastAsia="Times New Roman" w:hAnsi="Times New Roman" w:cs="Times New Roman"/>
+          <w:color w:val="000000" w:themeColor="text1"/>
+          <w:kern w:val="0"/>
+          <w:sz w:val="20"/>
+          <w:szCs w:val="20"/>
+          <w:lang w:eastAsia="en-GB"/>
+          <w14:ligatures w14:val="none"/>
+        </w:rPr>
+      </w:pPr>
+      <w:r>
+        <w:rPr>
+          <w:rFonts w:ascii="Times New Roman" w:eastAsia="Times New Roman" w:hAnsi="Times New Roman" w:cs="Times New Roman"/>
+          <w:color w:val="000000" w:themeColor="text1"/>
+          <w:kern w:val="0"/>
+          <w:sz w:val="20"/>
+          <w:szCs w:val="20"/>
+          <w:lang w:eastAsia="en-GB"/>
+          <w14:ligatures w14:val="none"/>
+        </w:rPr>
+        <w:t xml:space="preserve">These traditional methods, damage environment and energy consumption. There is a need for a smart and autonomous system will not require people to constantly think about thermostat settings in daily rush and can detect the number of people in the house and make its own decisions. </w:t>
+      </w:r>
+    </w:p>
+    <w:p>
+      <w:pPr>
+        <w:shd w:val="clear" w:color="auto" w:fill="FFFFFF"/>
+        <w:spacing w:before="240" w:after="0" w:line="240" w:lineRule="auto"/>
+        <w:jc w:val="both"/>
+        <w:rPr>
+          <w:rFonts w:ascii="Times New Roman" w:eastAsia="Times New Roman" w:hAnsi="Times New Roman" w:cs="Times New Roman"/>
+          <w:color w:val="000000" w:themeColor="text1"/>
+          <w:kern w:val="0"/>
+          <w:sz w:val="20"/>
+          <w:szCs w:val="20"/>
+          <w:lang w:eastAsia="en-GB"/>
+          <w14:ligatures w14:val="none"/>
+        </w:rPr>
+      </w:pPr>
+      <w:r>
+        <w:rPr>
+          <w:rFonts w:ascii="Times New Roman" w:eastAsia="Times New Roman" w:hAnsi="Times New Roman" w:cs="Times New Roman"/>
+          <w:color w:val="000000" w:themeColor="text1"/>
+          <w:kern w:val="0"/>
+          <w:sz w:val="20"/>
+          <w:szCs w:val="20"/>
+          <w:lang w:eastAsia="en-GB"/>
+          <w14:ligatures w14:val="none"/>
+        </w:rPr>
+        <w:t>The Home Temperature Adjustment System we designed aims to solve this problem by instantly monitoring the occupancy rate in the house. The system will reduce the bill by turning off devices when the house is vacated; when there are people at home, it will maximize comfort by automatically balancing the temperature according to the number of people.</w:t>
+      </w:r>
+    </w:p>
+    <w:p>
+      <w:pPr>
+        <w:shd w:val="clear" w:color="auto" w:fill="FFFFFF"/>
+        <w:spacing w:before="240" w:after="0" w:line="240" w:lineRule="auto"/>
+        <w:jc w:val="both"/>
+        <w:rPr>
+          <w:rFonts w:ascii="Times New Roman" w:eastAsia="Times New Roman" w:hAnsi="Times New Roman" w:cs="Times New Roman"/>
+          <w:color w:val="000000" w:themeColor="text1"/>
+          <w:kern w:val="0"/>
+          <w:sz w:val="20"/>
+          <w:szCs w:val="20"/>
+          <w:lang w:eastAsia="en-GB"/>
+          <w14:ligatures w14:val="none"/>
+        </w:rPr>
+      </w:pPr>
+      <w:r>
+        <w:rPr>
+          <w:rFonts w:ascii="Times New Roman" w:eastAsia="Times New Roman" w:hAnsi="Times New Roman" w:cs="Times New Roman"/>
           <w:b/>
           <w:bCs/>
           <w:color w:val="000000" w:themeColor="text1"/>
@@ -2708,6 +2921,150 @@
           <w14:ligatures w14:val="none"/>
         </w:rPr>
       </w:pPr>
+    </w:p>
+    <w:p>
+      <w:pPr>
+        <w:shd w:val="clear" w:color="auto" w:fill="FFFFFF"/>
+        <w:spacing w:before="240" w:after="0" w:line="240" w:lineRule="auto"/>
+        <w:jc w:val="both"/>
+        <w:rPr>
+          <w:rFonts w:ascii="Times New Roman" w:eastAsia="Times New Roman" w:hAnsi="Times New Roman" w:cs="Times New Roman"/>
+          <w:b/>
+          <w:bCs/>
+          <w:color w:val="000000" w:themeColor="text1"/>
+          <w:kern w:val="0"/>
+          <w:sz w:val="20"/>
+          <w:szCs w:val="20"/>
+          <w:lang w:eastAsia="en-GB"/>
+          <w14:ligatures w14:val="none"/>
+        </w:rPr>
+      </w:pPr>
+    </w:p>
+    <w:p>
+      <w:pPr>
+        <w:shd w:val="clear" w:color="auto" w:fill="FFFFFF"/>
+        <w:spacing w:before="240" w:after="0" w:line="240" w:lineRule="auto"/>
+        <w:jc w:val="both"/>
+        <w:rPr>
+          <w:rFonts w:ascii="Times New Roman" w:eastAsia="Times New Roman" w:hAnsi="Times New Roman" w:cs="Times New Roman"/>
+          <w:b/>
+          <w:bCs/>
+          <w:color w:val="000000" w:themeColor="text1"/>
+          <w:kern w:val="0"/>
+          <w:sz w:val="20"/>
+          <w:szCs w:val="20"/>
+          <w:lang w:eastAsia="en-GB"/>
+          <w14:ligatures w14:val="none"/>
+        </w:rPr>
+      </w:pPr>
+    </w:p>
+    <w:p>
+      <w:pPr>
+        <w:shd w:val="clear" w:color="auto" w:fill="FFFFFF"/>
+        <w:spacing w:before="240" w:after="0" w:line="240" w:lineRule="auto"/>
+        <w:jc w:val="both"/>
+        <w:rPr>
+          <w:rFonts w:ascii="Times New Roman" w:eastAsia="Times New Roman" w:hAnsi="Times New Roman" w:cs="Times New Roman"/>
+          <w:b/>
+          <w:bCs/>
+          <w:color w:val="000000" w:themeColor="text1"/>
+          <w:kern w:val="0"/>
+          <w:sz w:val="20"/>
+          <w:szCs w:val="20"/>
+          <w:lang w:eastAsia="en-GB"/>
+          <w14:ligatures w14:val="none"/>
+        </w:rPr>
+      </w:pPr>
+    </w:p>
+    <w:p>
+      <w:pPr>
+        <w:shd w:val="clear" w:color="auto" w:fill="FFFFFF"/>
+        <w:spacing w:before="240" w:after="0" w:line="240" w:lineRule="auto"/>
+        <w:jc w:val="both"/>
+        <w:rPr>
+          <w:rFonts w:ascii="Times New Roman" w:eastAsia="Times New Roman" w:hAnsi="Times New Roman" w:cs="Times New Roman"/>
+          <w:b/>
+          <w:bCs/>
+          <w:color w:val="000000" w:themeColor="text1"/>
+          <w:kern w:val="0"/>
+          <w:sz w:val="20"/>
+          <w:szCs w:val="20"/>
+          <w:lang w:eastAsia="en-GB"/>
+          <w14:ligatures w14:val="none"/>
+        </w:rPr>
+      </w:pPr>
+    </w:p>
+    <w:p>
+      <w:pPr>
+        <w:shd w:val="clear" w:color="auto" w:fill="FFFFFF"/>
+        <w:spacing w:before="240" w:after="0" w:line="240" w:lineRule="auto"/>
+        <w:jc w:val="both"/>
+        <w:rPr>
+          <w:rFonts w:ascii="Times New Roman" w:eastAsia="Times New Roman" w:hAnsi="Times New Roman" w:cs="Times New Roman"/>
+          <w:b/>
+          <w:bCs/>
+          <w:color w:val="000000" w:themeColor="text1"/>
+          <w:kern w:val="0"/>
+          <w:sz w:val="20"/>
+          <w:szCs w:val="20"/>
+          <w:lang w:eastAsia="en-GB"/>
+          <w14:ligatures w14:val="none"/>
+        </w:rPr>
+      </w:pPr>
+    </w:p>
+    <w:p>
+      <w:pPr>
+        <w:shd w:val="clear" w:color="auto" w:fill="FFFFFF"/>
+        <w:spacing w:before="240" w:after="0" w:line="240" w:lineRule="auto"/>
+        <w:jc w:val="both"/>
+        <w:rPr>
+          <w:rFonts w:ascii="Times New Roman" w:eastAsia="Times New Roman" w:hAnsi="Times New Roman" w:cs="Times New Roman"/>
+          <w:b/>
+          <w:bCs/>
+          <w:color w:val="000000" w:themeColor="text1"/>
+          <w:kern w:val="0"/>
+          <w:sz w:val="20"/>
+          <w:szCs w:val="20"/>
+          <w:lang w:eastAsia="en-GB"/>
+          <w14:ligatures w14:val="none"/>
+        </w:rPr>
+      </w:pPr>
+    </w:p>
+    <w:p>
+      <w:pPr>
+        <w:shd w:val="clear" w:color="auto" w:fill="FFFFFF"/>
+        <w:spacing w:before="240" w:after="0" w:line="240" w:lineRule="auto"/>
+        <w:jc w:val="both"/>
+        <w:rPr>
+          <w:rFonts w:ascii="Times New Roman" w:eastAsia="Times New Roman" w:hAnsi="Times New Roman" w:cs="Times New Roman"/>
+          <w:b/>
+          <w:bCs/>
+          <w:color w:val="000000" w:themeColor="text1"/>
+          <w:kern w:val="0"/>
+          <w:sz w:val="20"/>
+          <w:szCs w:val="20"/>
+          <w:lang w:eastAsia="en-GB"/>
+          <w14:ligatures w14:val="none"/>
+        </w:rPr>
+      </w:pPr>
+    </w:p>
+    <w:p>
+      <w:pPr>
+        <w:shd w:val="clear" w:color="auto" w:fill="FFFFFF"/>
+        <w:spacing w:before="240" w:after="0" w:line="240" w:lineRule="auto"/>
+        <w:jc w:val="both"/>
+        <w:rPr>
+          <w:rFonts w:ascii="Times New Roman" w:eastAsia="Times New Roman" w:hAnsi="Times New Roman" w:cs="Times New Roman"/>
+          <w:b/>
+          <w:bCs/>
+          <w:color w:val="000000" w:themeColor="text1"/>
+          <w:kern w:val="0"/>
+          <w:sz w:val="20"/>
+          <w:szCs w:val="20"/>
+          <w:lang w:eastAsia="en-GB"/>
+          <w14:ligatures w14:val="none"/>
+        </w:rPr>
+      </w:pPr>
       <w:r>
         <w:rPr>
           <w:rFonts w:ascii="Times New Roman" w:eastAsia="Times New Roman" w:hAnsi="Times New Roman" w:cs="Times New Roman"/>
@@ -2730,8 +3087,6 @@
         <w:jc w:val="both"/>
         <w:rPr>
           <w:rFonts w:ascii="Times New Roman" w:eastAsia="Times New Roman" w:hAnsi="Times New Roman" w:cs="Times New Roman"/>
-          <w:b/>
-          <w:bCs/>
           <w:color w:val="000000" w:themeColor="text1"/>
           <w:kern w:val="0"/>
           <w:sz w:val="20"/>
@@ -2745,9 +3100,8 @@
           <w:rFonts w:ascii="Times New Roman" w:hAnsi="Times New Roman" w:cs="Times New Roman"/>
           <w:noProof/>
         </w:rPr>
-        <w:lastRenderedPageBreak/>
         <w:drawing>
-          <wp:inline distT="0" distB="0" distL="0" distR="0" wp14:anchorId="06EBEC48" wp14:editId="279FAD77">
+          <wp:inline distT="0" distB="0" distL="0" distR="0" wp14:anchorId="0B422672" wp14:editId="6DDB92CC">
             <wp:extent cx="5731510" cy="2962275"/>
             <wp:effectExtent l="0" t="0" r="0" b="0"/>
             <wp:docPr id="1021091481" name="Resim 1"/>
@@ -2800,6 +3154,51 @@
       <w:pPr>
         <w:shd w:val="clear" w:color="auto" w:fill="FFFFFF"/>
         <w:spacing w:before="240" w:after="0" w:line="240" w:lineRule="auto"/>
+        <w:jc w:val="center"/>
+        <w:rPr>
+          <w:rFonts w:ascii="Times New Roman" w:eastAsia="Times New Roman" w:hAnsi="Times New Roman" w:cs="Times New Roman"/>
+          <w:color w:val="000000" w:themeColor="text1"/>
+          <w:kern w:val="0"/>
+          <w:sz w:val="20"/>
+          <w:szCs w:val="20"/>
+          <w:lang w:eastAsia="en-GB"/>
+          <w14:ligatures w14:val="none"/>
+        </w:rPr>
+      </w:pPr>
+      <w:r>
+        <w:rPr>
+          <w:rFonts w:ascii="Times New Roman" w:eastAsia="Times New Roman" w:hAnsi="Times New Roman" w:cs="Times New Roman"/>
+          <w:color w:val="000000" w:themeColor="text1"/>
+          <w:kern w:val="0"/>
+          <w:sz w:val="20"/>
+          <w:szCs w:val="20"/>
+          <w:lang w:eastAsia="en-GB"/>
+          <w14:ligatures w14:val="none"/>
+        </w:rPr>
+        <w:t>Figure 1</w:t>
+      </w:r>
+    </w:p>
+    <w:p>
+      <w:pPr>
+        <w:shd w:val="clear" w:color="auto" w:fill="FFFFFF"/>
+        <w:spacing w:before="240" w:after="0" w:line="240" w:lineRule="auto"/>
+        <w:jc w:val="center"/>
+        <w:rPr>
+          <w:rFonts w:ascii="Times New Roman" w:eastAsia="Times New Roman" w:hAnsi="Times New Roman" w:cs="Times New Roman"/>
+          <w:color w:val="000000" w:themeColor="text1"/>
+          <w:kern w:val="0"/>
+          <w:sz w:val="20"/>
+          <w:szCs w:val="20"/>
+          <w:lang w:eastAsia="en-GB"/>
+          <w14:ligatures w14:val="none"/>
+        </w:rPr>
+      </w:pPr>
+    </w:p>
+    <w:p>
+      <w:pPr>
+        <w:shd w:val="clear" w:color="auto" w:fill="FFFFFF"/>
+        <w:spacing w:before="240" w:after="0" w:line="240" w:lineRule="auto"/>
+        <w:jc w:val="both"/>
         <w:rPr>
           <w:rFonts w:ascii="Times New Roman" w:eastAsia="Times New Roman" w:hAnsi="Times New Roman" w:cs="Times New Roman"/>
           <w:b/>
@@ -2831,6 +3230,172 @@
       <w:pPr>
         <w:shd w:val="clear" w:color="auto" w:fill="FFFFFF"/>
         <w:spacing w:before="240" w:after="0" w:line="240" w:lineRule="auto"/>
+        <w:jc w:val="both"/>
+        <w:rPr>
+          <w:rFonts w:ascii="Times New Roman" w:eastAsia="Times New Roman" w:hAnsi="Times New Roman" w:cs="Times New Roman"/>
+          <w:color w:val="000000" w:themeColor="text1"/>
+          <w:kern w:val="0"/>
+          <w:sz w:val="20"/>
+          <w:szCs w:val="20"/>
+          <w:lang w:eastAsia="en-GB"/>
+          <w14:ligatures w14:val="none"/>
+        </w:rPr>
+      </w:pPr>
+      <w:r>
+        <w:rPr>
+          <w:rFonts w:ascii="Times New Roman" w:hAnsi="Times New Roman" w:cs="Times New Roman"/>
+          <w:noProof/>
+        </w:rPr>
+        <w:drawing>
+          <wp:inline distT="0" distB="0" distL="0" distR="0" wp14:anchorId="68211023" wp14:editId="6A004FAB">
+            <wp:extent cx="3924300" cy="2697793"/>
+            <wp:effectExtent l="0" t="0" r="0" b="7620"/>
+            <wp:docPr id="2094520763" name="Resim 3"/>
+            <wp:cNvGraphicFramePr>
+              <a:graphicFrameLocks xmlns:a="http://schemas.openxmlformats.org/drawingml/2006/main" noChangeAspect="1"/>
+            </wp:cNvGraphicFramePr>
+            <a:graphic xmlns:a="http://schemas.openxmlformats.org/drawingml/2006/main">
+              <a:graphicData uri="http://schemas.openxmlformats.org/drawingml/2006/picture">
+                <pic:pic xmlns:pic="http://schemas.openxmlformats.org/drawingml/2006/picture">
+                  <pic:nvPicPr>
+                    <pic:cNvPr id="0" name="Picture 5"/>
+                    <pic:cNvPicPr>
+                      <a:picLocks noChangeAspect="1" noChangeArrowheads="1"/>
+                    </pic:cNvPicPr>
+                  </pic:nvPicPr>
+                  <pic:blipFill>
+                    <a:blip r:embed="rId6" cstate="print">
+                      <a:extLst>
+                        <a:ext uri="{28A0092B-C50C-407E-A947-70E740481C1C}">
+                          <a14:useLocalDpi xmlns:a14="http://schemas.microsoft.com/office/drawing/2010/main" val="0"/>
+                        </a:ext>
+                      </a:extLst>
+                    </a:blip>
+                    <a:srcRect/>
+                    <a:stretch>
+                      <a:fillRect/>
+                    </a:stretch>
+                  </pic:blipFill>
+                  <pic:spPr bwMode="auto">
+                    <a:xfrm>
+                      <a:off x="0" y="0"/>
+                      <a:ext cx="3929334" cy="2701253"/>
+                    </a:xfrm>
+                    <a:prstGeom prst="rect">
+                      <a:avLst/>
+                    </a:prstGeom>
+                    <a:noFill/>
+                    <a:ln>
+                      <a:noFill/>
+                    </a:ln>
+                  </pic:spPr>
+                </pic:pic>
+              </a:graphicData>
+            </a:graphic>
+          </wp:inline>
+        </w:drawing>
+      </w:r>
+    </w:p>
+    <w:p>
+      <w:pPr>
+        <w:shd w:val="clear" w:color="auto" w:fill="FFFFFF"/>
+        <w:spacing w:before="240" w:after="0" w:line="240" w:lineRule="auto"/>
+        <w:jc w:val="center"/>
+        <w:rPr>
+          <w:rFonts w:ascii="Times New Roman" w:eastAsia="Times New Roman" w:hAnsi="Times New Roman" w:cs="Times New Roman"/>
+          <w:color w:val="000000" w:themeColor="text1"/>
+          <w:kern w:val="0"/>
+          <w:sz w:val="20"/>
+          <w:szCs w:val="20"/>
+          <w:lang w:eastAsia="en-GB"/>
+          <w14:ligatures w14:val="none"/>
+        </w:rPr>
+      </w:pPr>
+      <w:r>
+        <w:rPr>
+          <w:rFonts w:ascii="Times New Roman" w:eastAsia="Times New Roman" w:hAnsi="Times New Roman" w:cs="Times New Roman"/>
+          <w:color w:val="000000" w:themeColor="text1"/>
+          <w:kern w:val="0"/>
+          <w:sz w:val="20"/>
+          <w:szCs w:val="20"/>
+          <w:lang w:eastAsia="en-GB"/>
+          <w14:ligatures w14:val="none"/>
+        </w:rPr>
+        <w:t>Figure 2</w:t>
+      </w:r>
+    </w:p>
+    <w:p>
+      <w:pPr>
+        <w:shd w:val="clear" w:color="auto" w:fill="FFFFFF"/>
+        <w:spacing w:before="240" w:after="0" w:line="240" w:lineRule="auto"/>
+        <w:rPr>
+          <w:rFonts w:ascii="Times New Roman" w:eastAsia="Times New Roman" w:hAnsi="Times New Roman" w:cs="Times New Roman"/>
+          <w:color w:val="000000" w:themeColor="text1"/>
+          <w:kern w:val="0"/>
+          <w:sz w:val="20"/>
+          <w:szCs w:val="20"/>
+          <w:lang w:eastAsia="en-GB"/>
+          <w14:ligatures w14:val="none"/>
+        </w:rPr>
+      </w:pPr>
+    </w:p>
+    <w:p>
+      <w:pPr>
+        <w:shd w:val="clear" w:color="auto" w:fill="FFFFFF"/>
+        <w:spacing w:before="240" w:after="0" w:line="240" w:lineRule="auto"/>
+        <w:jc w:val="both"/>
+        <w:rPr>
+          <w:rFonts w:ascii="Times New Roman" w:eastAsia="Times New Roman" w:hAnsi="Times New Roman" w:cs="Times New Roman"/>
+          <w:color w:val="000000" w:themeColor="text1"/>
+          <w:kern w:val="0"/>
+          <w:sz w:val="20"/>
+          <w:szCs w:val="20"/>
+          <w:lang w:eastAsia="en-GB"/>
+          <w14:ligatures w14:val="none"/>
+        </w:rPr>
+      </w:pPr>
+      <w:r>
+        <w:rPr>
+          <w:rFonts w:ascii="Times New Roman" w:eastAsia="Times New Roman" w:hAnsi="Times New Roman" w:cs="Times New Roman"/>
+          <w:color w:val="000000" w:themeColor="text1"/>
+          <w:kern w:val="0"/>
+          <w:sz w:val="20"/>
+          <w:szCs w:val="20"/>
+          <w:lang w:eastAsia="en-GB"/>
+          <w14:ligatures w14:val="none"/>
+        </w:rPr>
+        <w:lastRenderedPageBreak/>
+        <w:t>System; It operates in five basic states: Idle, Manual, Automatic, Energy Saving and Safe Mode. In case of any critical error (such as loss of sensor connection), the system automatically switches to 'Safe Mode' and maintains a safe temperature</w:t>
+      </w:r>
+      <w:r>
+        <w:rPr>
+          <w:rFonts w:ascii="Times New Roman" w:eastAsia="Times New Roman" w:hAnsi="Times New Roman" w:cs="Times New Roman"/>
+          <w:color w:val="000000" w:themeColor="text1"/>
+          <w:kern w:val="0"/>
+          <w:sz w:val="20"/>
+          <w:szCs w:val="20"/>
+          <w:lang w:eastAsia="en-GB"/>
+          <w14:ligatures w14:val="none"/>
+        </w:rPr>
+        <w:t xml:space="preserve"> </w:t>
+      </w:r>
+      <w:r>
+        <w:rPr>
+          <w:rFonts w:ascii="Times New Roman" w:eastAsia="Times New Roman" w:hAnsi="Times New Roman" w:cs="Times New Roman"/>
+          <w:color w:val="000000" w:themeColor="text1"/>
+          <w:kern w:val="0"/>
+          <w:sz w:val="20"/>
+          <w:szCs w:val="20"/>
+          <w:lang w:eastAsia="en-GB"/>
+          <w14:ligatures w14:val="none"/>
+        </w:rPr>
+        <w:t>(e.g. 21°C).</w:t>
+      </w:r>
+    </w:p>
+    <w:p>
+      <w:pPr>
+        <w:shd w:val="clear" w:color="auto" w:fill="FFFFFF"/>
+        <w:spacing w:before="240" w:after="0" w:line="240" w:lineRule="auto"/>
         <w:rPr>
           <w:rFonts w:ascii="Times New Roman" w:eastAsia="Times New Roman" w:hAnsi="Times New Roman" w:cs="Times New Roman"/>
           <w:b/>
@@ -2871,23 +3436,6 @@
         </w:rPr>
         <w:t>tics</w:t>
       </w:r>
-    </w:p>
-    <w:p>
-      <w:pPr>
-        <w:shd w:val="clear" w:color="auto" w:fill="FFFFFF"/>
-        <w:spacing w:before="240" w:after="0" w:line="240" w:lineRule="auto"/>
-        <w:rPr>
-          <w:rFonts w:ascii="Times New Roman" w:eastAsia="Times New Roman" w:hAnsi="Times New Roman" w:cs="Times New Roman"/>
-          <w:b/>
-          <w:bCs/>
-          <w:color w:val="000000" w:themeColor="text1"/>
-          <w:kern w:val="0"/>
-          <w:sz w:val="20"/>
-          <w:szCs w:val="20"/>
-          <w:lang w:eastAsia="en-GB"/>
-          <w14:ligatures w14:val="none"/>
-        </w:rPr>
-      </w:pPr>
       <w:r>
         <w:rPr>
           <w:rFonts w:ascii="Times New Roman" w:eastAsia="Times New Roman" w:hAnsi="Times New Roman" w:cs="Times New Roman"/>
@@ -2902,7 +3450,7 @@
           <w14:ligatures w14:val="none"/>
         </w:rPr>
         <w:drawing>
-          <wp:inline distT="0" distB="0" distL="0" distR="0" wp14:anchorId="637BE7FA" wp14:editId="4254FB94">
+          <wp:inline distT="0" distB="0" distL="0" distR="0" wp14:anchorId="677B428E" wp14:editId="6A2A2508">
             <wp:extent cx="3970020" cy="2977735"/>
             <wp:effectExtent l="0" t="0" r="0" b="0"/>
             <wp:docPr id="925319986" name="Resim 4"/>
@@ -2919,7 +3467,7 @@
                     </pic:cNvPicPr>
                   </pic:nvPicPr>
                   <pic:blipFill>
-                    <a:blip r:embed="rId6" cstate="print">
+                    <a:blip r:embed="rId7" cstate="print">
                       <a:extLst>
                         <a:ext uri="{28A0092B-C50C-407E-A947-70E740481C1C}">
                           <a14:useLocalDpi xmlns:a14="http://schemas.microsoft.com/office/drawing/2010/main" val="0"/>
@@ -2955,6 +3503,34 @@
       <w:pPr>
         <w:shd w:val="clear" w:color="auto" w:fill="FFFFFF"/>
         <w:spacing w:before="240" w:after="0" w:line="240" w:lineRule="auto"/>
+        <w:jc w:val="center"/>
+        <w:rPr>
+          <w:rFonts w:ascii="Times New Roman" w:eastAsia="Times New Roman" w:hAnsi="Times New Roman" w:cs="Times New Roman"/>
+          <w:color w:val="000000" w:themeColor="text1"/>
+          <w:kern w:val="0"/>
+          <w:sz w:val="20"/>
+          <w:szCs w:val="20"/>
+          <w:lang w:eastAsia="en-GB"/>
+          <w14:ligatures w14:val="none"/>
+        </w:rPr>
+      </w:pPr>
+      <w:r>
+        <w:rPr>
+          <w:rFonts w:ascii="Times New Roman" w:eastAsia="Times New Roman" w:hAnsi="Times New Roman" w:cs="Times New Roman"/>
+          <w:color w:val="000000" w:themeColor="text1"/>
+          <w:kern w:val="0"/>
+          <w:sz w:val="20"/>
+          <w:szCs w:val="20"/>
+          <w:lang w:eastAsia="en-GB"/>
+          <w14:ligatures w14:val="none"/>
+        </w:rPr>
+        <w:t>Figure 3</w:t>
+      </w:r>
+    </w:p>
+    <w:p>
+      <w:pPr>
+        <w:shd w:val="clear" w:color="auto" w:fill="FFFFFF"/>
+        <w:spacing w:before="240" w:after="0" w:line="240" w:lineRule="auto"/>
         <w:jc w:val="both"/>
         <w:rPr>
           <w:rFonts w:ascii="Times New Roman" w:eastAsia="Times New Roman" w:hAnsi="Times New Roman" w:cs="Times New Roman"/>
@@ -3107,11 +3683,9 @@
       <w:pPr>
         <w:shd w:val="clear" w:color="auto" w:fill="FFFFFF"/>
         <w:spacing w:before="240" w:after="0" w:line="240" w:lineRule="auto"/>
-        <w:jc w:val="both"/>
-        <w:rPr>
-          <w:rFonts w:ascii="Times New Roman" w:eastAsia="Times New Roman" w:hAnsi="Times New Roman" w:cs="Times New Roman"/>
-          <w:b/>
-          <w:bCs/>
+        <w:jc w:val="center"/>
+        <w:rPr>
+          <w:rFonts w:ascii="Times New Roman" w:eastAsia="Times New Roman" w:hAnsi="Times New Roman" w:cs="Times New Roman"/>
           <w:color w:val="000000" w:themeColor="text1"/>
           <w:kern w:val="0"/>
           <w:sz w:val="20"/>
@@ -3125,15 +3699,14 @@
           <w:rFonts w:ascii="Times New Roman" w:hAnsi="Times New Roman" w:cs="Times New Roman"/>
           <w:noProof/>
         </w:rPr>
-        <w:lastRenderedPageBreak/>
         <w:drawing>
-          <wp:anchor distT="0" distB="0" distL="114300" distR="114300" simplePos="0" relativeHeight="251659264" behindDoc="0" locked="0" layoutInCell="1" allowOverlap="1" wp14:anchorId="01CC31EB" wp14:editId="6446711C">
-            <wp:simplePos x="0" y="0"/>
+          <wp:anchor distT="0" distB="0" distL="114300" distR="114300" simplePos="0" relativeHeight="251658240" behindDoc="0" locked="0" layoutInCell="1" allowOverlap="1" wp14:anchorId="359B4881" wp14:editId="0BE84EF8">
+            <wp:simplePos x="914400" y="5684520"/>
             <wp:positionH relativeFrom="column">
-              <wp:posOffset>0</wp:posOffset>
+              <wp:align>left</wp:align>
             </wp:positionH>
             <wp:positionV relativeFrom="paragraph">
-              <wp:posOffset>295910</wp:posOffset>
+              <wp:align>top</wp:align>
             </wp:positionV>
             <wp:extent cx="5731510" cy="2195195"/>
             <wp:effectExtent l="0" t="0" r="2540" b="0"/>
@@ -3152,7 +3725,7 @@
                     </pic:cNvPicPr>
                   </pic:nvPicPr>
                   <pic:blipFill>
-                    <a:blip r:embed="rId7" cstate="print">
+                    <a:blip r:embed="rId8" cstate="print">
                       <a:extLst>
                         <a:ext uri="{28A0092B-C50C-407E-A947-70E740481C1C}">
                           <a14:useLocalDpi xmlns:a14="http://schemas.microsoft.com/office/drawing/2010/main" val="0"/>
@@ -3183,6 +3756,30 @@
           </wp:anchor>
         </w:drawing>
       </w:r>
+      <w:r>
+        <w:rPr>
+          <w:rFonts w:ascii="Times New Roman" w:eastAsia="Times New Roman" w:hAnsi="Times New Roman" w:cs="Times New Roman"/>
+          <w:color w:val="000000" w:themeColor="text1"/>
+          <w:kern w:val="0"/>
+          <w:sz w:val="20"/>
+          <w:szCs w:val="20"/>
+          <w:lang w:eastAsia="en-GB"/>
+          <w14:ligatures w14:val="none"/>
+        </w:rPr>
+        <w:br w:type="textWrapping" w:clear="all"/>
+      </w:r>
+      <w:r>
+        <w:rPr>
+          <w:rFonts w:ascii="Times New Roman" w:eastAsia="Times New Roman" w:hAnsi="Times New Roman" w:cs="Times New Roman"/>
+          <w:color w:val="000000" w:themeColor="text1"/>
+          <w:kern w:val="0"/>
+          <w:sz w:val="20"/>
+          <w:szCs w:val="20"/>
+          <w:lang w:eastAsia="en-GB"/>
+          <w14:ligatures w14:val="none"/>
+        </w:rPr>
+        <w:t>Figure 4</w:t>
+      </w:r>
     </w:p>
     <w:p>
       <w:pPr>
@@ -3219,16 +3816,29 @@
         <w:jc w:val="both"/>
         <w:rPr>
           <w:rFonts w:ascii="Times New Roman" w:eastAsia="Times New Roman" w:hAnsi="Times New Roman" w:cs="Times New Roman"/>
-          <w:b/>
-          <w:bCs/>
-          <w:color w:val="000000" w:themeColor="text1"/>
-          <w:kern w:val="0"/>
-          <w:sz w:val="20"/>
-          <w:szCs w:val="20"/>
-          <w:lang w:eastAsia="en-GB"/>
-          <w14:ligatures w14:val="none"/>
-        </w:rPr>
-      </w:pPr>
+          <w:color w:val="000000" w:themeColor="text1"/>
+          <w:kern w:val="0"/>
+          <w:sz w:val="20"/>
+          <w:szCs w:val="20"/>
+          <w:lang w:eastAsia="en-GB"/>
+          <w14:ligatures w14:val="none"/>
+        </w:rPr>
+      </w:pPr>
+      <w:r>
+        <w:rPr>
+          <w:rFonts w:ascii="Times New Roman" w:eastAsia="Times New Roman" w:hAnsi="Times New Roman" w:cs="Times New Roman"/>
+          <w:b/>
+          <w:bCs/>
+          <w:color w:val="000000" w:themeColor="text1"/>
+          <w:kern w:val="0"/>
+          <w:sz w:val="20"/>
+          <w:szCs w:val="20"/>
+          <w:lang w:eastAsia="en-GB"/>
+          <w14:ligatures w14:val="none"/>
+        </w:rPr>
+        <w:lastRenderedPageBreak/>
+        <w:t>4. External Interface Requirements</w:t>
+      </w:r>
     </w:p>
     <w:p>
       <w:pPr>
@@ -3257,7 +3867,7 @@
           <w:lang w:eastAsia="en-GB"/>
           <w14:ligatures w14:val="none"/>
         </w:rPr>
-        <w:t>4. External Interface Requirements</w:t>
+        <w:t>4.1. User Interfaces Overview</w:t>
       </w:r>
     </w:p>
     <w:p>
@@ -3287,7 +3897,7 @@
           <w:lang w:eastAsia="en-GB"/>
           <w14:ligatures w14:val="none"/>
         </w:rPr>
-        <w:t>4.1. User Interfaces Overview</w:t>
+        <w:t>4.2. Hardware Interfaces</w:t>
       </w:r>
     </w:p>
     <w:p>
@@ -3317,7 +3927,7 @@
           <w:lang w:eastAsia="en-GB"/>
           <w14:ligatures w14:val="none"/>
         </w:rPr>
-        <w:t>4.2. Hardware Interfaces</w:t>
+        <w:t>4.3. Software Interfaces</w:t>
       </w:r>
     </w:p>
     <w:p>
@@ -3347,7 +3957,7 @@
           <w:lang w:eastAsia="en-GB"/>
           <w14:ligatures w14:val="none"/>
         </w:rPr>
-        <w:t>4.3. Software Interfaces</w:t>
+        <w:t>5. System Features/Modules</w:t>
       </w:r>
     </w:p>
     <w:p>
@@ -3357,27 +3967,29 @@
         <w:jc w:val="both"/>
         <w:rPr>
           <w:rFonts w:ascii="Times New Roman" w:eastAsia="Times New Roman" w:hAnsi="Times New Roman" w:cs="Times New Roman"/>
-          <w:color w:val="000000" w:themeColor="text1"/>
-          <w:kern w:val="0"/>
-          <w:sz w:val="20"/>
-          <w:szCs w:val="20"/>
-          <w:lang w:eastAsia="en-GB"/>
-          <w14:ligatures w14:val="none"/>
-        </w:rPr>
-      </w:pPr>
-      <w:r>
-        <w:rPr>
-          <w:rFonts w:ascii="Times New Roman" w:eastAsia="Times New Roman" w:hAnsi="Times New Roman" w:cs="Times New Roman"/>
-          <w:b/>
-          <w:bCs/>
-          <w:color w:val="000000" w:themeColor="text1"/>
-          <w:kern w:val="0"/>
-          <w:sz w:val="20"/>
-          <w:szCs w:val="20"/>
-          <w:lang w:eastAsia="en-GB"/>
-          <w14:ligatures w14:val="none"/>
-        </w:rPr>
-        <w:t>5. System Features/Modules</w:t>
+          <w:b/>
+          <w:bCs/>
+          <w:color w:val="000000" w:themeColor="text1"/>
+          <w:kern w:val="0"/>
+          <w:sz w:val="20"/>
+          <w:szCs w:val="20"/>
+          <w:lang w:eastAsia="en-GB"/>
+          <w14:ligatures w14:val="none"/>
+        </w:rPr>
+      </w:pPr>
+      <w:r>
+        <w:rPr>
+          <w:rFonts w:ascii="Times New Roman" w:eastAsia="Times New Roman" w:hAnsi="Times New Roman" w:cs="Times New Roman"/>
+          <w:b/>
+          <w:bCs/>
+          <w:color w:val="000000" w:themeColor="text1"/>
+          <w:kern w:val="0"/>
+          <w:sz w:val="20"/>
+          <w:szCs w:val="20"/>
+          <w:lang w:eastAsia="en-GB"/>
+          <w14:ligatures w14:val="none"/>
+        </w:rPr>
+        <w:t>5.1 System Feature Name</w:t>
       </w:r>
     </w:p>
     <w:p>
@@ -3387,29 +3999,55 @@
         <w:jc w:val="both"/>
         <w:rPr>
           <w:rFonts w:ascii="Times New Roman" w:eastAsia="Times New Roman" w:hAnsi="Times New Roman" w:cs="Times New Roman"/>
-          <w:b/>
-          <w:bCs/>
-          <w:color w:val="000000" w:themeColor="text1"/>
-          <w:kern w:val="0"/>
-          <w:sz w:val="20"/>
-          <w:szCs w:val="20"/>
-          <w:lang w:eastAsia="en-GB"/>
-          <w14:ligatures w14:val="none"/>
-        </w:rPr>
-      </w:pPr>
-      <w:r>
-        <w:rPr>
-          <w:rFonts w:ascii="Times New Roman" w:eastAsia="Times New Roman" w:hAnsi="Times New Roman" w:cs="Times New Roman"/>
-          <w:b/>
-          <w:bCs/>
-          <w:color w:val="000000" w:themeColor="text1"/>
-          <w:kern w:val="0"/>
-          <w:sz w:val="20"/>
-          <w:szCs w:val="20"/>
-          <w:lang w:eastAsia="en-GB"/>
-          <w14:ligatures w14:val="none"/>
-        </w:rPr>
-        <w:t>5.1 System Feature Name</w:t>
+          <w:color w:val="000000" w:themeColor="text1"/>
+          <w:kern w:val="0"/>
+          <w:sz w:val="20"/>
+          <w:szCs w:val="20"/>
+          <w:lang w:eastAsia="en-GB"/>
+          <w14:ligatures w14:val="none"/>
+        </w:rPr>
+      </w:pPr>
+      <w:r>
+        <w:rPr>
+          <w:rFonts w:ascii="Times New Roman" w:eastAsia="Times New Roman" w:hAnsi="Times New Roman" w:cs="Times New Roman"/>
+          <w:b/>
+          <w:bCs/>
+          <w:color w:val="000000" w:themeColor="text1"/>
+          <w:kern w:val="0"/>
+          <w:sz w:val="20"/>
+          <w:szCs w:val="20"/>
+          <w:lang w:eastAsia="en-GB"/>
+          <w14:ligatures w14:val="none"/>
+        </w:rPr>
+        <w:t>5.1.</w:t>
+      </w:r>
+      <w:r>
+        <w:rPr>
+          <w:rFonts w:ascii="Times New Roman" w:eastAsia="Times New Roman" w:hAnsi="Times New Roman" w:cs="Times New Roman"/>
+          <w:b/>
+          <w:bCs/>
+          <w:color w:val="000000" w:themeColor="text1"/>
+          <w:kern w:val="0"/>
+          <w:sz w:val="20"/>
+          <w:szCs w:val="20"/>
+          <w:lang w:eastAsia="en-GB"/>
+          <w14:ligatures w14:val="none"/>
+        </w:rPr>
+        <w:t>1.</w:t>
+      </w:r>
+      <w:r>
+        <w:rPr>
+          <w:rFonts w:ascii="Times New Roman" w:eastAsia="Times New Roman" w:hAnsi="Times New Roman" w:cs="Times New Roman"/>
+          <w:b/>
+          <w:bCs/>
+          <w:color w:val="000000" w:themeColor="text1"/>
+          <w:kern w:val="0"/>
+          <w:sz w:val="20"/>
+          <w:szCs w:val="20"/>
+          <w:lang w:eastAsia="en-GB"/>
+          <w14:ligatures w14:val="none"/>
+        </w:rPr>
+        <w:t xml:space="preserve"> Description and Priority</w:t>
       </w:r>
     </w:p>
     <w:p>
@@ -3439,35 +4077,7 @@
           <w:lang w:eastAsia="en-GB"/>
           <w14:ligatures w14:val="none"/>
         </w:rPr>
-        <w:t>5.1.</w:t>
-      </w:r>
-      <w:r>
-        <w:rPr>
-          <w:rFonts w:ascii="Times New Roman" w:eastAsia="Times New Roman" w:hAnsi="Times New Roman" w:cs="Times New Roman"/>
-          <w:b/>
-          <w:bCs/>
-          <w:color w:val="000000" w:themeColor="text1"/>
-          <w:kern w:val="0"/>
-          <w:sz w:val="20"/>
-          <w:szCs w:val="20"/>
-          <w:lang w:eastAsia="en-GB"/>
-          <w14:ligatures w14:val="none"/>
-        </w:rPr>
-        <w:t>1.</w:t>
-      </w:r>
-      <w:r>
-        <w:rPr>
-          <w:rFonts w:ascii="Times New Roman" w:eastAsia="Times New Roman" w:hAnsi="Times New Roman" w:cs="Times New Roman"/>
-          <w:b/>
-          <w:bCs/>
-          <w:color w:val="000000" w:themeColor="text1"/>
-          <w:kern w:val="0"/>
-          <w:sz w:val="20"/>
-          <w:szCs w:val="20"/>
-          <w:lang w:eastAsia="en-GB"/>
-          <w14:ligatures w14:val="none"/>
-        </w:rPr>
-        <w:t xml:space="preserve"> Description and Priority</w:t>
+        <w:t>5.1.2 Stimulus/Response Sequences</w:t>
       </w:r>
     </w:p>
     <w:p>
@@ -3477,237 +4087,6 @@
         <w:jc w:val="both"/>
         <w:rPr>
           <w:rFonts w:ascii="Times New Roman" w:eastAsia="Times New Roman" w:hAnsi="Times New Roman" w:cs="Times New Roman"/>
-          <w:b/>
-          <w:bCs/>
-          <w:color w:val="000000" w:themeColor="text1"/>
-          <w:kern w:val="0"/>
-          <w:sz w:val="20"/>
-          <w:szCs w:val="20"/>
-          <w:lang w:eastAsia="en-GB"/>
-          <w14:ligatures w14:val="none"/>
-        </w:rPr>
-      </w:pPr>
-    </w:p>
-    <w:p>
-      <w:pPr>
-        <w:shd w:val="clear" w:color="auto" w:fill="FFFFFF"/>
-        <w:spacing w:before="240" w:after="0" w:line="240" w:lineRule="auto"/>
-        <w:jc w:val="both"/>
-        <w:rPr>
-          <w:rFonts w:ascii="Times New Roman" w:eastAsia="Times New Roman" w:hAnsi="Times New Roman" w:cs="Times New Roman"/>
-          <w:b/>
-          <w:bCs/>
-          <w:color w:val="000000" w:themeColor="text1"/>
-          <w:kern w:val="0"/>
-          <w:sz w:val="20"/>
-          <w:szCs w:val="20"/>
-          <w:lang w:eastAsia="en-GB"/>
-          <w14:ligatures w14:val="none"/>
-        </w:rPr>
-      </w:pPr>
-    </w:p>
-    <w:p>
-      <w:pPr>
-        <w:shd w:val="clear" w:color="auto" w:fill="FFFFFF"/>
-        <w:spacing w:before="240" w:after="0" w:line="240" w:lineRule="auto"/>
-        <w:jc w:val="both"/>
-        <w:rPr>
-          <w:rFonts w:ascii="Times New Roman" w:eastAsia="Times New Roman" w:hAnsi="Times New Roman" w:cs="Times New Roman"/>
-          <w:b/>
-          <w:bCs/>
-          <w:color w:val="000000" w:themeColor="text1"/>
-          <w:kern w:val="0"/>
-          <w:sz w:val="20"/>
-          <w:szCs w:val="20"/>
-          <w:lang w:eastAsia="en-GB"/>
-          <w14:ligatures w14:val="none"/>
-        </w:rPr>
-      </w:pPr>
-    </w:p>
-    <w:p>
-      <w:pPr>
-        <w:shd w:val="clear" w:color="auto" w:fill="FFFFFF"/>
-        <w:spacing w:before="240" w:after="0" w:line="240" w:lineRule="auto"/>
-        <w:jc w:val="both"/>
-        <w:rPr>
-          <w:rFonts w:ascii="Times New Roman" w:eastAsia="Times New Roman" w:hAnsi="Times New Roman" w:cs="Times New Roman"/>
-          <w:b/>
-          <w:bCs/>
-          <w:color w:val="000000" w:themeColor="text1"/>
-          <w:kern w:val="0"/>
-          <w:sz w:val="20"/>
-          <w:szCs w:val="20"/>
-          <w:lang w:eastAsia="en-GB"/>
-          <w14:ligatures w14:val="none"/>
-        </w:rPr>
-      </w:pPr>
-    </w:p>
-    <w:p>
-      <w:pPr>
-        <w:shd w:val="clear" w:color="auto" w:fill="FFFFFF"/>
-        <w:spacing w:before="240" w:after="0" w:line="240" w:lineRule="auto"/>
-        <w:jc w:val="both"/>
-        <w:rPr>
-          <w:rFonts w:ascii="Times New Roman" w:eastAsia="Times New Roman" w:hAnsi="Times New Roman" w:cs="Times New Roman"/>
-          <w:b/>
-          <w:bCs/>
-          <w:color w:val="000000" w:themeColor="text1"/>
-          <w:kern w:val="0"/>
-          <w:sz w:val="20"/>
-          <w:szCs w:val="20"/>
-          <w:lang w:eastAsia="en-GB"/>
-          <w14:ligatures w14:val="none"/>
-        </w:rPr>
-      </w:pPr>
-    </w:p>
-    <w:p>
-      <w:pPr>
-        <w:shd w:val="clear" w:color="auto" w:fill="FFFFFF"/>
-        <w:spacing w:before="240" w:after="0" w:line="240" w:lineRule="auto"/>
-        <w:jc w:val="both"/>
-        <w:rPr>
-          <w:rFonts w:ascii="Times New Roman" w:eastAsia="Times New Roman" w:hAnsi="Times New Roman" w:cs="Times New Roman"/>
-          <w:b/>
-          <w:bCs/>
-          <w:color w:val="000000" w:themeColor="text1"/>
-          <w:kern w:val="0"/>
-          <w:sz w:val="20"/>
-          <w:szCs w:val="20"/>
-          <w:lang w:eastAsia="en-GB"/>
-          <w14:ligatures w14:val="none"/>
-        </w:rPr>
-      </w:pPr>
-    </w:p>
-    <w:p>
-      <w:pPr>
-        <w:shd w:val="clear" w:color="auto" w:fill="FFFFFF"/>
-        <w:spacing w:before="240" w:after="0" w:line="240" w:lineRule="auto"/>
-        <w:jc w:val="both"/>
-        <w:rPr>
-          <w:rFonts w:ascii="Times New Roman" w:eastAsia="Times New Roman" w:hAnsi="Times New Roman" w:cs="Times New Roman"/>
-          <w:b/>
-          <w:bCs/>
-          <w:color w:val="000000" w:themeColor="text1"/>
-          <w:kern w:val="0"/>
-          <w:sz w:val="20"/>
-          <w:szCs w:val="20"/>
-          <w:lang w:eastAsia="en-GB"/>
-          <w14:ligatures w14:val="none"/>
-        </w:rPr>
-      </w:pPr>
-    </w:p>
-    <w:p>
-      <w:pPr>
-        <w:shd w:val="clear" w:color="auto" w:fill="FFFFFF"/>
-        <w:spacing w:before="240" w:after="0" w:line="240" w:lineRule="auto"/>
-        <w:jc w:val="both"/>
-        <w:rPr>
-          <w:rFonts w:ascii="Times New Roman" w:eastAsia="Times New Roman" w:hAnsi="Times New Roman" w:cs="Times New Roman"/>
-          <w:b/>
-          <w:bCs/>
-          <w:color w:val="000000" w:themeColor="text1"/>
-          <w:kern w:val="0"/>
-          <w:sz w:val="20"/>
-          <w:szCs w:val="20"/>
-          <w:lang w:eastAsia="en-GB"/>
-          <w14:ligatures w14:val="none"/>
-        </w:rPr>
-      </w:pPr>
-    </w:p>
-    <w:p>
-      <w:pPr>
-        <w:shd w:val="clear" w:color="auto" w:fill="FFFFFF"/>
-        <w:spacing w:before="240" w:after="0" w:line="240" w:lineRule="auto"/>
-        <w:jc w:val="both"/>
-        <w:rPr>
-          <w:rFonts w:ascii="Times New Roman" w:eastAsia="Times New Roman" w:hAnsi="Times New Roman" w:cs="Times New Roman"/>
-          <w:b/>
-          <w:bCs/>
-          <w:color w:val="000000" w:themeColor="text1"/>
-          <w:kern w:val="0"/>
-          <w:sz w:val="20"/>
-          <w:szCs w:val="20"/>
-          <w:lang w:eastAsia="en-GB"/>
-          <w14:ligatures w14:val="none"/>
-        </w:rPr>
-      </w:pPr>
-    </w:p>
-    <w:p>
-      <w:pPr>
-        <w:shd w:val="clear" w:color="auto" w:fill="FFFFFF"/>
-        <w:spacing w:before="240" w:after="0" w:line="240" w:lineRule="auto"/>
-        <w:jc w:val="both"/>
-        <w:rPr>
-          <w:rFonts w:ascii="Times New Roman" w:eastAsia="Times New Roman" w:hAnsi="Times New Roman" w:cs="Times New Roman"/>
-          <w:b/>
-          <w:bCs/>
-          <w:color w:val="000000" w:themeColor="text1"/>
-          <w:kern w:val="0"/>
-          <w:sz w:val="20"/>
-          <w:szCs w:val="20"/>
-          <w:lang w:eastAsia="en-GB"/>
-          <w14:ligatures w14:val="none"/>
-        </w:rPr>
-      </w:pPr>
-    </w:p>
-    <w:p>
-      <w:pPr>
-        <w:shd w:val="clear" w:color="auto" w:fill="FFFFFF"/>
-        <w:spacing w:before="240" w:after="0" w:line="240" w:lineRule="auto"/>
-        <w:jc w:val="both"/>
-        <w:rPr>
-          <w:rFonts w:ascii="Times New Roman" w:eastAsia="Times New Roman" w:hAnsi="Times New Roman" w:cs="Times New Roman"/>
-          <w:b/>
-          <w:bCs/>
-          <w:color w:val="000000" w:themeColor="text1"/>
-          <w:kern w:val="0"/>
-          <w:sz w:val="20"/>
-          <w:szCs w:val="20"/>
-          <w:lang w:eastAsia="en-GB"/>
-          <w14:ligatures w14:val="none"/>
-        </w:rPr>
-      </w:pPr>
-    </w:p>
-    <w:p>
-      <w:pPr>
-        <w:shd w:val="clear" w:color="auto" w:fill="FFFFFF"/>
-        <w:spacing w:before="240" w:after="0" w:line="240" w:lineRule="auto"/>
-        <w:jc w:val="both"/>
-        <w:rPr>
-          <w:rFonts w:ascii="Times New Roman" w:eastAsia="Times New Roman" w:hAnsi="Times New Roman" w:cs="Times New Roman"/>
-          <w:color w:val="000000" w:themeColor="text1"/>
-          <w:kern w:val="0"/>
-          <w:sz w:val="20"/>
-          <w:szCs w:val="20"/>
-          <w:lang w:eastAsia="en-GB"/>
-          <w14:ligatures w14:val="none"/>
-        </w:rPr>
-      </w:pPr>
-      <w:r>
-        <w:rPr>
-          <w:rFonts w:ascii="Times New Roman" w:eastAsia="Times New Roman" w:hAnsi="Times New Roman" w:cs="Times New Roman"/>
-          <w:b/>
-          <w:bCs/>
-          <w:color w:val="000000" w:themeColor="text1"/>
-          <w:kern w:val="0"/>
-          <w:sz w:val="20"/>
-          <w:szCs w:val="20"/>
-          <w:lang w:eastAsia="en-GB"/>
-          <w14:ligatures w14:val="none"/>
-        </w:rPr>
-        <w:lastRenderedPageBreak/>
-        <w:t>5.1.2 Stimulus/Response Sequences</w:t>
-      </w:r>
-    </w:p>
-    <w:p>
-      <w:pPr>
-        <w:shd w:val="clear" w:color="auto" w:fill="FFFFFF"/>
-        <w:spacing w:before="240" w:after="0" w:line="240" w:lineRule="auto"/>
-        <w:jc w:val="both"/>
-        <w:rPr>
-          <w:rFonts w:ascii="Times New Roman" w:eastAsia="Times New Roman" w:hAnsi="Times New Roman" w:cs="Times New Roman"/>
-          <w:b/>
-          <w:bCs/>
           <w:color w:val="000000" w:themeColor="text1"/>
           <w:kern w:val="0"/>
           <w:sz w:val="20"/>
@@ -3722,9 +4101,9 @@
           <w:noProof/>
         </w:rPr>
         <w:drawing>
-          <wp:inline distT="0" distB="0" distL="0" distR="0" wp14:anchorId="0F46FF0C" wp14:editId="00B08CDD">
-            <wp:extent cx="4326467" cy="4261278"/>
-            <wp:effectExtent l="0" t="0" r="0" b="6350"/>
+          <wp:inline distT="0" distB="0" distL="0" distR="0" wp14:anchorId="28D897B9" wp14:editId="772CC757">
+            <wp:extent cx="3868285" cy="3810000"/>
+            <wp:effectExtent l="0" t="0" r="0" b="0"/>
             <wp:docPr id="400781830" name="Resim 2"/>
             <wp:cNvGraphicFramePr>
               <a:graphicFrameLocks xmlns:a="http://schemas.openxmlformats.org/drawingml/2006/main" noChangeAspect="1"/>
@@ -3739,7 +4118,7 @@
                     </pic:cNvPicPr>
                   </pic:nvPicPr>
                   <pic:blipFill>
-                    <a:blip r:embed="rId8" cstate="print">
+                    <a:blip r:embed="rId9" cstate="print">
                       <a:extLst>
                         <a:ext uri="{28A0092B-C50C-407E-A947-70E740481C1C}">
                           <a14:useLocalDpi xmlns:a14="http://schemas.microsoft.com/office/drawing/2010/main" val="0"/>
@@ -3754,7 +4133,7 @@
                   <pic:spPr bwMode="auto">
                     <a:xfrm>
                       <a:off x="0" y="0"/>
-                      <a:ext cx="4366217" cy="4300429"/>
+                      <a:ext cx="3875428" cy="3817035"/>
                     </a:xfrm>
                     <a:prstGeom prst="rect">
                       <a:avLst/>
@@ -3775,19 +4154,147 @@
       <w:pPr>
         <w:shd w:val="clear" w:color="auto" w:fill="FFFFFF"/>
         <w:spacing w:before="240" w:after="0" w:line="240" w:lineRule="auto"/>
+        <w:jc w:val="center"/>
+        <w:rPr>
+          <w:rFonts w:ascii="Times New Roman" w:eastAsia="Times New Roman" w:hAnsi="Times New Roman" w:cs="Times New Roman"/>
+          <w:color w:val="000000" w:themeColor="text1"/>
+          <w:kern w:val="0"/>
+          <w:sz w:val="20"/>
+          <w:szCs w:val="20"/>
+          <w:lang w:eastAsia="en-GB"/>
+          <w14:ligatures w14:val="none"/>
+        </w:rPr>
+      </w:pPr>
+      <w:r>
+        <w:rPr>
+          <w:rFonts w:ascii="Times New Roman" w:eastAsia="Times New Roman" w:hAnsi="Times New Roman" w:cs="Times New Roman"/>
+          <w:color w:val="000000" w:themeColor="text1"/>
+          <w:kern w:val="0"/>
+          <w:sz w:val="20"/>
+          <w:szCs w:val="20"/>
+          <w:lang w:eastAsia="en-GB"/>
+          <w14:ligatures w14:val="none"/>
+        </w:rPr>
+        <w:t>Figure 5</w:t>
+      </w:r>
+    </w:p>
+    <w:p>
+      <w:pPr>
+        <w:shd w:val="clear" w:color="auto" w:fill="FFFFFF"/>
+        <w:spacing w:before="240" w:after="0" w:line="240" w:lineRule="auto"/>
         <w:jc w:val="both"/>
         <w:rPr>
           <w:rFonts w:ascii="Times New Roman" w:eastAsia="Times New Roman" w:hAnsi="Times New Roman" w:cs="Times New Roman"/>
-          <w:b/>
-          <w:bCs/>
-          <w:color w:val="000000" w:themeColor="text1"/>
-          <w:kern w:val="0"/>
-          <w:sz w:val="20"/>
-          <w:szCs w:val="20"/>
-          <w:lang w:eastAsia="en-GB"/>
-          <w14:ligatures w14:val="none"/>
-        </w:rPr>
-      </w:pPr>
+          <w:color w:val="000000" w:themeColor="text1"/>
+          <w:kern w:val="0"/>
+          <w:sz w:val="20"/>
+          <w:szCs w:val="20"/>
+          <w:lang w:eastAsia="en-GB"/>
+          <w14:ligatures w14:val="none"/>
+        </w:rPr>
+      </w:pPr>
+      <w:r>
+        <w:rPr>
+          <w:rFonts w:ascii="Times New Roman" w:eastAsia="Times New Roman" w:hAnsi="Times New Roman" w:cs="Times New Roman"/>
+          <w:color w:val="000000" w:themeColor="text1"/>
+          <w:kern w:val="0"/>
+          <w:sz w:val="20"/>
+          <w:szCs w:val="20"/>
+          <w:lang w:eastAsia="en-GB"/>
+          <w14:ligatures w14:val="none"/>
+        </w:rPr>
+        <w:t xml:space="preserve">The system reads occupancy and </w:t>
+      </w:r>
+      <w:proofErr w:type="spellStart"/>
+      <w:r>
+        <w:rPr>
+          <w:rFonts w:ascii="Times New Roman" w:eastAsia="Times New Roman" w:hAnsi="Times New Roman" w:cs="Times New Roman"/>
+          <w:color w:val="000000" w:themeColor="text1"/>
+          <w:kern w:val="0"/>
+          <w:sz w:val="20"/>
+          <w:szCs w:val="20"/>
+          <w:lang w:eastAsia="en-GB"/>
+          <w14:ligatures w14:val="none"/>
+        </w:rPr>
+        <w:t>currentTemp</w:t>
+      </w:r>
+      <w:proofErr w:type="spellEnd"/>
+      <w:r>
+        <w:rPr>
+          <w:rFonts w:ascii="Times New Roman" w:eastAsia="Times New Roman" w:hAnsi="Times New Roman" w:cs="Times New Roman"/>
+          <w:color w:val="000000" w:themeColor="text1"/>
+          <w:kern w:val="0"/>
+          <w:sz w:val="20"/>
+          <w:szCs w:val="20"/>
+          <w:lang w:eastAsia="en-GB"/>
+          <w14:ligatures w14:val="none"/>
+        </w:rPr>
+        <w:t xml:space="preserve"> data from the sensors. If automatic mode is selected, it sends the </w:t>
+      </w:r>
+      <w:proofErr w:type="spellStart"/>
+      <w:r>
+        <w:rPr>
+          <w:rFonts w:ascii="Times New Roman" w:eastAsia="Times New Roman" w:hAnsi="Times New Roman" w:cs="Times New Roman"/>
+          <w:color w:val="000000" w:themeColor="text1"/>
+          <w:kern w:val="0"/>
+          <w:sz w:val="20"/>
+          <w:szCs w:val="20"/>
+          <w:lang w:eastAsia="en-GB"/>
+          <w14:ligatures w14:val="none"/>
+        </w:rPr>
+        <w:t>turnOnHeater</w:t>
+      </w:r>
+      <w:proofErr w:type="spellEnd"/>
+      <w:r>
+        <w:rPr>
+          <w:rFonts w:ascii="Times New Roman" w:eastAsia="Times New Roman" w:hAnsi="Times New Roman" w:cs="Times New Roman"/>
+          <w:color w:val="000000" w:themeColor="text1"/>
+          <w:kern w:val="0"/>
+          <w:sz w:val="20"/>
+          <w:szCs w:val="20"/>
+          <w:lang w:eastAsia="en-GB"/>
+          <w14:ligatures w14:val="none"/>
+        </w:rPr>
+        <w:t xml:space="preserve"> command to the air conditioning unit based on this data. If the user wishes, he can switch the system to manual mode with the </w:t>
+      </w:r>
+      <w:proofErr w:type="spellStart"/>
+      <w:r>
+        <w:rPr>
+          <w:rFonts w:ascii="Times New Roman" w:eastAsia="Times New Roman" w:hAnsi="Times New Roman" w:cs="Times New Roman"/>
+          <w:color w:val="000000" w:themeColor="text1"/>
+          <w:kern w:val="0"/>
+          <w:sz w:val="20"/>
+          <w:szCs w:val="20"/>
+          <w:lang w:eastAsia="en-GB"/>
+          <w14:ligatures w14:val="none"/>
+        </w:rPr>
+        <w:t>setTemp</w:t>
+      </w:r>
+      <w:proofErr w:type="spellEnd"/>
+      <w:r>
+        <w:rPr>
+          <w:rFonts w:ascii="Times New Roman" w:eastAsia="Times New Roman" w:hAnsi="Times New Roman" w:cs="Times New Roman"/>
+          <w:color w:val="000000" w:themeColor="text1"/>
+          <w:kern w:val="0"/>
+          <w:sz w:val="20"/>
+          <w:szCs w:val="20"/>
+          <w:lang w:eastAsia="en-GB"/>
+          <w14:ligatures w14:val="none"/>
+        </w:rPr>
+        <w:t xml:space="preserve"> command</w:t>
+      </w:r>
+      <w:r>
+        <w:rPr>
+          <w:rFonts w:ascii="Times New Roman" w:eastAsia="Times New Roman" w:hAnsi="Times New Roman" w:cs="Times New Roman"/>
+          <w:color w:val="000000" w:themeColor="text1"/>
+          <w:kern w:val="0"/>
+          <w:sz w:val="20"/>
+          <w:szCs w:val="20"/>
+          <w:lang w:eastAsia="en-GB"/>
+          <w14:ligatures w14:val="none"/>
+        </w:rPr>
+        <w:t>.</w:t>
+      </w:r>
     </w:p>
     <w:p>
       <w:pPr>
@@ -3807,92 +4314,56 @@
       <w:r>
         <w:rPr>
           <w:rFonts w:ascii="Times New Roman" w:eastAsia="Times New Roman" w:hAnsi="Times New Roman" w:cs="Times New Roman"/>
-          <w:color w:val="000000" w:themeColor="text1"/>
-          <w:kern w:val="0"/>
-          <w:sz w:val="20"/>
-          <w:szCs w:val="20"/>
-          <w:lang w:eastAsia="en-GB"/>
-          <w14:ligatures w14:val="none"/>
-        </w:rPr>
-        <w:t xml:space="preserve">The system reads occupancy and </w:t>
-      </w:r>
-      <w:proofErr w:type="spellStart"/>
-      <w:r>
-        <w:rPr>
-          <w:rFonts w:ascii="Times New Roman" w:eastAsia="Times New Roman" w:hAnsi="Times New Roman" w:cs="Times New Roman"/>
-          <w:color w:val="000000" w:themeColor="text1"/>
-          <w:kern w:val="0"/>
-          <w:sz w:val="20"/>
-          <w:szCs w:val="20"/>
-          <w:lang w:eastAsia="en-GB"/>
-          <w14:ligatures w14:val="none"/>
-        </w:rPr>
-        <w:t>currentTemp</w:t>
-      </w:r>
-      <w:proofErr w:type="spellEnd"/>
-      <w:r>
-        <w:rPr>
-          <w:rFonts w:ascii="Times New Roman" w:eastAsia="Times New Roman" w:hAnsi="Times New Roman" w:cs="Times New Roman"/>
-          <w:color w:val="000000" w:themeColor="text1"/>
-          <w:kern w:val="0"/>
-          <w:sz w:val="20"/>
-          <w:szCs w:val="20"/>
-          <w:lang w:eastAsia="en-GB"/>
-          <w14:ligatures w14:val="none"/>
-        </w:rPr>
-        <w:t xml:space="preserve"> data from the sensors. If automatic mode is selected, it sends the </w:t>
-      </w:r>
-      <w:proofErr w:type="spellStart"/>
-      <w:r>
-        <w:rPr>
-          <w:rFonts w:ascii="Times New Roman" w:eastAsia="Times New Roman" w:hAnsi="Times New Roman" w:cs="Times New Roman"/>
-          <w:color w:val="000000" w:themeColor="text1"/>
-          <w:kern w:val="0"/>
-          <w:sz w:val="20"/>
-          <w:szCs w:val="20"/>
-          <w:lang w:eastAsia="en-GB"/>
-          <w14:ligatures w14:val="none"/>
-        </w:rPr>
-        <w:t>turnOnHeater</w:t>
-      </w:r>
-      <w:proofErr w:type="spellEnd"/>
-      <w:r>
-        <w:rPr>
-          <w:rFonts w:ascii="Times New Roman" w:eastAsia="Times New Roman" w:hAnsi="Times New Roman" w:cs="Times New Roman"/>
-          <w:color w:val="000000" w:themeColor="text1"/>
-          <w:kern w:val="0"/>
-          <w:sz w:val="20"/>
-          <w:szCs w:val="20"/>
-          <w:lang w:eastAsia="en-GB"/>
-          <w14:ligatures w14:val="none"/>
-        </w:rPr>
-        <w:t xml:space="preserve"> command to the air conditioning unit based on this data. If the user wishes, he can switch the system to manual mode with the </w:t>
-      </w:r>
-      <w:proofErr w:type="spellStart"/>
-      <w:r>
-        <w:rPr>
-          <w:rFonts w:ascii="Times New Roman" w:eastAsia="Times New Roman" w:hAnsi="Times New Roman" w:cs="Times New Roman"/>
-          <w:color w:val="000000" w:themeColor="text1"/>
-          <w:kern w:val="0"/>
-          <w:sz w:val="20"/>
-          <w:szCs w:val="20"/>
-          <w:lang w:eastAsia="en-GB"/>
-          <w14:ligatures w14:val="none"/>
-        </w:rPr>
-        <w:t>setTemp</w:t>
-      </w:r>
-      <w:proofErr w:type="spellEnd"/>
-      <w:r>
-        <w:rPr>
-          <w:rFonts w:ascii="Times New Roman" w:eastAsia="Times New Roman" w:hAnsi="Times New Roman" w:cs="Times New Roman"/>
-          <w:color w:val="000000" w:themeColor="text1"/>
-          <w:kern w:val="0"/>
-          <w:sz w:val="20"/>
-          <w:szCs w:val="20"/>
-          <w:lang w:eastAsia="en-GB"/>
-          <w14:ligatures w14:val="none"/>
-        </w:rPr>
-        <w:t xml:space="preserve"> command</w:t>
+          <w:b/>
+          <w:bCs/>
+          <w:color w:val="000000" w:themeColor="text1"/>
+          <w:kern w:val="0"/>
+          <w:sz w:val="20"/>
+          <w:szCs w:val="20"/>
+          <w:lang w:eastAsia="en-GB"/>
+          <w14:ligatures w14:val="none"/>
+        </w:rPr>
+        <w:t>5.1.3 Functional Requirements</w:t>
+      </w:r>
+    </w:p>
+    <w:p>
+      <w:pPr>
+        <w:shd w:val="clear" w:color="auto" w:fill="FFFFFF"/>
+        <w:spacing w:before="240" w:after="0" w:line="240" w:lineRule="auto"/>
+        <w:jc w:val="both"/>
+        <w:rPr>
+          <w:rFonts w:ascii="Times New Roman" w:eastAsia="Times New Roman" w:hAnsi="Times New Roman" w:cs="Times New Roman"/>
+          <w:color w:val="000000" w:themeColor="text1"/>
+          <w:kern w:val="0"/>
+          <w:sz w:val="20"/>
+          <w:szCs w:val="20"/>
+          <w:lang w:eastAsia="en-GB"/>
+          <w14:ligatures w14:val="none"/>
+        </w:rPr>
+      </w:pPr>
+      <w:r>
+        <w:rPr>
+          <w:rFonts w:ascii="Times New Roman" w:eastAsia="Times New Roman" w:hAnsi="Times New Roman" w:cs="Times New Roman"/>
+          <w:color w:val="000000" w:themeColor="text1"/>
+          <w:kern w:val="0"/>
+          <w:sz w:val="20"/>
+          <w:szCs w:val="20"/>
+          <w:lang w:eastAsia="en-GB"/>
+          <w14:ligatures w14:val="none"/>
+        </w:rPr>
+        <w:t>REQ-1.1: </w:t>
+      </w:r>
+      <w:r>
+        <w:rPr>
+          <w:rFonts w:ascii="Times New Roman" w:eastAsia="Times New Roman" w:hAnsi="Times New Roman" w:cs="Times New Roman"/>
+          <w:color w:val="000000" w:themeColor="text1"/>
+          <w:kern w:val="0"/>
+          <w:sz w:val="20"/>
+          <w:szCs w:val="20"/>
+          <w:lang w:eastAsia="en-GB"/>
+          <w14:ligatures w14:val="none"/>
+        </w:rPr>
+        <w:t>System shall detect human count in the house using sensors</w:t>
       </w:r>
       <w:r>
         <w:rPr>
@@ -3914,29 +4385,87 @@
         <w:jc w:val="both"/>
         <w:rPr>
           <w:rFonts w:ascii="Times New Roman" w:eastAsia="Times New Roman" w:hAnsi="Times New Roman" w:cs="Times New Roman"/>
-          <w:b/>
-          <w:bCs/>
-          <w:color w:val="000000" w:themeColor="text1"/>
-          <w:kern w:val="0"/>
-          <w:sz w:val="20"/>
-          <w:szCs w:val="20"/>
-          <w:lang w:eastAsia="en-GB"/>
-          <w14:ligatures w14:val="none"/>
-        </w:rPr>
-      </w:pPr>
-      <w:r>
-        <w:rPr>
-          <w:rFonts w:ascii="Times New Roman" w:eastAsia="Times New Roman" w:hAnsi="Times New Roman" w:cs="Times New Roman"/>
-          <w:b/>
-          <w:bCs/>
-          <w:color w:val="000000" w:themeColor="text1"/>
-          <w:kern w:val="0"/>
-          <w:sz w:val="20"/>
-          <w:szCs w:val="20"/>
-          <w:lang w:eastAsia="en-GB"/>
-          <w14:ligatures w14:val="none"/>
-        </w:rPr>
-        <w:t>5.1.3 Functional Requirements</w:t>
+          <w:color w:val="000000" w:themeColor="text1"/>
+          <w:kern w:val="0"/>
+          <w:sz w:val="20"/>
+          <w:szCs w:val="20"/>
+          <w:lang w:eastAsia="en-GB"/>
+          <w14:ligatures w14:val="none"/>
+        </w:rPr>
+      </w:pPr>
+      <w:r>
+        <w:rPr>
+          <w:rFonts w:ascii="Times New Roman" w:eastAsia="Times New Roman" w:hAnsi="Times New Roman" w:cs="Times New Roman"/>
+          <w:color w:val="000000" w:themeColor="text1"/>
+          <w:kern w:val="0"/>
+          <w:sz w:val="20"/>
+          <w:szCs w:val="20"/>
+          <w:lang w:eastAsia="en-GB"/>
+          <w14:ligatures w14:val="none"/>
+        </w:rPr>
+        <w:t>REQ-1.</w:t>
+      </w:r>
+      <w:r>
+        <w:rPr>
+          <w:rFonts w:ascii="Times New Roman" w:eastAsia="Times New Roman" w:hAnsi="Times New Roman" w:cs="Times New Roman"/>
+          <w:color w:val="000000" w:themeColor="text1"/>
+          <w:kern w:val="0"/>
+          <w:sz w:val="20"/>
+          <w:szCs w:val="20"/>
+          <w:lang w:eastAsia="en-GB"/>
+          <w14:ligatures w14:val="none"/>
+        </w:rPr>
+        <w:t>2</w:t>
+      </w:r>
+      <w:r>
+        <w:rPr>
+          <w:rFonts w:ascii="Times New Roman" w:eastAsia="Times New Roman" w:hAnsi="Times New Roman" w:cs="Times New Roman"/>
+          <w:color w:val="000000" w:themeColor="text1"/>
+          <w:kern w:val="0"/>
+          <w:sz w:val="20"/>
+          <w:szCs w:val="20"/>
+          <w:lang w:eastAsia="en-GB"/>
+          <w14:ligatures w14:val="none"/>
+        </w:rPr>
+        <w:t>: </w:t>
+      </w:r>
+      <w:r>
+        <w:rPr>
+          <w:rFonts w:ascii="Times New Roman" w:eastAsia="Times New Roman" w:hAnsi="Times New Roman" w:cs="Times New Roman"/>
+          <w:color w:val="000000" w:themeColor="text1"/>
+          <w:kern w:val="0"/>
+          <w:sz w:val="20"/>
+          <w:szCs w:val="20"/>
+          <w:lang w:eastAsia="en-GB"/>
+          <w14:ligatures w14:val="none"/>
+        </w:rPr>
+        <w:t xml:space="preserve">When human count in house is zero system, shall turn of the </w:t>
+      </w:r>
+      <w:proofErr w:type="gramStart"/>
+      <w:r>
+        <w:rPr>
+          <w:rFonts w:ascii="Times New Roman" w:eastAsia="Times New Roman" w:hAnsi="Times New Roman" w:cs="Times New Roman"/>
+          <w:color w:val="000000" w:themeColor="text1"/>
+          <w:kern w:val="0"/>
+          <w:sz w:val="20"/>
+          <w:szCs w:val="20"/>
+          <w:lang w:eastAsia="en-GB"/>
+          <w14:ligatures w14:val="none"/>
+        </w:rPr>
+        <w:t>all climate</w:t>
+      </w:r>
+      <w:proofErr w:type="gramEnd"/>
+      <w:r>
+        <w:rPr>
+          <w:rFonts w:ascii="Times New Roman" w:eastAsia="Times New Roman" w:hAnsi="Times New Roman" w:cs="Times New Roman"/>
+          <w:color w:val="000000" w:themeColor="text1"/>
+          <w:kern w:val="0"/>
+          <w:sz w:val="20"/>
+          <w:szCs w:val="20"/>
+          <w:lang w:eastAsia="en-GB"/>
+          <w14:ligatures w14:val="none"/>
+        </w:rPr>
+        <w:t xml:space="preserve"> units </w:t>
       </w:r>
     </w:p>
     <w:p>
@@ -3964,7 +4493,43 @@
           <w:lang w:eastAsia="en-GB"/>
           <w14:ligatures w14:val="none"/>
         </w:rPr>
-        <w:t>REQ-1.1: System shall detect human count in the house using sensors.</w:t>
+        <w:t>REQ-1.</w:t>
+      </w:r>
+      <w:r>
+        <w:rPr>
+          <w:rFonts w:ascii="Times New Roman" w:eastAsia="Times New Roman" w:hAnsi="Times New Roman" w:cs="Times New Roman"/>
+          <w:color w:val="000000" w:themeColor="text1"/>
+          <w:kern w:val="0"/>
+          <w:sz w:val="20"/>
+          <w:szCs w:val="20"/>
+          <w:lang w:eastAsia="en-GB"/>
+          <w14:ligatures w14:val="none"/>
+        </w:rPr>
+        <w:t>3</w:t>
+      </w:r>
+      <w:r>
+        <w:rPr>
+          <w:rFonts w:ascii="Times New Roman" w:eastAsia="Times New Roman" w:hAnsi="Times New Roman" w:cs="Times New Roman"/>
+          <w:color w:val="000000" w:themeColor="text1"/>
+          <w:kern w:val="0"/>
+          <w:sz w:val="20"/>
+          <w:szCs w:val="20"/>
+          <w:lang w:eastAsia="en-GB"/>
+          <w14:ligatures w14:val="none"/>
+        </w:rPr>
+        <w:t>: </w:t>
+      </w:r>
+      <w:r>
+        <w:rPr>
+          <w:rFonts w:ascii="Times New Roman" w:eastAsia="Times New Roman" w:hAnsi="Times New Roman" w:cs="Times New Roman"/>
+          <w:color w:val="000000" w:themeColor="text1"/>
+          <w:kern w:val="0"/>
+          <w:sz w:val="20"/>
+          <w:szCs w:val="20"/>
+          <w:lang w:eastAsia="en-GB"/>
+          <w14:ligatures w14:val="none"/>
+        </w:rPr>
+        <w:t>When the number of people in the house increases or decreases, the system shall dynamically adjust the temperature.</w:t>
       </w:r>
     </w:p>
     <w:p>
@@ -3992,33 +4557,8 @@
           <w:lang w:eastAsia="en-GB"/>
           <w14:ligatures w14:val="none"/>
         </w:rPr>
-        <w:t xml:space="preserve">REQ-1.2: When human count in house is zero system, shall turn of the </w:t>
-      </w:r>
-      <w:proofErr w:type="gramStart"/>
-      <w:r>
-        <w:rPr>
-          <w:rFonts w:ascii="Times New Roman" w:eastAsia="Times New Roman" w:hAnsi="Times New Roman" w:cs="Times New Roman"/>
-          <w:color w:val="000000" w:themeColor="text1"/>
-          <w:kern w:val="0"/>
-          <w:sz w:val="20"/>
-          <w:szCs w:val="20"/>
-          <w:lang w:eastAsia="en-GB"/>
-          <w14:ligatures w14:val="none"/>
-        </w:rPr>
-        <w:t>all climate</w:t>
-      </w:r>
-      <w:proofErr w:type="gramEnd"/>
-      <w:r>
-        <w:rPr>
-          <w:rFonts w:ascii="Times New Roman" w:eastAsia="Times New Roman" w:hAnsi="Times New Roman" w:cs="Times New Roman"/>
-          <w:color w:val="000000" w:themeColor="text1"/>
-          <w:kern w:val="0"/>
-          <w:sz w:val="20"/>
-          <w:szCs w:val="20"/>
-          <w:lang w:eastAsia="en-GB"/>
-          <w14:ligatures w14:val="none"/>
-        </w:rPr>
-        <w:t xml:space="preserve"> units </w:t>
+        <w:lastRenderedPageBreak/>
+        <w:t>REQ-1.4: The system shall allow the user to disable autonomous mode and enter manual temperature via the interface</w:t>
       </w:r>
     </w:p>
     <w:p>
@@ -4046,7 +4586,55 @@
           <w:lang w:eastAsia="en-GB"/>
           <w14:ligatures w14:val="none"/>
         </w:rPr>
-        <w:t>REQ-1.3: When the number of people in the house increases or decreases, the system shall dynamically adjust the temperature.</w:t>
+        <w:t>REQ-1.</w:t>
+      </w:r>
+      <w:r>
+        <w:rPr>
+          <w:rFonts w:ascii="Times New Roman" w:eastAsia="Times New Roman" w:hAnsi="Times New Roman" w:cs="Times New Roman"/>
+          <w:color w:val="000000" w:themeColor="text1"/>
+          <w:kern w:val="0"/>
+          <w:sz w:val="20"/>
+          <w:szCs w:val="20"/>
+          <w:lang w:eastAsia="en-GB"/>
+          <w14:ligatures w14:val="none"/>
+        </w:rPr>
+        <w:t>5</w:t>
+      </w:r>
+      <w:r>
+        <w:rPr>
+          <w:rFonts w:ascii="Times New Roman" w:eastAsia="Times New Roman" w:hAnsi="Times New Roman" w:cs="Times New Roman"/>
+          <w:color w:val="000000" w:themeColor="text1"/>
+          <w:kern w:val="0"/>
+          <w:sz w:val="20"/>
+          <w:szCs w:val="20"/>
+          <w:lang w:eastAsia="en-GB"/>
+          <w14:ligatures w14:val="none"/>
+        </w:rPr>
+        <w:t>:</w:t>
+      </w:r>
+      <w:r>
+        <w:rPr>
+          <w:rFonts w:ascii="Times New Roman" w:eastAsia="Times New Roman" w:hAnsi="Times New Roman" w:cs="Times New Roman"/>
+          <w:color w:val="000000" w:themeColor="text1"/>
+          <w:kern w:val="0"/>
+          <w:sz w:val="20"/>
+          <w:szCs w:val="20"/>
+          <w:lang w:eastAsia="en-GB"/>
+          <w14:ligatures w14:val="none"/>
+        </w:rPr>
+        <w:t xml:space="preserve"> </w:t>
+      </w:r>
+      <w:r>
+        <w:rPr>
+          <w:rFonts w:ascii="Times New Roman" w:eastAsia="Times New Roman" w:hAnsi="Times New Roman" w:cs="Times New Roman"/>
+          <w:color w:val="000000" w:themeColor="text1"/>
+          <w:kern w:val="0"/>
+          <w:sz w:val="20"/>
+          <w:szCs w:val="20"/>
+          <w:lang w:eastAsia="en-GB"/>
+          <w14:ligatures w14:val="none"/>
+        </w:rPr>
+        <w:t>If the sensor is disconnected, the system shall enter safe mode and operate at a standard temperature (e.g. 21°C).</w:t>
       </w:r>
     </w:p>
     <w:p>
@@ -4067,14 +4655,16 @@
       <w:r>
         <w:rPr>
           <w:rFonts w:ascii="Times New Roman" w:eastAsia="Times New Roman" w:hAnsi="Times New Roman" w:cs="Times New Roman"/>
-          <w:color w:val="000000" w:themeColor="text1"/>
-          <w:kern w:val="0"/>
-          <w:sz w:val="20"/>
-          <w:szCs w:val="20"/>
-          <w:lang w:eastAsia="en-GB"/>
-          <w14:ligatures w14:val="none"/>
-        </w:rPr>
-        <w:t>REQ-1.4: The system shall allow the user to disable autonomous mode and enter manual temperature via the interface</w:t>
+          <w:b/>
+          <w:bCs/>
+          <w:color w:val="000000" w:themeColor="text1"/>
+          <w:kern w:val="0"/>
+          <w:sz w:val="20"/>
+          <w:szCs w:val="20"/>
+          <w:lang w:eastAsia="en-GB"/>
+          <w14:ligatures w14:val="none"/>
+        </w:rPr>
+        <w:t>6. Nonfunctional Requirements</w:t>
       </w:r>
     </w:p>
     <w:p>
@@ -4095,14 +4685,16 @@
       <w:r>
         <w:rPr>
           <w:rFonts w:ascii="Times New Roman" w:eastAsia="Times New Roman" w:hAnsi="Times New Roman" w:cs="Times New Roman"/>
-          <w:color w:val="000000" w:themeColor="text1"/>
-          <w:kern w:val="0"/>
-          <w:sz w:val="20"/>
-          <w:szCs w:val="20"/>
-          <w:lang w:eastAsia="en-GB"/>
-          <w14:ligatures w14:val="none"/>
-        </w:rPr>
-        <w:t>REQ-1.5: If the sensor is disconnected, the system shall enter safe mode and operate at a standard temperature (e.g. 21°C).</w:t>
+          <w:b/>
+          <w:bCs/>
+          <w:color w:val="000000" w:themeColor="text1"/>
+          <w:kern w:val="0"/>
+          <w:sz w:val="20"/>
+          <w:szCs w:val="20"/>
+          <w:lang w:eastAsia="en-GB"/>
+          <w14:ligatures w14:val="none"/>
+        </w:rPr>
+        <w:t>6.1. Performance  </w:t>
       </w:r>
     </w:p>
     <w:p>
@@ -4120,6 +4712,42 @@
           <w14:ligatures w14:val="none"/>
         </w:rPr>
       </w:pPr>
+      <w:r>
+        <w:rPr>
+          <w:rFonts w:ascii="Times New Roman" w:eastAsia="Times New Roman" w:hAnsi="Times New Roman" w:cs="Times New Roman"/>
+          <w:color w:val="000000" w:themeColor="text1"/>
+          <w:kern w:val="0"/>
+          <w:sz w:val="20"/>
+          <w:szCs w:val="20"/>
+          <w:lang w:eastAsia="en-GB"/>
+          <w14:ligatures w14:val="none"/>
+        </w:rPr>
+        <w:t>NF-1.1: </w:t>
+      </w:r>
+      <w:r>
+        <w:rPr>
+          <w:rFonts w:ascii="Times New Roman" w:eastAsia="Times New Roman" w:hAnsi="Times New Roman" w:cs="Times New Roman"/>
+          <w:color w:val="000000" w:themeColor="text1"/>
+          <w:kern w:val="0"/>
+          <w:sz w:val="20"/>
+          <w:szCs w:val="20"/>
+          <w:lang w:eastAsia="en-GB"/>
+          <w14:ligatures w14:val="none"/>
+        </w:rPr>
+        <w:t xml:space="preserve">The system shall </w:t>
+      </w:r>
+      <w:r>
+        <w:rPr>
+          <w:rFonts w:ascii="Times New Roman" w:eastAsia="Times New Roman" w:hAnsi="Times New Roman" w:cs="Times New Roman"/>
+          <w:color w:val="000000" w:themeColor="text1"/>
+          <w:kern w:val="0"/>
+          <w:sz w:val="20"/>
+          <w:szCs w:val="20"/>
+          <w:lang w:eastAsia="en-GB"/>
+          <w14:ligatures w14:val="none"/>
+        </w:rPr>
+        <w:t>process the data from sensors &lt; 3 seconds and send commands to the climate units.</w:t>
+      </w:r>
     </w:p>
     <w:p>
       <w:pPr>
@@ -4139,103 +4767,50 @@
       <w:r>
         <w:rPr>
           <w:rFonts w:ascii="Times New Roman" w:eastAsia="Times New Roman" w:hAnsi="Times New Roman" w:cs="Times New Roman"/>
-          <w:b/>
-          <w:bCs/>
-          <w:color w:val="000000" w:themeColor="text1"/>
-          <w:kern w:val="0"/>
-          <w:sz w:val="20"/>
-          <w:szCs w:val="20"/>
-          <w:lang w:eastAsia="en-GB"/>
-          <w14:ligatures w14:val="none"/>
-        </w:rPr>
-        <w:t>6. Nonfunctional Requirements</w:t>
-      </w:r>
-    </w:p>
-    <w:p>
-      <w:pPr>
-        <w:shd w:val="clear" w:color="auto" w:fill="FFFFFF"/>
-        <w:spacing w:before="240" w:after="0" w:line="240" w:lineRule="auto"/>
-        <w:jc w:val="both"/>
-        <w:rPr>
-          <w:rFonts w:ascii="Times New Roman" w:eastAsia="Times New Roman" w:hAnsi="Times New Roman" w:cs="Times New Roman"/>
-          <w:color w:val="000000" w:themeColor="text1"/>
-          <w:kern w:val="0"/>
-          <w:sz w:val="20"/>
-          <w:szCs w:val="20"/>
-          <w:lang w:eastAsia="en-GB"/>
-          <w14:ligatures w14:val="none"/>
-        </w:rPr>
-      </w:pPr>
-      <w:r>
-        <w:rPr>
-          <w:rFonts w:ascii="Times New Roman" w:eastAsia="Times New Roman" w:hAnsi="Times New Roman" w:cs="Times New Roman"/>
-          <w:b/>
-          <w:bCs/>
-          <w:color w:val="000000" w:themeColor="text1"/>
-          <w:kern w:val="0"/>
-          <w:sz w:val="20"/>
-          <w:szCs w:val="20"/>
-          <w:lang w:eastAsia="en-GB"/>
-          <w14:ligatures w14:val="none"/>
-        </w:rPr>
-        <w:t>6.1. Performance  </w:t>
-      </w:r>
-    </w:p>
-    <w:p>
-      <w:pPr>
-        <w:shd w:val="clear" w:color="auto" w:fill="FFFFFF"/>
-        <w:spacing w:before="240" w:after="0" w:line="240" w:lineRule="auto"/>
-        <w:jc w:val="both"/>
-        <w:rPr>
-          <w:rFonts w:ascii="Times New Roman" w:eastAsia="Times New Roman" w:hAnsi="Times New Roman" w:cs="Times New Roman"/>
-          <w:color w:val="000000" w:themeColor="text1"/>
-          <w:kern w:val="0"/>
-          <w:sz w:val="20"/>
-          <w:szCs w:val="20"/>
-          <w:lang w:eastAsia="en-GB"/>
-          <w14:ligatures w14:val="none"/>
-        </w:rPr>
-      </w:pPr>
-      <w:r>
-        <w:rPr>
-          <w:rFonts w:ascii="Times New Roman" w:eastAsia="Times New Roman" w:hAnsi="Times New Roman" w:cs="Times New Roman"/>
-          <w:color w:val="000000" w:themeColor="text1"/>
-          <w:kern w:val="0"/>
-          <w:sz w:val="20"/>
-          <w:szCs w:val="20"/>
-          <w:lang w:eastAsia="en-GB"/>
-          <w14:ligatures w14:val="none"/>
-        </w:rPr>
-        <w:lastRenderedPageBreak/>
-        <w:t>NF-1.1: The system shall process the data from sensors &lt; 3 seconds and send commands to the climate units.</w:t>
-      </w:r>
-    </w:p>
-    <w:p>
-      <w:pPr>
-        <w:shd w:val="clear" w:color="auto" w:fill="FFFFFF"/>
-        <w:spacing w:before="240" w:after="0" w:line="240" w:lineRule="auto"/>
-        <w:jc w:val="both"/>
-        <w:rPr>
-          <w:rFonts w:ascii="Times New Roman" w:eastAsia="Times New Roman" w:hAnsi="Times New Roman" w:cs="Times New Roman"/>
-          <w:color w:val="000000" w:themeColor="text1"/>
-          <w:kern w:val="0"/>
-          <w:sz w:val="20"/>
-          <w:szCs w:val="20"/>
-          <w:lang w:eastAsia="en-GB"/>
-          <w14:ligatures w14:val="none"/>
-        </w:rPr>
-      </w:pPr>
-      <w:r>
-        <w:rPr>
-          <w:rFonts w:ascii="Times New Roman" w:eastAsia="Times New Roman" w:hAnsi="Times New Roman" w:cs="Times New Roman"/>
-          <w:color w:val="000000" w:themeColor="text1"/>
-          <w:kern w:val="0"/>
-          <w:sz w:val="20"/>
-          <w:szCs w:val="20"/>
-          <w:lang w:eastAsia="en-GB"/>
-          <w14:ligatures w14:val="none"/>
-        </w:rPr>
-        <w:t xml:space="preserve">NF-1.2: The situation of house shall </w:t>
+          <w:color w:val="000000" w:themeColor="text1"/>
+          <w:kern w:val="0"/>
+          <w:sz w:val="20"/>
+          <w:szCs w:val="20"/>
+          <w:lang w:eastAsia="en-GB"/>
+          <w14:ligatures w14:val="none"/>
+        </w:rPr>
+        <w:t>NF-1.</w:t>
+      </w:r>
+      <w:r>
+        <w:rPr>
+          <w:rFonts w:ascii="Times New Roman" w:eastAsia="Times New Roman" w:hAnsi="Times New Roman" w:cs="Times New Roman"/>
+          <w:color w:val="000000" w:themeColor="text1"/>
+          <w:kern w:val="0"/>
+          <w:sz w:val="20"/>
+          <w:szCs w:val="20"/>
+          <w:lang w:eastAsia="en-GB"/>
+          <w14:ligatures w14:val="none"/>
+        </w:rPr>
+        <w:t>2</w:t>
+      </w:r>
+      <w:r>
+        <w:rPr>
+          <w:rFonts w:ascii="Times New Roman" w:eastAsia="Times New Roman" w:hAnsi="Times New Roman" w:cs="Times New Roman"/>
+          <w:color w:val="000000" w:themeColor="text1"/>
+          <w:kern w:val="0"/>
+          <w:sz w:val="20"/>
+          <w:szCs w:val="20"/>
+          <w:lang w:eastAsia="en-GB"/>
+          <w14:ligatures w14:val="none"/>
+        </w:rPr>
+        <w:t>: </w:t>
+      </w:r>
+      <w:r>
+        <w:rPr>
+          <w:rFonts w:ascii="Times New Roman" w:eastAsia="Times New Roman" w:hAnsi="Times New Roman" w:cs="Times New Roman"/>
+          <w:color w:val="000000" w:themeColor="text1"/>
+          <w:kern w:val="0"/>
+          <w:sz w:val="20"/>
+          <w:szCs w:val="20"/>
+          <w:lang w:eastAsia="en-GB"/>
+          <w14:ligatures w14:val="none"/>
+        </w:rPr>
+        <w:t xml:space="preserve">The situation of house shall </w:t>
       </w:r>
       <w:proofErr w:type="gramStart"/>
       <w:r>

</xml_diff>